<commit_message>
Add peer-reviewed Hebrew self-efficacy sources to self-efficacy seminar
Incorporate two user-provided peer-reviewed Hebrew journal articles, both on
self-efficacy, cited in the intro:
- Lev, S., & Rich, Y. (1999). Teacher efficacy. Studies in Education, 4(1).
- Greenbank, A., & Agam Ben-Artzi, G. (2018). Self-efficacy of pedagogic
  assistants. Mifgash, 26(47).

Co-Authored-By: Claude Opus 4.8 <noreply@anthropic.com>
Claude-Session: https://claude.ai/code/session_01YH1N5dULXnq2hJCrBuBusq
</commit_message>
<xml_diff>
--- a/examples/seminar-psychology-self-efficacy.docx
+++ b/examples/seminar-psychology-self-efficacy.docx
@@ -435,7 +435,7 @@
           <w:szCs w:val="24"/>
           <w:rtl/>
         </w:rPr>
-        <w:t xml:space="preserve">לחוללות העצמית יש השלכות מעשיות, בייחוד בהקשר הלימודי. שאנק (Schunk, 2001), בסקירה שתורגמה לעברית, מראה כי תחושת המסוגלות משפיעה על עירור ההתנהגות, על המאמץ ועל ההתמדה, ותורמת לניבוי תוצאות של מוטיבציה לימודית. במחקר עדכני על יותר מ-2,300 תלמידים מצאו בסילאו ועמיתיה (Basileo et al., 2024) שחוללות עצמית היא המנבא החזק ביותר של הישגים לימודיים, חזק אף מהמוטיבציה עצמה. אבדולרזפור ועמיתיה (Abdolrezapour et al., 2023) הוסיפו והראו שחוללות עצמית וחוסן מנבאים יחד את המוטיבציה הלימודית בלמידה מקוונת. מכאן החשיבות של הבנת הדרכים לחזק, ולו לזמן קצר, את תחושת המסוגלות.</w:t>
+        <w:t xml:space="preserve">לחוללות העצמית יש השלכות מעשיות, בייחוד בהקשר הלימודי. שאנק (Schunk, 2001), בסקירה שתורגמה לעברית, מראה כי תחושת המסוגלות משפיעה על עירור ההתנהגות, על המאמץ ועל ההתמדה, ותורמת לניבוי תוצאות של מוטיבציה לימודית. במחקר עדכני על יותר מ-2,300 תלמידים מצאו בסילאו ועמיתיה (Basileo et al., 2024) שחוללות עצמית היא המנבא החזק ביותר של הישגים לימודיים, חזק אף מהמוטיבציה עצמה. אבדולרזפור ועמיתיה (Abdolrezapour et al., 2023) הוסיפו והראו שחוללות עצמית וחוסן מנבאים יחד את המוטיבציה הלימודית בלמידה מקוונת. גם בישראל נחקרה תחושת המסוגלות בהקשרים חינוכיים שונים. לב וריץ' (1999) עסקו במסוגלות של מורים, במדידתה ובדרכים לחזקה, וגרינבנק ואגם בן-ארצי (2018) בחנו את תחושת המסוגלות העצמית של סייעות פדגוגיות העובדות עם תלמידים בעלי צרכים מיוחדים. מכאן החשיבות של הבנת הדרכים לחזק, ולו לזמן קצר, את תחושת המסוגלות.</w:t>
       </w:r>
     </w:p>
     <w:p>
@@ -4338,6 +4338,50 @@
           <w:rtl/>
         </w:rPr>
         <w:t xml:space="preserve">רשימת מקורות</w:t>
+      </w:r>
+    </w:p>
+    <w:p>
+      <w:pPr>
+        <w:bidi/>
+        <w:spacing w:after="140" w:line="360"/>
+        <w:ind w:start="720" w:hanging="720"/>
+        <w:jc w:val="right"/>
+      </w:pPr>
+      <w:r>
+        <w:rPr>
+          <w:rFonts w:ascii="David" w:cs="David" w:eastAsia="David" w:hAnsi="David"/>
+          <w:b w:val="false"/>
+          <w:bCs w:val="false"/>
+          <w:i w:val="false"/>
+          <w:iCs w:val="false"/>
+          <w:color w:val="000000"/>
+          <w:sz w:val="24"/>
+          <w:szCs w:val="24"/>
+          <w:rtl/>
+        </w:rPr>
+        <w:t xml:space="preserve">גרינבנק, א', ואגם בן-ארצי, ג' (2018). תחושת המסוגלות העצמית של סייעות פדגוגיות העובדות עם תלמידים עם צרכים מיוחדים. מפגש לעבודה חינוכית-סוציאלית, 26(47), 53-73.</w:t>
+      </w:r>
+    </w:p>
+    <w:p>
+      <w:pPr>
+        <w:bidi/>
+        <w:spacing w:after="140" w:line="360"/>
+        <w:ind w:start="720" w:hanging="720"/>
+        <w:jc w:val="right"/>
+      </w:pPr>
+      <w:r>
+        <w:rPr>
+          <w:rFonts w:ascii="David" w:cs="David" w:eastAsia="David" w:hAnsi="David"/>
+          <w:b w:val="false"/>
+          <w:bCs w:val="false"/>
+          <w:i w:val="false"/>
+          <w:iCs w:val="false"/>
+          <w:color w:val="000000"/>
+          <w:sz w:val="24"/>
+          <w:szCs w:val="24"/>
+          <w:rtl/>
+        </w:rPr>
+        <w:t xml:space="preserve">לב, ס', וריץ', י' (1999). מסוגלות מורים: משמעותה, מדידתה ותרומתו של היועץ לחיזוקה. עיונים בחינוך, 4(1), 87-117.</w:t>
       </w:r>
     </w:p>
     <w:p>

</xml_diff>

<commit_message>
Expand self-efficacy literature review with per-paragraph citations
- Rewrite the theoretical review so each paragraph discusses one source and
  ends with an author-year citation, covering Bandura (1977, 1997), Chen et
  al. (2001), Luszczynska et al. (2005), Schunk (2001), Basileo et al. (2024),
  Abdolrezapour et al. (2023), and the Israeli sources.
- Add two more peer-reviewed Hebrew self-efficacy sources:
  Zbidat, Delasha, & Bashir (2019) and Abu-Asaad & Avitan (2020).

Co-Authored-By: Claude Opus 4.8 <noreply@anthropic.com>
Claude-Session: https://claude.ai/code/session_01YH1N5dULXnq2hJCrBuBusq
</commit_message>
<xml_diff>
--- a/examples/seminar-psychology-self-efficacy.docx
+++ b/examples/seminar-psychology-self-efficacy.docx
@@ -372,7 +372,7 @@
           <w:szCs w:val="24"/>
           <w:rtl/>
         </w:rPr>
-        <w:t xml:space="preserve">תחושת החוללות העצמית היא אחד המושגים המשפיעים בפסיכולוגיה של המוטיבציה. בנדורה (Bandura, 1977) הגדיר אותה כאמונת האדם ביכולתו לארגן ולבצע את הפעולות הנדרשות כדי להשיג תוצאה רצויה. זו אינה הערכה של הכישורים עצמם, אלא של הביטחון להשתמש בהם בפועל. אנשים בעלי חוללות עצמית גבוהה נוטים להציב מטרות מאתגרות יותר, להשקיע יותר מאמץ, ולהתמיד גם כשהם נתקלים בקשיים.</w:t>
+        <w:t xml:space="preserve">תחושת החוללות העצמית היא אחד המושגים המרכזיים בפסיכולוגיה של המוטיבציה. היא מתייחסת לאמונת האדם ביכולתו לארגן ולבצע את הפעולות הנדרשות כדי להשיג תוצאה רצויה, ולא להערכה של הכישורים עצמם. אמונה זו משפיעה על המטרות שאדם מציב לעצמו, על המאמץ שהוא משקיע ועל ההתמדה שלו נוכח קשיים, ואנשים בעלי חוללות גבוהה נוטים לפרש מכשולים כאתגר ולא כאיום (Bandura, 1977).</w:t>
       </w:r>
     </w:p>
     <w:p>
@@ -393,7 +393,7 @@
           <w:szCs w:val="24"/>
           <w:rtl/>
         </w:rPr>
-        <w:t xml:space="preserve">בנדורה (Bandura, 1997) הצביע על ארבעה מקורות שמהם נבנית תחושת החוללות. הראשון הוא חוויות שליטה, כלומר הצלחות ישירות בביצוע משימות. השני הוא חוויות עקיפות, למידה מתוך התבוננות באחרים שמצליחים, בייחוד כשהם דומים לנו. השלישי הוא שכנוע מילולי, עידוד ומשוב מהסביבה. הרביעי הוא מצבים גופניים ורגשיים והפרשנות שאנו נותנים להם. בנדורה טען שחוויות השליטה הן המקור החזק ביותר, מפני שהן העדות הישירה והמשכנעת ביותר ליכולת.</w:t>
+        <w:t xml:space="preserve">על-פי המודל, תחושת החוללות נבנית מארבעה מקורות. הראשון הוא חוויות שליטה, כלומר הצלחות ישירות בביצוע משימות. השני הוא חוויות עקיפות, למידה מתוך התבוננות באחרים דומים שמצליחים. השלישי הוא שכנוע מילולי מהסביבה, והרביעי הוא מצבים גופניים ורגשיים והפרשנות שניתנת להם. מבין הארבעה, חוויות השליטה נחשבות למקור החזק ביותר, מפני שהן מספקות את העדות הישירה והמשכנעת ביותר ליכולת (Bandura, 1997).</w:t>
       </w:r>
     </w:p>
     <w:p>
@@ -414,7 +414,7 @@
           <w:szCs w:val="24"/>
           <w:rtl/>
         </w:rPr>
-        <w:t xml:space="preserve">בעוד שבנדורה עסק בעיקר בחוללות ספציפית למשימה, התפתח בהמשך המושג של חוללות עצמית כללית, אמונה יציבה יחסית ביכולת להתמודד עם מגוון רחב של מצבים. צ'ן, גאלי ואדן (Chen, Gully, &amp; Eden, 2001) פיתחו את שאלון החוללות העצמית הכללית (NGSE), כלי קצר בעל תכונות פסיכומטריות טובות שנמצא עדיף על כלים קודמים. לושצ'ינסקה, שולץ ושוורצר (Luszczynska, Scholz, &amp; Schwarzer, 2005) הראו במחקרים חוצי-תרבות שחוללות עצמית כללית קשורה באופן עקבי לרווחה נפשית, לאופטימיות ולהתמודדות אדפטיבית.</w:t>
+        <w:t xml:space="preserve">בעוד שהמודל המקורי עסק בעיקר בחוללות ספציפית למשימה, התפתח בהמשך המושג של חוללות עצמית כללית, אמונה יציבה יחסית ביכולת להתמודד עם מגוון רחב של מצבים ואתגרים. לצורך מדידתה פותח שאלון החוללות העצמית הכללית (NGSE), כלי בן שמונה פריטים שהראה עקיבות פנימית גבוהה ותכונות פסיכומטריות טובות, ונמצא עדיף על כלים קודמים (Chen, Gully, &amp; Eden, 2001).</w:t>
       </w:r>
     </w:p>
     <w:p>
@@ -435,7 +435,7 @@
           <w:szCs w:val="24"/>
           <w:rtl/>
         </w:rPr>
-        <w:t xml:space="preserve">לחוללות העצמית יש השלכות מעשיות, בייחוד בהקשר הלימודי. שאנק (Schunk, 2001), בסקירה שתורגמה לעברית, מראה כי תחושת המסוגלות משפיעה על עירור ההתנהגות, על המאמץ ועל ההתמדה, ותורמת לניבוי תוצאות של מוטיבציה לימודית. במחקר עדכני על יותר מ-2,300 תלמידים מצאו בסילאו ועמיתיה (Basileo et al., 2024) שחוללות עצמית היא המנבא החזק ביותר של הישגים לימודיים, חזק אף מהמוטיבציה עצמה. אבדולרזפור ועמיתיה (Abdolrezapour et al., 2023) הוסיפו והראו שחוללות עצמית וחוסן מנבאים יחד את המוטיבציה הלימודית בלמידה מקוונת. גם בישראל נחקרה תחושת המסוגלות בהקשרים חינוכיים שונים. לב וריץ' (1999) עסקו במסוגלות של מורים, במדידתה ובדרכים לחזקה, וגרינבנק ואגם בן-ארצי (2018) בחנו את תחושת המסוגלות העצמית של סייעות פדגוגיות העובדות עם תלמידים בעלי צרכים מיוחדים. מכאן החשיבות של הבנת הדרכים לחזק, ולו לזמן קצר, את תחושת המסוגלות.</w:t>
+        <w:t xml:space="preserve">מחקרים חוצי-תרבות תמכו בתוקף של המושג והראו כי חוללות עצמית כללית קשורה באופן עקבי לרווחה נפשית, לאופטימיות ולהתמודדות אדפטיבית עם דחק, במגוון מדינות ושפות (Luszczynska, Scholz, &amp; Schwarzer, 2005).</w:t>
       </w:r>
     </w:p>
     <w:p>
@@ -456,7 +456,154 @@
           <w:szCs w:val="24"/>
           <w:rtl/>
         </w:rPr>
-        <w:t xml:space="preserve">המחקר הנוכחי בוחן בתנאי מעבדה מבוקרים את השפעתם של שני מקורות החוללות המרכזיים, חוויית שליטה וחשיפה עקיפה, על תחושת החוללות העצמית הכללית, בהשוואה לתנאי ביקורת נייטרלי. מחקרים ניסוייים קצרים שמשווים ישירות בין שני המקורות האלה מעטים יחסית. השאלה היא האם אינדוקציה קצרה, היזכרות בהצלחה אישית או קריאת עדות של עמית שהצליח, מספיקה כדי להעלות את תחושת החוללות, ואיזה מבין שני המקורות אפקטיבי יותר.</w:t>
+        <w:t xml:space="preserve">לחוללות העצמית תפקיד מרכזי במוטיבציה ובלמידה. סקירה מקיפה שתורגמה לעברית מתארת כיצד תחושת המסוגלות משפיעה על עירור ההתנהגות, על בחירת המשימות, על המאמץ ועל ההתמדה, וכיצד היא עצמה מתעצבת מהצבת מטרות, מעיבוד מידע וממשוב. הסקירה גם מסכמת עדויות לכך שחוללות עצמית מנבאת תוצאות מוטיבציוניות ולימודיות (שאנק, 2001).</w:t>
+      </w:r>
+    </w:p>
+    <w:p>
+      <w:pPr>
+        <w:bidi/>
+        <w:spacing w:after="160" w:before="0" w:line="360"/>
+        <w:jc w:val="both"/>
+      </w:pPr>
+      <w:r>
+        <w:rPr>
+          <w:rFonts w:ascii="David" w:cs="David" w:eastAsia="David" w:hAnsi="David"/>
+          <w:b w:val="false"/>
+          <w:bCs w:val="false"/>
+          <w:i w:val="false"/>
+          <w:iCs w:val="false"/>
+          <w:color w:val="000000"/>
+          <w:sz w:val="24"/>
+          <w:szCs w:val="24"/>
+          <w:rtl/>
+        </w:rPr>
+        <w:t xml:space="preserve">עדות עדכנית לקשר הזה עולה ממחקר רחב היקף שנערך על יותר מ-2,300 תלמידים. נמצא בו שתחושת החוללות העצמית היא המנבא החזק ביותר של הישגים לימודיים, חזק אף מהמוטיבציה עצמה, ושהיא מתווכת את הקשר בין תמיכה בצרכים הפסיכולוגיים לבין ההישגים (Basileo et al., 2024).</w:t>
+      </w:r>
+    </w:p>
+    <w:p>
+      <w:pPr>
+        <w:bidi/>
+        <w:spacing w:after="160" w:before="0" w:line="360"/>
+        <w:jc w:val="both"/>
+      </w:pPr>
+      <w:r>
+        <w:rPr>
+          <w:rFonts w:ascii="David" w:cs="David" w:eastAsia="David" w:hAnsi="David"/>
+          <w:b w:val="false"/>
+          <w:bCs w:val="false"/>
+          <w:i w:val="false"/>
+          <w:iCs w:val="false"/>
+          <w:color w:val="000000"/>
+          <w:sz w:val="24"/>
+          <w:szCs w:val="24"/>
+          <w:rtl/>
+        </w:rPr>
+        <w:t xml:space="preserve">בהקשר של למידה מקוונת, שהתרחבה מאוד בשנים האחרונות, נבחן הכוח המנבא של החוללות. נמצא שחוללות עצמית וחוסן מנבאים יחד את המוטיבציה הלימודית של סטודנטים, כך שככל שתחושת המסוגלות גבוהה יותר, כך המוטיבציה גבוהה יותר (Abdolrezapour, Jahanbakhsh Ganjeh, &amp; Ghanbari, 2023).</w:t>
+      </w:r>
+    </w:p>
+    <w:p>
+      <w:pPr>
+        <w:bidi/>
+        <w:spacing w:after="160" w:before="0" w:line="360"/>
+        <w:jc w:val="both"/>
+      </w:pPr>
+      <w:r>
+        <w:rPr>
+          <w:rFonts w:ascii="David" w:cs="David" w:eastAsia="David" w:hAnsi="David"/>
+          <w:b w:val="false"/>
+          <w:bCs w:val="false"/>
+          <w:i w:val="false"/>
+          <w:iCs w:val="false"/>
+          <w:color w:val="000000"/>
+          <w:sz w:val="24"/>
+          <w:szCs w:val="24"/>
+          <w:rtl/>
+        </w:rPr>
+        <w:t xml:space="preserve">גם בישראל נחקרה תחושת המסוגלות בהקשרים חינוכיים. עבודה שעסקה במסוגלות של מורים דנה במשמעות המושג, בדרכים למדוד אותו, ובתפקיד שיכול למלא היועץ החינוכי בחיזוק תחושת המסוגלות של המורה (לב וריץ', 1999).</w:t>
+      </w:r>
+    </w:p>
+    <w:p>
+      <w:pPr>
+        <w:bidi/>
+        <w:spacing w:after="160" w:before="0" w:line="360"/>
+        <w:jc w:val="both"/>
+      </w:pPr>
+      <w:r>
+        <w:rPr>
+          <w:rFonts w:ascii="David" w:cs="David" w:eastAsia="David" w:hAnsi="David"/>
+          <w:b w:val="false"/>
+          <w:bCs w:val="false"/>
+          <w:i w:val="false"/>
+          <w:iCs w:val="false"/>
+          <w:color w:val="000000"/>
+          <w:sz w:val="24"/>
+          <w:szCs w:val="24"/>
+          <w:rtl/>
+        </w:rPr>
+        <w:t xml:space="preserve">מחקר מאוחר יותר הרחיב את היריעה לבעלי תפקידים נוספים במערכת החינוך, ובחן את תחושת המסוגלות העצמית של סייעות פדגוגיות העובדות עם תלמידים בעלי צרכים מיוחדים, תוך עמידה על המשאבים והאתגרים המעצבים אותה (גרינבנק ואגם בן-ארצי, 2018).</w:t>
+      </w:r>
+    </w:p>
+    <w:p>
+      <w:pPr>
+        <w:bidi/>
+        <w:spacing w:after="160" w:before="0" w:line="360"/>
+        <w:jc w:val="both"/>
+      </w:pPr>
+      <w:r>
+        <w:rPr>
+          <w:rFonts w:ascii="David" w:cs="David" w:eastAsia="David" w:hAnsi="David"/>
+          <w:b w:val="false"/>
+          <w:bCs w:val="false"/>
+          <w:i w:val="false"/>
+          <w:iCs w:val="false"/>
+          <w:color w:val="000000"/>
+          <w:sz w:val="24"/>
+          <w:szCs w:val="24"/>
+          <w:rtl/>
+        </w:rPr>
+        <w:t xml:space="preserve">בזירת ההכלה נבדק הקשר בין תחושת המסוגלות העצמית של מורים לבין עמדות והתנהגויות כלפי תלמידים עם הפרעת למידה ספציפית, ונמצא שתחושת מסוגלות גבוהה נקשרת ליכולת הכלה ולאמפתיה רבה יותר כלפי תלמידים אלה (זבידאת, דלאשה ובשיר, 2019).</w:t>
+      </w:r>
+    </w:p>
+    <w:p>
+      <w:pPr>
+        <w:bidi/>
+        <w:spacing w:after="160" w:before="0" w:line="360"/>
+        <w:jc w:val="both"/>
+      </w:pPr>
+      <w:r>
+        <w:rPr>
+          <w:rFonts w:ascii="David" w:cs="David" w:eastAsia="David" w:hAnsi="David"/>
+          <w:b w:val="false"/>
+          <w:bCs w:val="false"/>
+          <w:i w:val="false"/>
+          <w:iCs w:val="false"/>
+          <w:color w:val="000000"/>
+          <w:sz w:val="24"/>
+          <w:szCs w:val="24"/>
+          <w:rtl/>
+        </w:rPr>
+        <w:t xml:space="preserve">בחברה הערבית בישראל נבחנה תחושת המסוגלות של מטפלות-מחנכות בגיל הרך ביחס לשחיקה, לנדידת מחשבות ולתפיסת הקשר עם ההורים. נמצא שקשר חיובי עם ההורים נקשר לתחושת מסוגלות עצמית גבוהה יותר, ממצא המדגיש את חשיבות הסביבה היחסית בעיצוב המסוגלות (אבו-אסעד ואביטן, 2020).</w:t>
+      </w:r>
+    </w:p>
+    <w:p>
+      <w:pPr>
+        <w:bidi/>
+        <w:spacing w:after="160" w:before="0" w:line="360"/>
+        <w:jc w:val="both"/>
+      </w:pPr>
+      <w:r>
+        <w:rPr>
+          <w:rFonts w:ascii="David" w:cs="David" w:eastAsia="David" w:hAnsi="David"/>
+          <w:b w:val="false"/>
+          <w:bCs w:val="false"/>
+          <w:i w:val="false"/>
+          <w:iCs w:val="false"/>
+          <w:color w:val="000000"/>
+          <w:sz w:val="24"/>
+          <w:szCs w:val="24"/>
+          <w:rtl/>
+        </w:rPr>
+        <w:t xml:space="preserve">אף שהתיאוריה מנוסחת היטב, מחקרים ניסוייים קצרים שמשווים ישירות בין שני מקורות החוללות המרכזיים, חוויית שליטה וחשיפה עקיפה, מעטים יחסית. המחקר הנוכחי מבקש לבחון בתנאי מעבדה מבוקרים האם אינדוקציה קצרה, היזכרות בהצלחה אישית או קריאת עדות של עמית שהצליח, מספיקה כדי להעלות את תחושת החוללות, ואיזה מבין שני המקורות אפקטיבי יותר, בהשוואה לתנאי ביקורת נייטרלי.</w:t>
       </w:r>
     </w:p>
     <w:p>
@@ -4359,7 +4506,51 @@
           <w:szCs w:val="24"/>
           <w:rtl/>
         </w:rPr>
+        <w:t xml:space="preserve">אבו-אסעד, א', ואביטן, ע' (2020). הקשר בין מסוגלות עצמית לבין נדידת מחשבות, יחסים עם הורים ושחיקה בקרב מטפלות-מחנכות בגיל הרך בחברה הערבית. מעיינות, ד.</w:t>
+      </w:r>
+    </w:p>
+    <w:p>
+      <w:pPr>
+        <w:bidi/>
+        <w:spacing w:after="140" w:line="360"/>
+        <w:ind w:start="720" w:hanging="720"/>
+        <w:jc w:val="right"/>
+      </w:pPr>
+      <w:r>
+        <w:rPr>
+          <w:rFonts w:ascii="David" w:cs="David" w:eastAsia="David" w:hAnsi="David"/>
+          <w:b w:val="false"/>
+          <w:bCs w:val="false"/>
+          <w:i w:val="false"/>
+          <w:iCs w:val="false"/>
+          <w:color w:val="000000"/>
+          <w:sz w:val="24"/>
+          <w:szCs w:val="24"/>
+          <w:rtl/>
+        </w:rPr>
         <w:t xml:space="preserve">גרינבנק, א', ואגם בן-ארצי, ג' (2018). תחושת המסוגלות העצמית של סייעות פדגוגיות העובדות עם תלמידים עם צרכים מיוחדים. מפגש לעבודה חינוכית-סוציאלית, 26(47), 53-73.</w:t>
+      </w:r>
+    </w:p>
+    <w:p>
+      <w:pPr>
+        <w:bidi/>
+        <w:spacing w:after="140" w:line="360"/>
+        <w:ind w:start="720" w:hanging="720"/>
+        <w:jc w:val="right"/>
+      </w:pPr>
+      <w:r>
+        <w:rPr>
+          <w:rFonts w:ascii="David" w:cs="David" w:eastAsia="David" w:hAnsi="David"/>
+          <w:b w:val="false"/>
+          <w:bCs w:val="false"/>
+          <w:i w:val="false"/>
+          <w:iCs w:val="false"/>
+          <w:color w:val="000000"/>
+          <w:sz w:val="24"/>
+          <w:szCs w:val="24"/>
+          <w:rtl/>
+        </w:rPr>
+        <w:t xml:space="preserve">זבידאת, א', דלאשה, ו', ובשיר, ס' (2019). הכלה, מסוגלות עצמית ואמפתיה כלפי תלמידים עם הפרעת למידה ספציפית. במעגלי חינוך: מחקר, עיון ויצירה, 8. המכללה האקדמית לחינוך ע"ש דוד ילין.</w:t>
       </w:r>
     </w:p>
     <w:p>

</xml_diff>

<commit_message>
Present NGSE as a full questionnaire form in appendix 3
Replace the plain item list with a proper Likert questionnaire grid: each of
the 8 NGSE items as a row with five response columns (1 = strongly disagree to
5 = strongly agree), matching the example's full-questionnaire appendix.

Co-Authored-By: Claude Opus 4.8 <noreply@anthropic.com>
Claude-Session: https://claude.ai/code/session_01YH1N5dULXnq2hJCrBuBusq
</commit_message>
<xml_diff>
--- a/examples/seminar-psychology-self-efficacy.docx
+++ b/examples/seminar-psychology-self-efficacy.docx
@@ -2394,27 +2394,6 @@
     <w:p>
       <w:pPr>
         <w:bidi/>
-        <w:spacing w:after="160" w:before="0" w:line="360"/>
-        <w:jc w:val="both"/>
-      </w:pPr>
-      <w:r>
-        <w:rPr>
-          <w:rFonts w:ascii="David" w:cs="David" w:eastAsia="David" w:hAnsi="David"/>
-          <w:b w:val="false"/>
-          <w:bCs w:val="false"/>
-          <w:i w:val="false"/>
-          <w:iCs w:val="false"/>
-          <w:color w:val="000000"/>
-          <w:sz w:val="24"/>
-          <w:szCs w:val="24"/>
-          <w:rtl/>
-        </w:rPr>
-        <w:t xml:space="preserve">לכל היגד סמן/י עד כמה את/ה מסכים/ה עמו, בסולם שבין 1 (מתנגד מאוד) ל-5 (מסכים מאוד).</w:t>
-      </w:r>
-    </w:p>
-    <w:p>
-      <w:pPr>
-        <w:bidi/>
         <w:spacing w:after="100" w:before="0" w:line="360"/>
         <w:jc w:val="both"/>
       </w:pPr>
@@ -2423,224 +2402,1842 @@
           <w:rFonts w:ascii="David" w:cs="David" w:eastAsia="David" w:hAnsi="David"/>
           <w:b w:val="false"/>
           <w:bCs w:val="false"/>
-          <w:i/>
-          <w:iCs/>
-          <w:color w:val="000000"/>
-          <w:sz w:val="24"/>
-          <w:szCs w:val="24"/>
-          <w:rtl/>
-        </w:rPr>
-        <w:t xml:space="preserve">סולם התשובות: 1 = מתנגד מאוד, 2 = מתנגד, 3 = לא מסכים ולא מתנגד, 4 = מסכים, 5 = מסכים מאוד.</w:t>
-      </w:r>
-    </w:p>
-    <w:p>
-      <w:pPr>
-        <w:pStyle w:val="ListParagraph"/>
-        <w:numPr>
-          <w:ilvl w:val="0"/>
-          <w:numId w:val="2"/>
-        </w:numPr>
-        <w:bidi/>
-        <w:spacing w:after="70" w:line="360"/>
-        <w:jc w:val="right"/>
-      </w:pPr>
-      <w:r>
-        <w:rPr>
-          <w:rFonts w:ascii="David" w:cs="David" w:eastAsia="David" w:hAnsi="David"/>
-          <w:b w:val="false"/>
-          <w:bCs w:val="false"/>
-          <w:i w:val="false"/>
-          <w:iCs w:val="false"/>
-          <w:color w:val="000000"/>
-          <w:sz w:val="24"/>
-          <w:szCs w:val="24"/>
-          <w:rtl/>
-        </w:rPr>
-        <w:t xml:space="preserve">אני יכול להשיג את מרבית המטרות שהצבתי לעצמי.        1   2   3   4   5</w:t>
-      </w:r>
-    </w:p>
-    <w:p>
-      <w:pPr>
-        <w:pStyle w:val="ListParagraph"/>
-        <w:numPr>
-          <w:ilvl w:val="0"/>
-          <w:numId w:val="2"/>
-        </w:numPr>
-        <w:bidi/>
-        <w:spacing w:after="70" w:line="360"/>
-        <w:jc w:val="right"/>
-      </w:pPr>
-      <w:r>
-        <w:rPr>
-          <w:rFonts w:ascii="David" w:cs="David" w:eastAsia="David" w:hAnsi="David"/>
-          <w:b w:val="false"/>
-          <w:bCs w:val="false"/>
-          <w:i w:val="false"/>
-          <w:iCs w:val="false"/>
-          <w:color w:val="000000"/>
-          <w:sz w:val="24"/>
-          <w:szCs w:val="24"/>
-          <w:rtl/>
-        </w:rPr>
-        <w:t xml:space="preserve">באופן כללי, אני חושב שאני יכול להשיג את מה שחשוב לי.        1   2   3   4   5</w:t>
-      </w:r>
-    </w:p>
-    <w:p>
-      <w:pPr>
-        <w:pStyle w:val="ListParagraph"/>
-        <w:numPr>
-          <w:ilvl w:val="0"/>
-          <w:numId w:val="2"/>
-        </w:numPr>
-        <w:bidi/>
-        <w:spacing w:after="70" w:line="360"/>
-        <w:jc w:val="right"/>
-      </w:pPr>
-      <w:r>
-        <w:rPr>
-          <w:rFonts w:ascii="David" w:cs="David" w:eastAsia="David" w:hAnsi="David"/>
-          <w:b w:val="false"/>
-          <w:bCs w:val="false"/>
-          <w:i w:val="false"/>
-          <w:iCs w:val="false"/>
-          <w:color w:val="000000"/>
-          <w:sz w:val="24"/>
-          <w:szCs w:val="24"/>
-          <w:rtl/>
-        </w:rPr>
-        <w:t xml:space="preserve">אף כאשר המצב קשה, אני יכול לבצע טוב למדי.        1   2   3   4   5</w:t>
-      </w:r>
-    </w:p>
-    <w:p>
-      <w:pPr>
-        <w:pStyle w:val="ListParagraph"/>
-        <w:numPr>
-          <w:ilvl w:val="0"/>
-          <w:numId w:val="2"/>
-        </w:numPr>
-        <w:bidi/>
-        <w:spacing w:after="70" w:line="360"/>
-        <w:jc w:val="right"/>
-      </w:pPr>
-      <w:r>
-        <w:rPr>
-          <w:rFonts w:ascii="David" w:cs="David" w:eastAsia="David" w:hAnsi="David"/>
-          <w:b w:val="false"/>
-          <w:bCs w:val="false"/>
-          <w:i w:val="false"/>
-          <w:iCs w:val="false"/>
-          <w:color w:val="000000"/>
-          <w:sz w:val="24"/>
-          <w:szCs w:val="24"/>
-          <w:rtl/>
-        </w:rPr>
-        <w:t xml:space="preserve">כאשר אני ניצב מול משימות קשות, אני בטוח שאוכל לבצען.        1   2   3   4   5</w:t>
-      </w:r>
-    </w:p>
-    <w:p>
-      <w:pPr>
-        <w:pStyle w:val="ListParagraph"/>
-        <w:numPr>
-          <w:ilvl w:val="0"/>
-          <w:numId w:val="2"/>
-        </w:numPr>
-        <w:bidi/>
-        <w:spacing w:after="70" w:line="360"/>
-        <w:jc w:val="right"/>
-      </w:pPr>
-      <w:r>
-        <w:rPr>
-          <w:rFonts w:ascii="David" w:cs="David" w:eastAsia="David" w:hAnsi="David"/>
-          <w:b w:val="false"/>
-          <w:bCs w:val="false"/>
-          <w:i w:val="false"/>
-          <w:iCs w:val="false"/>
-          <w:color w:val="000000"/>
-          <w:sz w:val="24"/>
-          <w:szCs w:val="24"/>
-          <w:rtl/>
-        </w:rPr>
-        <w:t xml:space="preserve">אני בטוח שאני יכול לבצע מטלות רבות בהצלחה.        1   2   3   4   5</w:t>
-      </w:r>
-    </w:p>
-    <w:p>
-      <w:pPr>
-        <w:pStyle w:val="ListParagraph"/>
-        <w:numPr>
-          <w:ilvl w:val="0"/>
-          <w:numId w:val="2"/>
-        </w:numPr>
-        <w:bidi/>
-        <w:spacing w:after="70" w:line="360"/>
-        <w:jc w:val="right"/>
-      </w:pPr>
-      <w:r>
-        <w:rPr>
-          <w:rFonts w:ascii="David" w:cs="David" w:eastAsia="David" w:hAnsi="David"/>
-          <w:b w:val="false"/>
-          <w:bCs w:val="false"/>
-          <w:i w:val="false"/>
-          <w:iCs w:val="false"/>
-          <w:color w:val="000000"/>
-          <w:sz w:val="24"/>
-          <w:szCs w:val="24"/>
-          <w:rtl/>
-        </w:rPr>
-        <w:t xml:space="preserve">אוכל לעמוד באתגרים רבים בהצלחה.        1   2   3   4   5</w:t>
-      </w:r>
-    </w:p>
-    <w:p>
-      <w:pPr>
-        <w:pStyle w:val="ListParagraph"/>
-        <w:numPr>
-          <w:ilvl w:val="0"/>
-          <w:numId w:val="2"/>
-        </w:numPr>
-        <w:bidi/>
-        <w:spacing w:after="70" w:line="360"/>
-        <w:jc w:val="right"/>
-      </w:pPr>
-      <w:r>
-        <w:rPr>
-          <w:rFonts w:ascii="David" w:cs="David" w:eastAsia="David" w:hAnsi="David"/>
-          <w:b w:val="false"/>
-          <w:bCs w:val="false"/>
-          <w:i w:val="false"/>
-          <w:iCs w:val="false"/>
-          <w:color w:val="000000"/>
-          <w:sz w:val="24"/>
-          <w:szCs w:val="24"/>
-          <w:rtl/>
-        </w:rPr>
-        <w:t xml:space="preserve">אני יכול להצליח בכל משימה כאשר אני נחוש בדעתי.        1   2   3   4   5</w:t>
-      </w:r>
-    </w:p>
-    <w:p>
-      <w:pPr>
-        <w:pStyle w:val="ListParagraph"/>
-        <w:numPr>
-          <w:ilvl w:val="0"/>
-          <w:numId w:val="2"/>
-        </w:numPr>
-        <w:bidi/>
-        <w:spacing w:after="70" w:line="360"/>
-        <w:jc w:val="right"/>
-      </w:pPr>
-      <w:r>
-        <w:rPr>
-          <w:rFonts w:ascii="David" w:cs="David" w:eastAsia="David" w:hAnsi="David"/>
-          <w:b w:val="false"/>
-          <w:bCs w:val="false"/>
-          <w:i w:val="false"/>
-          <w:iCs w:val="false"/>
-          <w:color w:val="000000"/>
-          <w:sz w:val="24"/>
-          <w:szCs w:val="24"/>
-          <w:rtl/>
-        </w:rPr>
-        <w:t xml:space="preserve">בהשוואה לאנשים אחרים, אני יכול לבצע את רוב המטלות היטב.        1   2   3   4   5</w:t>
-      </w:r>
-    </w:p>
+          <w:i w:val="false"/>
+          <w:iCs w:val="false"/>
+          <w:color w:val="000000"/>
+          <w:sz w:val="24"/>
+          <w:szCs w:val="24"/>
+          <w:rtl/>
+        </w:rPr>
+        <w:t xml:space="preserve">לפניך שמונה היגדים. לכל היגד סמן/י בעמודה המתאימה עד כמה את/ה מסכים/ה עמו, בסולם שבין 1 (מתנגד מאוד) ל-5 (מסכים מאוד). אין תשובות נכונות או שגויות.</w:t>
+      </w:r>
+    </w:p>
+    <w:tbl>
+      <w:tblPr>
+        <w:bidiVisual/>
+        <w:tblW w:type="dxa" w:w="9050"/>
+        <w:jc w:val="center"/>
+        <w:tblBorders>
+          <w:top w:val="single" w:color="000000" w:sz="4"/>
+          <w:left w:val="single" w:color="000000" w:sz="4"/>
+          <w:bottom w:val="single" w:color="000000" w:sz="4"/>
+          <w:right w:val="single" w:color="000000" w:sz="4"/>
+          <w:insideH w:val="single" w:color="000000" w:sz="4"/>
+          <w:insideV w:val="single" w:color="000000" w:sz="4"/>
+        </w:tblBorders>
+      </w:tblPr>
+      <w:tblGrid>
+        <w:gridCol w:w="3800"/>
+        <w:gridCol w:w="1050"/>
+        <w:gridCol w:w="1050"/>
+        <w:gridCol w:w="1050"/>
+        <w:gridCol w:w="1050"/>
+        <w:gridCol w:w="1050"/>
+      </w:tblGrid>
+      <w:tr>
+        <w:trPr>
+          <w:tblHeader/>
+        </w:trPr>
+        <w:tc>
+          <w:tcPr>
+            <w:tcW w:type="dxa" w:w="3800"/>
+            <w:tcMar>
+              <w:top w:type="dxa" w:w="40"/>
+              <w:left w:type="dxa" w:w="60"/>
+              <w:bottom w:type="dxa" w:w="40"/>
+              <w:right w:type="dxa" w:w="60"/>
+            </w:tcMar>
+            <w:vAlign w:val="center"/>
+          </w:tcPr>
+          <w:p>
+            <w:pPr>
+              <w:bidi/>
+              <w:spacing w:after="0" w:line="240"/>
+              <w:jc w:val="right"/>
+            </w:pPr>
+            <w:r>
+              <w:rPr>
+                <w:rFonts w:ascii="David" w:cs="David" w:eastAsia="David" w:hAnsi="David"/>
+                <w:b/>
+                <w:bCs/>
+                <w:i w:val="false"/>
+                <w:iCs w:val="false"/>
+                <w:color w:val="000000"/>
+                <w:sz w:val="18"/>
+                <w:szCs w:val="18"/>
+                <w:rtl/>
+              </w:rPr>
+              <w:t xml:space="preserve">היגד</w:t>
+            </w:r>
+          </w:p>
+        </w:tc>
+        <w:tc>
+          <w:tcPr>
+            <w:tcW w:type="dxa" w:w="1050"/>
+            <w:tcMar>
+              <w:top w:type="dxa" w:w="40"/>
+              <w:left w:type="dxa" w:w="60"/>
+              <w:bottom w:type="dxa" w:w="40"/>
+              <w:right w:type="dxa" w:w="60"/>
+            </w:tcMar>
+            <w:vAlign w:val="center"/>
+          </w:tcPr>
+          <w:p>
+            <w:pPr>
+              <w:bidi/>
+              <w:spacing w:after="0" w:line="240"/>
+              <w:jc w:val="center"/>
+            </w:pPr>
+            <w:r>
+              <w:rPr>
+                <w:rFonts w:ascii="David" w:cs="David" w:eastAsia="David" w:hAnsi="David"/>
+                <w:b/>
+                <w:bCs/>
+                <w:i w:val="false"/>
+                <w:iCs w:val="false"/>
+                <w:color w:val="000000"/>
+                <w:sz w:val="18"/>
+                <w:szCs w:val="18"/>
+                <w:rtl/>
+              </w:rPr>
+              <w:t xml:space="preserve">מתנגד מאוד (1)</w:t>
+            </w:r>
+          </w:p>
+        </w:tc>
+        <w:tc>
+          <w:tcPr>
+            <w:tcW w:type="dxa" w:w="1050"/>
+            <w:tcMar>
+              <w:top w:type="dxa" w:w="40"/>
+              <w:left w:type="dxa" w:w="60"/>
+              <w:bottom w:type="dxa" w:w="40"/>
+              <w:right w:type="dxa" w:w="60"/>
+            </w:tcMar>
+            <w:vAlign w:val="center"/>
+          </w:tcPr>
+          <w:p>
+            <w:pPr>
+              <w:bidi/>
+              <w:spacing w:after="0" w:line="240"/>
+              <w:jc w:val="center"/>
+            </w:pPr>
+            <w:r>
+              <w:rPr>
+                <w:rFonts w:ascii="David" w:cs="David" w:eastAsia="David" w:hAnsi="David"/>
+                <w:b/>
+                <w:bCs/>
+                <w:i w:val="false"/>
+                <w:iCs w:val="false"/>
+                <w:color w:val="000000"/>
+                <w:sz w:val="18"/>
+                <w:szCs w:val="18"/>
+                <w:rtl/>
+              </w:rPr>
+              <w:t xml:space="preserve">מתנגד (2)</w:t>
+            </w:r>
+          </w:p>
+        </w:tc>
+        <w:tc>
+          <w:tcPr>
+            <w:tcW w:type="dxa" w:w="1050"/>
+            <w:tcMar>
+              <w:top w:type="dxa" w:w="40"/>
+              <w:left w:type="dxa" w:w="60"/>
+              <w:bottom w:type="dxa" w:w="40"/>
+              <w:right w:type="dxa" w:w="60"/>
+            </w:tcMar>
+            <w:vAlign w:val="center"/>
+          </w:tcPr>
+          <w:p>
+            <w:pPr>
+              <w:bidi/>
+              <w:spacing w:after="0" w:line="240"/>
+              <w:jc w:val="center"/>
+            </w:pPr>
+            <w:r>
+              <w:rPr>
+                <w:rFonts w:ascii="David" w:cs="David" w:eastAsia="David" w:hAnsi="David"/>
+                <w:b/>
+                <w:bCs/>
+                <w:i w:val="false"/>
+                <w:iCs w:val="false"/>
+                <w:color w:val="000000"/>
+                <w:sz w:val="18"/>
+                <w:szCs w:val="18"/>
+                <w:rtl/>
+              </w:rPr>
+              <w:t xml:space="preserve">לא מסכים ולא מתנגד (3)</w:t>
+            </w:r>
+          </w:p>
+        </w:tc>
+        <w:tc>
+          <w:tcPr>
+            <w:tcW w:type="dxa" w:w="1050"/>
+            <w:tcMar>
+              <w:top w:type="dxa" w:w="40"/>
+              <w:left w:type="dxa" w:w="60"/>
+              <w:bottom w:type="dxa" w:w="40"/>
+              <w:right w:type="dxa" w:w="60"/>
+            </w:tcMar>
+            <w:vAlign w:val="center"/>
+          </w:tcPr>
+          <w:p>
+            <w:pPr>
+              <w:bidi/>
+              <w:spacing w:after="0" w:line="240"/>
+              <w:jc w:val="center"/>
+            </w:pPr>
+            <w:r>
+              <w:rPr>
+                <w:rFonts w:ascii="David" w:cs="David" w:eastAsia="David" w:hAnsi="David"/>
+                <w:b/>
+                <w:bCs/>
+                <w:i w:val="false"/>
+                <w:iCs w:val="false"/>
+                <w:color w:val="000000"/>
+                <w:sz w:val="18"/>
+                <w:szCs w:val="18"/>
+                <w:rtl/>
+              </w:rPr>
+              <w:t xml:space="preserve">מסכים (4)</w:t>
+            </w:r>
+          </w:p>
+        </w:tc>
+        <w:tc>
+          <w:tcPr>
+            <w:tcW w:type="dxa" w:w="1050"/>
+            <w:tcMar>
+              <w:top w:type="dxa" w:w="40"/>
+              <w:left w:type="dxa" w:w="60"/>
+              <w:bottom w:type="dxa" w:w="40"/>
+              <w:right w:type="dxa" w:w="60"/>
+            </w:tcMar>
+            <w:vAlign w:val="center"/>
+          </w:tcPr>
+          <w:p>
+            <w:pPr>
+              <w:bidi/>
+              <w:spacing w:after="0" w:line="240"/>
+              <w:jc w:val="center"/>
+            </w:pPr>
+            <w:r>
+              <w:rPr>
+                <w:rFonts w:ascii="David" w:cs="David" w:eastAsia="David" w:hAnsi="David"/>
+                <w:b/>
+                <w:bCs/>
+                <w:i w:val="false"/>
+                <w:iCs w:val="false"/>
+                <w:color w:val="000000"/>
+                <w:sz w:val="18"/>
+                <w:szCs w:val="18"/>
+                <w:rtl/>
+              </w:rPr>
+              <w:t xml:space="preserve">מסכים מאוד (5)</w:t>
+            </w:r>
+          </w:p>
+        </w:tc>
+      </w:tr>
+      <w:tr>
+        <w:tc>
+          <w:tcPr>
+            <w:tcW w:type="dxa" w:w="3800"/>
+            <w:tcMar>
+              <w:top w:type="dxa" w:w="40"/>
+              <w:left w:type="dxa" w:w="60"/>
+              <w:bottom w:type="dxa" w:w="40"/>
+              <w:right w:type="dxa" w:w="60"/>
+            </w:tcMar>
+            <w:vAlign w:val="center"/>
+          </w:tcPr>
+          <w:p>
+            <w:pPr>
+              <w:bidi/>
+              <w:spacing w:after="0" w:line="240"/>
+              <w:jc w:val="right"/>
+            </w:pPr>
+            <w:r>
+              <w:rPr>
+                <w:rFonts w:ascii="David" w:cs="David" w:eastAsia="David" w:hAnsi="David"/>
+                <w:b w:val="false"/>
+                <w:bCs w:val="false"/>
+                <w:i w:val="false"/>
+                <w:iCs w:val="false"/>
+                <w:color w:val="000000"/>
+                <w:sz w:val="21"/>
+                <w:szCs w:val="21"/>
+                <w:rtl/>
+              </w:rPr>
+              <w:t xml:space="preserve">1. אני יכול להשיג את מרבית המטרות שהצבתי לעצמי.</w:t>
+            </w:r>
+          </w:p>
+        </w:tc>
+        <w:tc>
+          <w:tcPr>
+            <w:tcW w:type="dxa" w:w="1050"/>
+            <w:tcMar>
+              <w:top w:type="dxa" w:w="40"/>
+              <w:left w:type="dxa" w:w="60"/>
+              <w:bottom w:type="dxa" w:w="40"/>
+              <w:right w:type="dxa" w:w="60"/>
+            </w:tcMar>
+            <w:vAlign w:val="center"/>
+          </w:tcPr>
+          <w:p>
+            <w:pPr>
+              <w:bidi/>
+              <w:spacing w:after="0" w:line="240"/>
+              <w:jc w:val="center"/>
+            </w:pPr>
+            <w:r>
+              <w:rPr>
+                <w:rFonts w:ascii="David" w:cs="David" w:eastAsia="David" w:hAnsi="David"/>
+                <w:b w:val="false"/>
+                <w:bCs w:val="false"/>
+                <w:i w:val="false"/>
+                <w:iCs w:val="false"/>
+                <w:color w:val="000000"/>
+                <w:sz w:val="20"/>
+                <w:szCs w:val="20"/>
+                <w:rtl/>
+              </w:rPr>
+              <w:t xml:space="preserve"/>
+            </w:r>
+          </w:p>
+        </w:tc>
+        <w:tc>
+          <w:tcPr>
+            <w:tcW w:type="dxa" w:w="1050"/>
+            <w:tcMar>
+              <w:top w:type="dxa" w:w="40"/>
+              <w:left w:type="dxa" w:w="60"/>
+              <w:bottom w:type="dxa" w:w="40"/>
+              <w:right w:type="dxa" w:w="60"/>
+            </w:tcMar>
+            <w:vAlign w:val="center"/>
+          </w:tcPr>
+          <w:p>
+            <w:pPr>
+              <w:bidi/>
+              <w:spacing w:after="0" w:line="240"/>
+              <w:jc w:val="center"/>
+            </w:pPr>
+            <w:r>
+              <w:rPr>
+                <w:rFonts w:ascii="David" w:cs="David" w:eastAsia="David" w:hAnsi="David"/>
+                <w:b w:val="false"/>
+                <w:bCs w:val="false"/>
+                <w:i w:val="false"/>
+                <w:iCs w:val="false"/>
+                <w:color w:val="000000"/>
+                <w:sz w:val="20"/>
+                <w:szCs w:val="20"/>
+                <w:rtl/>
+              </w:rPr>
+              <w:t xml:space="preserve"/>
+            </w:r>
+          </w:p>
+        </w:tc>
+        <w:tc>
+          <w:tcPr>
+            <w:tcW w:type="dxa" w:w="1050"/>
+            <w:tcMar>
+              <w:top w:type="dxa" w:w="40"/>
+              <w:left w:type="dxa" w:w="60"/>
+              <w:bottom w:type="dxa" w:w="40"/>
+              <w:right w:type="dxa" w:w="60"/>
+            </w:tcMar>
+            <w:vAlign w:val="center"/>
+          </w:tcPr>
+          <w:p>
+            <w:pPr>
+              <w:bidi/>
+              <w:spacing w:after="0" w:line="240"/>
+              <w:jc w:val="center"/>
+            </w:pPr>
+            <w:r>
+              <w:rPr>
+                <w:rFonts w:ascii="David" w:cs="David" w:eastAsia="David" w:hAnsi="David"/>
+                <w:b w:val="false"/>
+                <w:bCs w:val="false"/>
+                <w:i w:val="false"/>
+                <w:iCs w:val="false"/>
+                <w:color w:val="000000"/>
+                <w:sz w:val="20"/>
+                <w:szCs w:val="20"/>
+                <w:rtl/>
+              </w:rPr>
+              <w:t xml:space="preserve"/>
+            </w:r>
+          </w:p>
+        </w:tc>
+        <w:tc>
+          <w:tcPr>
+            <w:tcW w:type="dxa" w:w="1050"/>
+            <w:tcMar>
+              <w:top w:type="dxa" w:w="40"/>
+              <w:left w:type="dxa" w:w="60"/>
+              <w:bottom w:type="dxa" w:w="40"/>
+              <w:right w:type="dxa" w:w="60"/>
+            </w:tcMar>
+            <w:vAlign w:val="center"/>
+          </w:tcPr>
+          <w:p>
+            <w:pPr>
+              <w:bidi/>
+              <w:spacing w:after="0" w:line="240"/>
+              <w:jc w:val="center"/>
+            </w:pPr>
+            <w:r>
+              <w:rPr>
+                <w:rFonts w:ascii="David" w:cs="David" w:eastAsia="David" w:hAnsi="David"/>
+                <w:b w:val="false"/>
+                <w:bCs w:val="false"/>
+                <w:i w:val="false"/>
+                <w:iCs w:val="false"/>
+                <w:color w:val="000000"/>
+                <w:sz w:val="20"/>
+                <w:szCs w:val="20"/>
+                <w:rtl/>
+              </w:rPr>
+              <w:t xml:space="preserve"/>
+            </w:r>
+          </w:p>
+        </w:tc>
+        <w:tc>
+          <w:tcPr>
+            <w:tcW w:type="dxa" w:w="1050"/>
+            <w:tcMar>
+              <w:top w:type="dxa" w:w="40"/>
+              <w:left w:type="dxa" w:w="60"/>
+              <w:bottom w:type="dxa" w:w="40"/>
+              <w:right w:type="dxa" w:w="60"/>
+            </w:tcMar>
+            <w:vAlign w:val="center"/>
+          </w:tcPr>
+          <w:p>
+            <w:pPr>
+              <w:bidi/>
+              <w:spacing w:after="0" w:line="240"/>
+              <w:jc w:val="center"/>
+            </w:pPr>
+            <w:r>
+              <w:rPr>
+                <w:rFonts w:ascii="David" w:cs="David" w:eastAsia="David" w:hAnsi="David"/>
+                <w:b w:val="false"/>
+                <w:bCs w:val="false"/>
+                <w:i w:val="false"/>
+                <w:iCs w:val="false"/>
+                <w:color w:val="000000"/>
+                <w:sz w:val="20"/>
+                <w:szCs w:val="20"/>
+                <w:rtl/>
+              </w:rPr>
+              <w:t xml:space="preserve"/>
+            </w:r>
+          </w:p>
+        </w:tc>
+      </w:tr>
+      <w:tr>
+        <w:tc>
+          <w:tcPr>
+            <w:tcW w:type="dxa" w:w="3800"/>
+            <w:tcMar>
+              <w:top w:type="dxa" w:w="40"/>
+              <w:left w:type="dxa" w:w="60"/>
+              <w:bottom w:type="dxa" w:w="40"/>
+              <w:right w:type="dxa" w:w="60"/>
+            </w:tcMar>
+            <w:vAlign w:val="center"/>
+          </w:tcPr>
+          <w:p>
+            <w:pPr>
+              <w:bidi/>
+              <w:spacing w:after="0" w:line="240"/>
+              <w:jc w:val="right"/>
+            </w:pPr>
+            <w:r>
+              <w:rPr>
+                <w:rFonts w:ascii="David" w:cs="David" w:eastAsia="David" w:hAnsi="David"/>
+                <w:b w:val="false"/>
+                <w:bCs w:val="false"/>
+                <w:i w:val="false"/>
+                <w:iCs w:val="false"/>
+                <w:color w:val="000000"/>
+                <w:sz w:val="21"/>
+                <w:szCs w:val="21"/>
+                <w:rtl/>
+              </w:rPr>
+              <w:t xml:space="preserve">2. באופן כללי, אני חושב שאני יכול להשיג את מה שחשוב לי.</w:t>
+            </w:r>
+          </w:p>
+        </w:tc>
+        <w:tc>
+          <w:tcPr>
+            <w:tcW w:type="dxa" w:w="1050"/>
+            <w:tcMar>
+              <w:top w:type="dxa" w:w="40"/>
+              <w:left w:type="dxa" w:w="60"/>
+              <w:bottom w:type="dxa" w:w="40"/>
+              <w:right w:type="dxa" w:w="60"/>
+            </w:tcMar>
+            <w:vAlign w:val="center"/>
+          </w:tcPr>
+          <w:p>
+            <w:pPr>
+              <w:bidi/>
+              <w:spacing w:after="0" w:line="240"/>
+              <w:jc w:val="center"/>
+            </w:pPr>
+            <w:r>
+              <w:rPr>
+                <w:rFonts w:ascii="David" w:cs="David" w:eastAsia="David" w:hAnsi="David"/>
+                <w:b w:val="false"/>
+                <w:bCs w:val="false"/>
+                <w:i w:val="false"/>
+                <w:iCs w:val="false"/>
+                <w:color w:val="000000"/>
+                <w:sz w:val="20"/>
+                <w:szCs w:val="20"/>
+                <w:rtl/>
+              </w:rPr>
+              <w:t xml:space="preserve"/>
+            </w:r>
+          </w:p>
+        </w:tc>
+        <w:tc>
+          <w:tcPr>
+            <w:tcW w:type="dxa" w:w="1050"/>
+            <w:tcMar>
+              <w:top w:type="dxa" w:w="40"/>
+              <w:left w:type="dxa" w:w="60"/>
+              <w:bottom w:type="dxa" w:w="40"/>
+              <w:right w:type="dxa" w:w="60"/>
+            </w:tcMar>
+            <w:vAlign w:val="center"/>
+          </w:tcPr>
+          <w:p>
+            <w:pPr>
+              <w:bidi/>
+              <w:spacing w:after="0" w:line="240"/>
+              <w:jc w:val="center"/>
+            </w:pPr>
+            <w:r>
+              <w:rPr>
+                <w:rFonts w:ascii="David" w:cs="David" w:eastAsia="David" w:hAnsi="David"/>
+                <w:b w:val="false"/>
+                <w:bCs w:val="false"/>
+                <w:i w:val="false"/>
+                <w:iCs w:val="false"/>
+                <w:color w:val="000000"/>
+                <w:sz w:val="20"/>
+                <w:szCs w:val="20"/>
+                <w:rtl/>
+              </w:rPr>
+              <w:t xml:space="preserve"/>
+            </w:r>
+          </w:p>
+        </w:tc>
+        <w:tc>
+          <w:tcPr>
+            <w:tcW w:type="dxa" w:w="1050"/>
+            <w:tcMar>
+              <w:top w:type="dxa" w:w="40"/>
+              <w:left w:type="dxa" w:w="60"/>
+              <w:bottom w:type="dxa" w:w="40"/>
+              <w:right w:type="dxa" w:w="60"/>
+            </w:tcMar>
+            <w:vAlign w:val="center"/>
+          </w:tcPr>
+          <w:p>
+            <w:pPr>
+              <w:bidi/>
+              <w:spacing w:after="0" w:line="240"/>
+              <w:jc w:val="center"/>
+            </w:pPr>
+            <w:r>
+              <w:rPr>
+                <w:rFonts w:ascii="David" w:cs="David" w:eastAsia="David" w:hAnsi="David"/>
+                <w:b w:val="false"/>
+                <w:bCs w:val="false"/>
+                <w:i w:val="false"/>
+                <w:iCs w:val="false"/>
+                <w:color w:val="000000"/>
+                <w:sz w:val="20"/>
+                <w:szCs w:val="20"/>
+                <w:rtl/>
+              </w:rPr>
+              <w:t xml:space="preserve"/>
+            </w:r>
+          </w:p>
+        </w:tc>
+        <w:tc>
+          <w:tcPr>
+            <w:tcW w:type="dxa" w:w="1050"/>
+            <w:tcMar>
+              <w:top w:type="dxa" w:w="40"/>
+              <w:left w:type="dxa" w:w="60"/>
+              <w:bottom w:type="dxa" w:w="40"/>
+              <w:right w:type="dxa" w:w="60"/>
+            </w:tcMar>
+            <w:vAlign w:val="center"/>
+          </w:tcPr>
+          <w:p>
+            <w:pPr>
+              <w:bidi/>
+              <w:spacing w:after="0" w:line="240"/>
+              <w:jc w:val="center"/>
+            </w:pPr>
+            <w:r>
+              <w:rPr>
+                <w:rFonts w:ascii="David" w:cs="David" w:eastAsia="David" w:hAnsi="David"/>
+                <w:b w:val="false"/>
+                <w:bCs w:val="false"/>
+                <w:i w:val="false"/>
+                <w:iCs w:val="false"/>
+                <w:color w:val="000000"/>
+                <w:sz w:val="20"/>
+                <w:szCs w:val="20"/>
+                <w:rtl/>
+              </w:rPr>
+              <w:t xml:space="preserve"/>
+            </w:r>
+          </w:p>
+        </w:tc>
+        <w:tc>
+          <w:tcPr>
+            <w:tcW w:type="dxa" w:w="1050"/>
+            <w:tcMar>
+              <w:top w:type="dxa" w:w="40"/>
+              <w:left w:type="dxa" w:w="60"/>
+              <w:bottom w:type="dxa" w:w="40"/>
+              <w:right w:type="dxa" w:w="60"/>
+            </w:tcMar>
+            <w:vAlign w:val="center"/>
+          </w:tcPr>
+          <w:p>
+            <w:pPr>
+              <w:bidi/>
+              <w:spacing w:after="0" w:line="240"/>
+              <w:jc w:val="center"/>
+            </w:pPr>
+            <w:r>
+              <w:rPr>
+                <w:rFonts w:ascii="David" w:cs="David" w:eastAsia="David" w:hAnsi="David"/>
+                <w:b w:val="false"/>
+                <w:bCs w:val="false"/>
+                <w:i w:val="false"/>
+                <w:iCs w:val="false"/>
+                <w:color w:val="000000"/>
+                <w:sz w:val="20"/>
+                <w:szCs w:val="20"/>
+                <w:rtl/>
+              </w:rPr>
+              <w:t xml:space="preserve"/>
+            </w:r>
+          </w:p>
+        </w:tc>
+      </w:tr>
+      <w:tr>
+        <w:tc>
+          <w:tcPr>
+            <w:tcW w:type="dxa" w:w="3800"/>
+            <w:tcMar>
+              <w:top w:type="dxa" w:w="40"/>
+              <w:left w:type="dxa" w:w="60"/>
+              <w:bottom w:type="dxa" w:w="40"/>
+              <w:right w:type="dxa" w:w="60"/>
+            </w:tcMar>
+            <w:vAlign w:val="center"/>
+          </w:tcPr>
+          <w:p>
+            <w:pPr>
+              <w:bidi/>
+              <w:spacing w:after="0" w:line="240"/>
+              <w:jc w:val="right"/>
+            </w:pPr>
+            <w:r>
+              <w:rPr>
+                <w:rFonts w:ascii="David" w:cs="David" w:eastAsia="David" w:hAnsi="David"/>
+                <w:b w:val="false"/>
+                <w:bCs w:val="false"/>
+                <w:i w:val="false"/>
+                <w:iCs w:val="false"/>
+                <w:color w:val="000000"/>
+                <w:sz w:val="21"/>
+                <w:szCs w:val="21"/>
+                <w:rtl/>
+              </w:rPr>
+              <w:t xml:space="preserve">3. אף כאשר המצב קשה, אני יכול לבצע טוב למדי.</w:t>
+            </w:r>
+          </w:p>
+        </w:tc>
+        <w:tc>
+          <w:tcPr>
+            <w:tcW w:type="dxa" w:w="1050"/>
+            <w:tcMar>
+              <w:top w:type="dxa" w:w="40"/>
+              <w:left w:type="dxa" w:w="60"/>
+              <w:bottom w:type="dxa" w:w="40"/>
+              <w:right w:type="dxa" w:w="60"/>
+            </w:tcMar>
+            <w:vAlign w:val="center"/>
+          </w:tcPr>
+          <w:p>
+            <w:pPr>
+              <w:bidi/>
+              <w:spacing w:after="0" w:line="240"/>
+              <w:jc w:val="center"/>
+            </w:pPr>
+            <w:r>
+              <w:rPr>
+                <w:rFonts w:ascii="David" w:cs="David" w:eastAsia="David" w:hAnsi="David"/>
+                <w:b w:val="false"/>
+                <w:bCs w:val="false"/>
+                <w:i w:val="false"/>
+                <w:iCs w:val="false"/>
+                <w:color w:val="000000"/>
+                <w:sz w:val="20"/>
+                <w:szCs w:val="20"/>
+                <w:rtl/>
+              </w:rPr>
+              <w:t xml:space="preserve"/>
+            </w:r>
+          </w:p>
+        </w:tc>
+        <w:tc>
+          <w:tcPr>
+            <w:tcW w:type="dxa" w:w="1050"/>
+            <w:tcMar>
+              <w:top w:type="dxa" w:w="40"/>
+              <w:left w:type="dxa" w:w="60"/>
+              <w:bottom w:type="dxa" w:w="40"/>
+              <w:right w:type="dxa" w:w="60"/>
+            </w:tcMar>
+            <w:vAlign w:val="center"/>
+          </w:tcPr>
+          <w:p>
+            <w:pPr>
+              <w:bidi/>
+              <w:spacing w:after="0" w:line="240"/>
+              <w:jc w:val="center"/>
+            </w:pPr>
+            <w:r>
+              <w:rPr>
+                <w:rFonts w:ascii="David" w:cs="David" w:eastAsia="David" w:hAnsi="David"/>
+                <w:b w:val="false"/>
+                <w:bCs w:val="false"/>
+                <w:i w:val="false"/>
+                <w:iCs w:val="false"/>
+                <w:color w:val="000000"/>
+                <w:sz w:val="20"/>
+                <w:szCs w:val="20"/>
+                <w:rtl/>
+              </w:rPr>
+              <w:t xml:space="preserve"/>
+            </w:r>
+          </w:p>
+        </w:tc>
+        <w:tc>
+          <w:tcPr>
+            <w:tcW w:type="dxa" w:w="1050"/>
+            <w:tcMar>
+              <w:top w:type="dxa" w:w="40"/>
+              <w:left w:type="dxa" w:w="60"/>
+              <w:bottom w:type="dxa" w:w="40"/>
+              <w:right w:type="dxa" w:w="60"/>
+            </w:tcMar>
+            <w:vAlign w:val="center"/>
+          </w:tcPr>
+          <w:p>
+            <w:pPr>
+              <w:bidi/>
+              <w:spacing w:after="0" w:line="240"/>
+              <w:jc w:val="center"/>
+            </w:pPr>
+            <w:r>
+              <w:rPr>
+                <w:rFonts w:ascii="David" w:cs="David" w:eastAsia="David" w:hAnsi="David"/>
+                <w:b w:val="false"/>
+                <w:bCs w:val="false"/>
+                <w:i w:val="false"/>
+                <w:iCs w:val="false"/>
+                <w:color w:val="000000"/>
+                <w:sz w:val="20"/>
+                <w:szCs w:val="20"/>
+                <w:rtl/>
+              </w:rPr>
+              <w:t xml:space="preserve"/>
+            </w:r>
+          </w:p>
+        </w:tc>
+        <w:tc>
+          <w:tcPr>
+            <w:tcW w:type="dxa" w:w="1050"/>
+            <w:tcMar>
+              <w:top w:type="dxa" w:w="40"/>
+              <w:left w:type="dxa" w:w="60"/>
+              <w:bottom w:type="dxa" w:w="40"/>
+              <w:right w:type="dxa" w:w="60"/>
+            </w:tcMar>
+            <w:vAlign w:val="center"/>
+          </w:tcPr>
+          <w:p>
+            <w:pPr>
+              <w:bidi/>
+              <w:spacing w:after="0" w:line="240"/>
+              <w:jc w:val="center"/>
+            </w:pPr>
+            <w:r>
+              <w:rPr>
+                <w:rFonts w:ascii="David" w:cs="David" w:eastAsia="David" w:hAnsi="David"/>
+                <w:b w:val="false"/>
+                <w:bCs w:val="false"/>
+                <w:i w:val="false"/>
+                <w:iCs w:val="false"/>
+                <w:color w:val="000000"/>
+                <w:sz w:val="20"/>
+                <w:szCs w:val="20"/>
+                <w:rtl/>
+              </w:rPr>
+              <w:t xml:space="preserve"/>
+            </w:r>
+          </w:p>
+        </w:tc>
+        <w:tc>
+          <w:tcPr>
+            <w:tcW w:type="dxa" w:w="1050"/>
+            <w:tcMar>
+              <w:top w:type="dxa" w:w="40"/>
+              <w:left w:type="dxa" w:w="60"/>
+              <w:bottom w:type="dxa" w:w="40"/>
+              <w:right w:type="dxa" w:w="60"/>
+            </w:tcMar>
+            <w:vAlign w:val="center"/>
+          </w:tcPr>
+          <w:p>
+            <w:pPr>
+              <w:bidi/>
+              <w:spacing w:after="0" w:line="240"/>
+              <w:jc w:val="center"/>
+            </w:pPr>
+            <w:r>
+              <w:rPr>
+                <w:rFonts w:ascii="David" w:cs="David" w:eastAsia="David" w:hAnsi="David"/>
+                <w:b w:val="false"/>
+                <w:bCs w:val="false"/>
+                <w:i w:val="false"/>
+                <w:iCs w:val="false"/>
+                <w:color w:val="000000"/>
+                <w:sz w:val="20"/>
+                <w:szCs w:val="20"/>
+                <w:rtl/>
+              </w:rPr>
+              <w:t xml:space="preserve"/>
+            </w:r>
+          </w:p>
+        </w:tc>
+      </w:tr>
+      <w:tr>
+        <w:tc>
+          <w:tcPr>
+            <w:tcW w:type="dxa" w:w="3800"/>
+            <w:tcMar>
+              <w:top w:type="dxa" w:w="40"/>
+              <w:left w:type="dxa" w:w="60"/>
+              <w:bottom w:type="dxa" w:w="40"/>
+              <w:right w:type="dxa" w:w="60"/>
+            </w:tcMar>
+            <w:vAlign w:val="center"/>
+          </w:tcPr>
+          <w:p>
+            <w:pPr>
+              <w:bidi/>
+              <w:spacing w:after="0" w:line="240"/>
+              <w:jc w:val="right"/>
+            </w:pPr>
+            <w:r>
+              <w:rPr>
+                <w:rFonts w:ascii="David" w:cs="David" w:eastAsia="David" w:hAnsi="David"/>
+                <w:b w:val="false"/>
+                <w:bCs w:val="false"/>
+                <w:i w:val="false"/>
+                <w:iCs w:val="false"/>
+                <w:color w:val="000000"/>
+                <w:sz w:val="21"/>
+                <w:szCs w:val="21"/>
+                <w:rtl/>
+              </w:rPr>
+              <w:t xml:space="preserve">4. כאשר אני ניצב מול משימות קשות, אני בטוח שאוכל לבצען.</w:t>
+            </w:r>
+          </w:p>
+        </w:tc>
+        <w:tc>
+          <w:tcPr>
+            <w:tcW w:type="dxa" w:w="1050"/>
+            <w:tcMar>
+              <w:top w:type="dxa" w:w="40"/>
+              <w:left w:type="dxa" w:w="60"/>
+              <w:bottom w:type="dxa" w:w="40"/>
+              <w:right w:type="dxa" w:w="60"/>
+            </w:tcMar>
+            <w:vAlign w:val="center"/>
+          </w:tcPr>
+          <w:p>
+            <w:pPr>
+              <w:bidi/>
+              <w:spacing w:after="0" w:line="240"/>
+              <w:jc w:val="center"/>
+            </w:pPr>
+            <w:r>
+              <w:rPr>
+                <w:rFonts w:ascii="David" w:cs="David" w:eastAsia="David" w:hAnsi="David"/>
+                <w:b w:val="false"/>
+                <w:bCs w:val="false"/>
+                <w:i w:val="false"/>
+                <w:iCs w:val="false"/>
+                <w:color w:val="000000"/>
+                <w:sz w:val="20"/>
+                <w:szCs w:val="20"/>
+                <w:rtl/>
+              </w:rPr>
+              <w:t xml:space="preserve"/>
+            </w:r>
+          </w:p>
+        </w:tc>
+        <w:tc>
+          <w:tcPr>
+            <w:tcW w:type="dxa" w:w="1050"/>
+            <w:tcMar>
+              <w:top w:type="dxa" w:w="40"/>
+              <w:left w:type="dxa" w:w="60"/>
+              <w:bottom w:type="dxa" w:w="40"/>
+              <w:right w:type="dxa" w:w="60"/>
+            </w:tcMar>
+            <w:vAlign w:val="center"/>
+          </w:tcPr>
+          <w:p>
+            <w:pPr>
+              <w:bidi/>
+              <w:spacing w:after="0" w:line="240"/>
+              <w:jc w:val="center"/>
+            </w:pPr>
+            <w:r>
+              <w:rPr>
+                <w:rFonts w:ascii="David" w:cs="David" w:eastAsia="David" w:hAnsi="David"/>
+                <w:b w:val="false"/>
+                <w:bCs w:val="false"/>
+                <w:i w:val="false"/>
+                <w:iCs w:val="false"/>
+                <w:color w:val="000000"/>
+                <w:sz w:val="20"/>
+                <w:szCs w:val="20"/>
+                <w:rtl/>
+              </w:rPr>
+              <w:t xml:space="preserve"/>
+            </w:r>
+          </w:p>
+        </w:tc>
+        <w:tc>
+          <w:tcPr>
+            <w:tcW w:type="dxa" w:w="1050"/>
+            <w:tcMar>
+              <w:top w:type="dxa" w:w="40"/>
+              <w:left w:type="dxa" w:w="60"/>
+              <w:bottom w:type="dxa" w:w="40"/>
+              <w:right w:type="dxa" w:w="60"/>
+            </w:tcMar>
+            <w:vAlign w:val="center"/>
+          </w:tcPr>
+          <w:p>
+            <w:pPr>
+              <w:bidi/>
+              <w:spacing w:after="0" w:line="240"/>
+              <w:jc w:val="center"/>
+            </w:pPr>
+            <w:r>
+              <w:rPr>
+                <w:rFonts w:ascii="David" w:cs="David" w:eastAsia="David" w:hAnsi="David"/>
+                <w:b w:val="false"/>
+                <w:bCs w:val="false"/>
+                <w:i w:val="false"/>
+                <w:iCs w:val="false"/>
+                <w:color w:val="000000"/>
+                <w:sz w:val="20"/>
+                <w:szCs w:val="20"/>
+                <w:rtl/>
+              </w:rPr>
+              <w:t xml:space="preserve"/>
+            </w:r>
+          </w:p>
+        </w:tc>
+        <w:tc>
+          <w:tcPr>
+            <w:tcW w:type="dxa" w:w="1050"/>
+            <w:tcMar>
+              <w:top w:type="dxa" w:w="40"/>
+              <w:left w:type="dxa" w:w="60"/>
+              <w:bottom w:type="dxa" w:w="40"/>
+              <w:right w:type="dxa" w:w="60"/>
+            </w:tcMar>
+            <w:vAlign w:val="center"/>
+          </w:tcPr>
+          <w:p>
+            <w:pPr>
+              <w:bidi/>
+              <w:spacing w:after="0" w:line="240"/>
+              <w:jc w:val="center"/>
+            </w:pPr>
+            <w:r>
+              <w:rPr>
+                <w:rFonts w:ascii="David" w:cs="David" w:eastAsia="David" w:hAnsi="David"/>
+                <w:b w:val="false"/>
+                <w:bCs w:val="false"/>
+                <w:i w:val="false"/>
+                <w:iCs w:val="false"/>
+                <w:color w:val="000000"/>
+                <w:sz w:val="20"/>
+                <w:szCs w:val="20"/>
+                <w:rtl/>
+              </w:rPr>
+              <w:t xml:space="preserve"/>
+            </w:r>
+          </w:p>
+        </w:tc>
+        <w:tc>
+          <w:tcPr>
+            <w:tcW w:type="dxa" w:w="1050"/>
+            <w:tcMar>
+              <w:top w:type="dxa" w:w="40"/>
+              <w:left w:type="dxa" w:w="60"/>
+              <w:bottom w:type="dxa" w:w="40"/>
+              <w:right w:type="dxa" w:w="60"/>
+            </w:tcMar>
+            <w:vAlign w:val="center"/>
+          </w:tcPr>
+          <w:p>
+            <w:pPr>
+              <w:bidi/>
+              <w:spacing w:after="0" w:line="240"/>
+              <w:jc w:val="center"/>
+            </w:pPr>
+            <w:r>
+              <w:rPr>
+                <w:rFonts w:ascii="David" w:cs="David" w:eastAsia="David" w:hAnsi="David"/>
+                <w:b w:val="false"/>
+                <w:bCs w:val="false"/>
+                <w:i w:val="false"/>
+                <w:iCs w:val="false"/>
+                <w:color w:val="000000"/>
+                <w:sz w:val="20"/>
+                <w:szCs w:val="20"/>
+                <w:rtl/>
+              </w:rPr>
+              <w:t xml:space="preserve"/>
+            </w:r>
+          </w:p>
+        </w:tc>
+      </w:tr>
+      <w:tr>
+        <w:tc>
+          <w:tcPr>
+            <w:tcW w:type="dxa" w:w="3800"/>
+            <w:tcMar>
+              <w:top w:type="dxa" w:w="40"/>
+              <w:left w:type="dxa" w:w="60"/>
+              <w:bottom w:type="dxa" w:w="40"/>
+              <w:right w:type="dxa" w:w="60"/>
+            </w:tcMar>
+            <w:vAlign w:val="center"/>
+          </w:tcPr>
+          <w:p>
+            <w:pPr>
+              <w:bidi/>
+              <w:spacing w:after="0" w:line="240"/>
+              <w:jc w:val="right"/>
+            </w:pPr>
+            <w:r>
+              <w:rPr>
+                <w:rFonts w:ascii="David" w:cs="David" w:eastAsia="David" w:hAnsi="David"/>
+                <w:b w:val="false"/>
+                <w:bCs w:val="false"/>
+                <w:i w:val="false"/>
+                <w:iCs w:val="false"/>
+                <w:color w:val="000000"/>
+                <w:sz w:val="21"/>
+                <w:szCs w:val="21"/>
+                <w:rtl/>
+              </w:rPr>
+              <w:t xml:space="preserve">5. אני בטוח שאני יכול לבצע מטלות רבות בהצלחה.</w:t>
+            </w:r>
+          </w:p>
+        </w:tc>
+        <w:tc>
+          <w:tcPr>
+            <w:tcW w:type="dxa" w:w="1050"/>
+            <w:tcMar>
+              <w:top w:type="dxa" w:w="40"/>
+              <w:left w:type="dxa" w:w="60"/>
+              <w:bottom w:type="dxa" w:w="40"/>
+              <w:right w:type="dxa" w:w="60"/>
+            </w:tcMar>
+            <w:vAlign w:val="center"/>
+          </w:tcPr>
+          <w:p>
+            <w:pPr>
+              <w:bidi/>
+              <w:spacing w:after="0" w:line="240"/>
+              <w:jc w:val="center"/>
+            </w:pPr>
+            <w:r>
+              <w:rPr>
+                <w:rFonts w:ascii="David" w:cs="David" w:eastAsia="David" w:hAnsi="David"/>
+                <w:b w:val="false"/>
+                <w:bCs w:val="false"/>
+                <w:i w:val="false"/>
+                <w:iCs w:val="false"/>
+                <w:color w:val="000000"/>
+                <w:sz w:val="20"/>
+                <w:szCs w:val="20"/>
+                <w:rtl/>
+              </w:rPr>
+              <w:t xml:space="preserve"/>
+            </w:r>
+          </w:p>
+        </w:tc>
+        <w:tc>
+          <w:tcPr>
+            <w:tcW w:type="dxa" w:w="1050"/>
+            <w:tcMar>
+              <w:top w:type="dxa" w:w="40"/>
+              <w:left w:type="dxa" w:w="60"/>
+              <w:bottom w:type="dxa" w:w="40"/>
+              <w:right w:type="dxa" w:w="60"/>
+            </w:tcMar>
+            <w:vAlign w:val="center"/>
+          </w:tcPr>
+          <w:p>
+            <w:pPr>
+              <w:bidi/>
+              <w:spacing w:after="0" w:line="240"/>
+              <w:jc w:val="center"/>
+            </w:pPr>
+            <w:r>
+              <w:rPr>
+                <w:rFonts w:ascii="David" w:cs="David" w:eastAsia="David" w:hAnsi="David"/>
+                <w:b w:val="false"/>
+                <w:bCs w:val="false"/>
+                <w:i w:val="false"/>
+                <w:iCs w:val="false"/>
+                <w:color w:val="000000"/>
+                <w:sz w:val="20"/>
+                <w:szCs w:val="20"/>
+                <w:rtl/>
+              </w:rPr>
+              <w:t xml:space="preserve"/>
+            </w:r>
+          </w:p>
+        </w:tc>
+        <w:tc>
+          <w:tcPr>
+            <w:tcW w:type="dxa" w:w="1050"/>
+            <w:tcMar>
+              <w:top w:type="dxa" w:w="40"/>
+              <w:left w:type="dxa" w:w="60"/>
+              <w:bottom w:type="dxa" w:w="40"/>
+              <w:right w:type="dxa" w:w="60"/>
+            </w:tcMar>
+            <w:vAlign w:val="center"/>
+          </w:tcPr>
+          <w:p>
+            <w:pPr>
+              <w:bidi/>
+              <w:spacing w:after="0" w:line="240"/>
+              <w:jc w:val="center"/>
+            </w:pPr>
+            <w:r>
+              <w:rPr>
+                <w:rFonts w:ascii="David" w:cs="David" w:eastAsia="David" w:hAnsi="David"/>
+                <w:b w:val="false"/>
+                <w:bCs w:val="false"/>
+                <w:i w:val="false"/>
+                <w:iCs w:val="false"/>
+                <w:color w:val="000000"/>
+                <w:sz w:val="20"/>
+                <w:szCs w:val="20"/>
+                <w:rtl/>
+              </w:rPr>
+              <w:t xml:space="preserve"/>
+            </w:r>
+          </w:p>
+        </w:tc>
+        <w:tc>
+          <w:tcPr>
+            <w:tcW w:type="dxa" w:w="1050"/>
+            <w:tcMar>
+              <w:top w:type="dxa" w:w="40"/>
+              <w:left w:type="dxa" w:w="60"/>
+              <w:bottom w:type="dxa" w:w="40"/>
+              <w:right w:type="dxa" w:w="60"/>
+            </w:tcMar>
+            <w:vAlign w:val="center"/>
+          </w:tcPr>
+          <w:p>
+            <w:pPr>
+              <w:bidi/>
+              <w:spacing w:after="0" w:line="240"/>
+              <w:jc w:val="center"/>
+            </w:pPr>
+            <w:r>
+              <w:rPr>
+                <w:rFonts w:ascii="David" w:cs="David" w:eastAsia="David" w:hAnsi="David"/>
+                <w:b w:val="false"/>
+                <w:bCs w:val="false"/>
+                <w:i w:val="false"/>
+                <w:iCs w:val="false"/>
+                <w:color w:val="000000"/>
+                <w:sz w:val="20"/>
+                <w:szCs w:val="20"/>
+                <w:rtl/>
+              </w:rPr>
+              <w:t xml:space="preserve"/>
+            </w:r>
+          </w:p>
+        </w:tc>
+        <w:tc>
+          <w:tcPr>
+            <w:tcW w:type="dxa" w:w="1050"/>
+            <w:tcMar>
+              <w:top w:type="dxa" w:w="40"/>
+              <w:left w:type="dxa" w:w="60"/>
+              <w:bottom w:type="dxa" w:w="40"/>
+              <w:right w:type="dxa" w:w="60"/>
+            </w:tcMar>
+            <w:vAlign w:val="center"/>
+          </w:tcPr>
+          <w:p>
+            <w:pPr>
+              <w:bidi/>
+              <w:spacing w:after="0" w:line="240"/>
+              <w:jc w:val="center"/>
+            </w:pPr>
+            <w:r>
+              <w:rPr>
+                <w:rFonts w:ascii="David" w:cs="David" w:eastAsia="David" w:hAnsi="David"/>
+                <w:b w:val="false"/>
+                <w:bCs w:val="false"/>
+                <w:i w:val="false"/>
+                <w:iCs w:val="false"/>
+                <w:color w:val="000000"/>
+                <w:sz w:val="20"/>
+                <w:szCs w:val="20"/>
+                <w:rtl/>
+              </w:rPr>
+              <w:t xml:space="preserve"/>
+            </w:r>
+          </w:p>
+        </w:tc>
+      </w:tr>
+      <w:tr>
+        <w:tc>
+          <w:tcPr>
+            <w:tcW w:type="dxa" w:w="3800"/>
+            <w:tcMar>
+              <w:top w:type="dxa" w:w="40"/>
+              <w:left w:type="dxa" w:w="60"/>
+              <w:bottom w:type="dxa" w:w="40"/>
+              <w:right w:type="dxa" w:w="60"/>
+            </w:tcMar>
+            <w:vAlign w:val="center"/>
+          </w:tcPr>
+          <w:p>
+            <w:pPr>
+              <w:bidi/>
+              <w:spacing w:after="0" w:line="240"/>
+              <w:jc w:val="right"/>
+            </w:pPr>
+            <w:r>
+              <w:rPr>
+                <w:rFonts w:ascii="David" w:cs="David" w:eastAsia="David" w:hAnsi="David"/>
+                <w:b w:val="false"/>
+                <w:bCs w:val="false"/>
+                <w:i w:val="false"/>
+                <w:iCs w:val="false"/>
+                <w:color w:val="000000"/>
+                <w:sz w:val="21"/>
+                <w:szCs w:val="21"/>
+                <w:rtl/>
+              </w:rPr>
+              <w:t xml:space="preserve">6. אוכל לעמוד באתגרים רבים בהצלחה.</w:t>
+            </w:r>
+          </w:p>
+        </w:tc>
+        <w:tc>
+          <w:tcPr>
+            <w:tcW w:type="dxa" w:w="1050"/>
+            <w:tcMar>
+              <w:top w:type="dxa" w:w="40"/>
+              <w:left w:type="dxa" w:w="60"/>
+              <w:bottom w:type="dxa" w:w="40"/>
+              <w:right w:type="dxa" w:w="60"/>
+            </w:tcMar>
+            <w:vAlign w:val="center"/>
+          </w:tcPr>
+          <w:p>
+            <w:pPr>
+              <w:bidi/>
+              <w:spacing w:after="0" w:line="240"/>
+              <w:jc w:val="center"/>
+            </w:pPr>
+            <w:r>
+              <w:rPr>
+                <w:rFonts w:ascii="David" w:cs="David" w:eastAsia="David" w:hAnsi="David"/>
+                <w:b w:val="false"/>
+                <w:bCs w:val="false"/>
+                <w:i w:val="false"/>
+                <w:iCs w:val="false"/>
+                <w:color w:val="000000"/>
+                <w:sz w:val="20"/>
+                <w:szCs w:val="20"/>
+                <w:rtl/>
+              </w:rPr>
+              <w:t xml:space="preserve"/>
+            </w:r>
+          </w:p>
+        </w:tc>
+        <w:tc>
+          <w:tcPr>
+            <w:tcW w:type="dxa" w:w="1050"/>
+            <w:tcMar>
+              <w:top w:type="dxa" w:w="40"/>
+              <w:left w:type="dxa" w:w="60"/>
+              <w:bottom w:type="dxa" w:w="40"/>
+              <w:right w:type="dxa" w:w="60"/>
+            </w:tcMar>
+            <w:vAlign w:val="center"/>
+          </w:tcPr>
+          <w:p>
+            <w:pPr>
+              <w:bidi/>
+              <w:spacing w:after="0" w:line="240"/>
+              <w:jc w:val="center"/>
+            </w:pPr>
+            <w:r>
+              <w:rPr>
+                <w:rFonts w:ascii="David" w:cs="David" w:eastAsia="David" w:hAnsi="David"/>
+                <w:b w:val="false"/>
+                <w:bCs w:val="false"/>
+                <w:i w:val="false"/>
+                <w:iCs w:val="false"/>
+                <w:color w:val="000000"/>
+                <w:sz w:val="20"/>
+                <w:szCs w:val="20"/>
+                <w:rtl/>
+              </w:rPr>
+              <w:t xml:space="preserve"/>
+            </w:r>
+          </w:p>
+        </w:tc>
+        <w:tc>
+          <w:tcPr>
+            <w:tcW w:type="dxa" w:w="1050"/>
+            <w:tcMar>
+              <w:top w:type="dxa" w:w="40"/>
+              <w:left w:type="dxa" w:w="60"/>
+              <w:bottom w:type="dxa" w:w="40"/>
+              <w:right w:type="dxa" w:w="60"/>
+            </w:tcMar>
+            <w:vAlign w:val="center"/>
+          </w:tcPr>
+          <w:p>
+            <w:pPr>
+              <w:bidi/>
+              <w:spacing w:after="0" w:line="240"/>
+              <w:jc w:val="center"/>
+            </w:pPr>
+            <w:r>
+              <w:rPr>
+                <w:rFonts w:ascii="David" w:cs="David" w:eastAsia="David" w:hAnsi="David"/>
+                <w:b w:val="false"/>
+                <w:bCs w:val="false"/>
+                <w:i w:val="false"/>
+                <w:iCs w:val="false"/>
+                <w:color w:val="000000"/>
+                <w:sz w:val="20"/>
+                <w:szCs w:val="20"/>
+                <w:rtl/>
+              </w:rPr>
+              <w:t xml:space="preserve"/>
+            </w:r>
+          </w:p>
+        </w:tc>
+        <w:tc>
+          <w:tcPr>
+            <w:tcW w:type="dxa" w:w="1050"/>
+            <w:tcMar>
+              <w:top w:type="dxa" w:w="40"/>
+              <w:left w:type="dxa" w:w="60"/>
+              <w:bottom w:type="dxa" w:w="40"/>
+              <w:right w:type="dxa" w:w="60"/>
+            </w:tcMar>
+            <w:vAlign w:val="center"/>
+          </w:tcPr>
+          <w:p>
+            <w:pPr>
+              <w:bidi/>
+              <w:spacing w:after="0" w:line="240"/>
+              <w:jc w:val="center"/>
+            </w:pPr>
+            <w:r>
+              <w:rPr>
+                <w:rFonts w:ascii="David" w:cs="David" w:eastAsia="David" w:hAnsi="David"/>
+                <w:b w:val="false"/>
+                <w:bCs w:val="false"/>
+                <w:i w:val="false"/>
+                <w:iCs w:val="false"/>
+                <w:color w:val="000000"/>
+                <w:sz w:val="20"/>
+                <w:szCs w:val="20"/>
+                <w:rtl/>
+              </w:rPr>
+              <w:t xml:space="preserve"/>
+            </w:r>
+          </w:p>
+        </w:tc>
+        <w:tc>
+          <w:tcPr>
+            <w:tcW w:type="dxa" w:w="1050"/>
+            <w:tcMar>
+              <w:top w:type="dxa" w:w="40"/>
+              <w:left w:type="dxa" w:w="60"/>
+              <w:bottom w:type="dxa" w:w="40"/>
+              <w:right w:type="dxa" w:w="60"/>
+            </w:tcMar>
+            <w:vAlign w:val="center"/>
+          </w:tcPr>
+          <w:p>
+            <w:pPr>
+              <w:bidi/>
+              <w:spacing w:after="0" w:line="240"/>
+              <w:jc w:val="center"/>
+            </w:pPr>
+            <w:r>
+              <w:rPr>
+                <w:rFonts w:ascii="David" w:cs="David" w:eastAsia="David" w:hAnsi="David"/>
+                <w:b w:val="false"/>
+                <w:bCs w:val="false"/>
+                <w:i w:val="false"/>
+                <w:iCs w:val="false"/>
+                <w:color w:val="000000"/>
+                <w:sz w:val="20"/>
+                <w:szCs w:val="20"/>
+                <w:rtl/>
+              </w:rPr>
+              <w:t xml:space="preserve"/>
+            </w:r>
+          </w:p>
+        </w:tc>
+      </w:tr>
+      <w:tr>
+        <w:tc>
+          <w:tcPr>
+            <w:tcW w:type="dxa" w:w="3800"/>
+            <w:tcMar>
+              <w:top w:type="dxa" w:w="40"/>
+              <w:left w:type="dxa" w:w="60"/>
+              <w:bottom w:type="dxa" w:w="40"/>
+              <w:right w:type="dxa" w:w="60"/>
+            </w:tcMar>
+            <w:vAlign w:val="center"/>
+          </w:tcPr>
+          <w:p>
+            <w:pPr>
+              <w:bidi/>
+              <w:spacing w:after="0" w:line="240"/>
+              <w:jc w:val="right"/>
+            </w:pPr>
+            <w:r>
+              <w:rPr>
+                <w:rFonts w:ascii="David" w:cs="David" w:eastAsia="David" w:hAnsi="David"/>
+                <w:b w:val="false"/>
+                <w:bCs w:val="false"/>
+                <w:i w:val="false"/>
+                <w:iCs w:val="false"/>
+                <w:color w:val="000000"/>
+                <w:sz w:val="21"/>
+                <w:szCs w:val="21"/>
+                <w:rtl/>
+              </w:rPr>
+              <w:t xml:space="preserve">7. אני יכול להצליח בכל משימה כאשר אני נחוש בדעתי.</w:t>
+            </w:r>
+          </w:p>
+        </w:tc>
+        <w:tc>
+          <w:tcPr>
+            <w:tcW w:type="dxa" w:w="1050"/>
+            <w:tcMar>
+              <w:top w:type="dxa" w:w="40"/>
+              <w:left w:type="dxa" w:w="60"/>
+              <w:bottom w:type="dxa" w:w="40"/>
+              <w:right w:type="dxa" w:w="60"/>
+            </w:tcMar>
+            <w:vAlign w:val="center"/>
+          </w:tcPr>
+          <w:p>
+            <w:pPr>
+              <w:bidi/>
+              <w:spacing w:after="0" w:line="240"/>
+              <w:jc w:val="center"/>
+            </w:pPr>
+            <w:r>
+              <w:rPr>
+                <w:rFonts w:ascii="David" w:cs="David" w:eastAsia="David" w:hAnsi="David"/>
+                <w:b w:val="false"/>
+                <w:bCs w:val="false"/>
+                <w:i w:val="false"/>
+                <w:iCs w:val="false"/>
+                <w:color w:val="000000"/>
+                <w:sz w:val="20"/>
+                <w:szCs w:val="20"/>
+                <w:rtl/>
+              </w:rPr>
+              <w:t xml:space="preserve"/>
+            </w:r>
+          </w:p>
+        </w:tc>
+        <w:tc>
+          <w:tcPr>
+            <w:tcW w:type="dxa" w:w="1050"/>
+            <w:tcMar>
+              <w:top w:type="dxa" w:w="40"/>
+              <w:left w:type="dxa" w:w="60"/>
+              <w:bottom w:type="dxa" w:w="40"/>
+              <w:right w:type="dxa" w:w="60"/>
+            </w:tcMar>
+            <w:vAlign w:val="center"/>
+          </w:tcPr>
+          <w:p>
+            <w:pPr>
+              <w:bidi/>
+              <w:spacing w:after="0" w:line="240"/>
+              <w:jc w:val="center"/>
+            </w:pPr>
+            <w:r>
+              <w:rPr>
+                <w:rFonts w:ascii="David" w:cs="David" w:eastAsia="David" w:hAnsi="David"/>
+                <w:b w:val="false"/>
+                <w:bCs w:val="false"/>
+                <w:i w:val="false"/>
+                <w:iCs w:val="false"/>
+                <w:color w:val="000000"/>
+                <w:sz w:val="20"/>
+                <w:szCs w:val="20"/>
+                <w:rtl/>
+              </w:rPr>
+              <w:t xml:space="preserve"/>
+            </w:r>
+          </w:p>
+        </w:tc>
+        <w:tc>
+          <w:tcPr>
+            <w:tcW w:type="dxa" w:w="1050"/>
+            <w:tcMar>
+              <w:top w:type="dxa" w:w="40"/>
+              <w:left w:type="dxa" w:w="60"/>
+              <w:bottom w:type="dxa" w:w="40"/>
+              <w:right w:type="dxa" w:w="60"/>
+            </w:tcMar>
+            <w:vAlign w:val="center"/>
+          </w:tcPr>
+          <w:p>
+            <w:pPr>
+              <w:bidi/>
+              <w:spacing w:after="0" w:line="240"/>
+              <w:jc w:val="center"/>
+            </w:pPr>
+            <w:r>
+              <w:rPr>
+                <w:rFonts w:ascii="David" w:cs="David" w:eastAsia="David" w:hAnsi="David"/>
+                <w:b w:val="false"/>
+                <w:bCs w:val="false"/>
+                <w:i w:val="false"/>
+                <w:iCs w:val="false"/>
+                <w:color w:val="000000"/>
+                <w:sz w:val="20"/>
+                <w:szCs w:val="20"/>
+                <w:rtl/>
+              </w:rPr>
+              <w:t xml:space="preserve"/>
+            </w:r>
+          </w:p>
+        </w:tc>
+        <w:tc>
+          <w:tcPr>
+            <w:tcW w:type="dxa" w:w="1050"/>
+            <w:tcMar>
+              <w:top w:type="dxa" w:w="40"/>
+              <w:left w:type="dxa" w:w="60"/>
+              <w:bottom w:type="dxa" w:w="40"/>
+              <w:right w:type="dxa" w:w="60"/>
+            </w:tcMar>
+            <w:vAlign w:val="center"/>
+          </w:tcPr>
+          <w:p>
+            <w:pPr>
+              <w:bidi/>
+              <w:spacing w:after="0" w:line="240"/>
+              <w:jc w:val="center"/>
+            </w:pPr>
+            <w:r>
+              <w:rPr>
+                <w:rFonts w:ascii="David" w:cs="David" w:eastAsia="David" w:hAnsi="David"/>
+                <w:b w:val="false"/>
+                <w:bCs w:val="false"/>
+                <w:i w:val="false"/>
+                <w:iCs w:val="false"/>
+                <w:color w:val="000000"/>
+                <w:sz w:val="20"/>
+                <w:szCs w:val="20"/>
+                <w:rtl/>
+              </w:rPr>
+              <w:t xml:space="preserve"/>
+            </w:r>
+          </w:p>
+        </w:tc>
+        <w:tc>
+          <w:tcPr>
+            <w:tcW w:type="dxa" w:w="1050"/>
+            <w:tcMar>
+              <w:top w:type="dxa" w:w="40"/>
+              <w:left w:type="dxa" w:w="60"/>
+              <w:bottom w:type="dxa" w:w="40"/>
+              <w:right w:type="dxa" w:w="60"/>
+            </w:tcMar>
+            <w:vAlign w:val="center"/>
+          </w:tcPr>
+          <w:p>
+            <w:pPr>
+              <w:bidi/>
+              <w:spacing w:after="0" w:line="240"/>
+              <w:jc w:val="center"/>
+            </w:pPr>
+            <w:r>
+              <w:rPr>
+                <w:rFonts w:ascii="David" w:cs="David" w:eastAsia="David" w:hAnsi="David"/>
+                <w:b w:val="false"/>
+                <w:bCs w:val="false"/>
+                <w:i w:val="false"/>
+                <w:iCs w:val="false"/>
+                <w:color w:val="000000"/>
+                <w:sz w:val="20"/>
+                <w:szCs w:val="20"/>
+                <w:rtl/>
+              </w:rPr>
+              <w:t xml:space="preserve"/>
+            </w:r>
+          </w:p>
+        </w:tc>
+      </w:tr>
+      <w:tr>
+        <w:tc>
+          <w:tcPr>
+            <w:tcW w:type="dxa" w:w="3800"/>
+            <w:tcMar>
+              <w:top w:type="dxa" w:w="40"/>
+              <w:left w:type="dxa" w:w="60"/>
+              <w:bottom w:type="dxa" w:w="40"/>
+              <w:right w:type="dxa" w:w="60"/>
+            </w:tcMar>
+            <w:vAlign w:val="center"/>
+          </w:tcPr>
+          <w:p>
+            <w:pPr>
+              <w:bidi/>
+              <w:spacing w:after="0" w:line="240"/>
+              <w:jc w:val="right"/>
+            </w:pPr>
+            <w:r>
+              <w:rPr>
+                <w:rFonts w:ascii="David" w:cs="David" w:eastAsia="David" w:hAnsi="David"/>
+                <w:b w:val="false"/>
+                <w:bCs w:val="false"/>
+                <w:i w:val="false"/>
+                <w:iCs w:val="false"/>
+                <w:color w:val="000000"/>
+                <w:sz w:val="21"/>
+                <w:szCs w:val="21"/>
+                <w:rtl/>
+              </w:rPr>
+              <w:t xml:space="preserve">8. בהשוואה לאנשים אחרים, אני יכול לבצע את רוב המטלות היטב.</w:t>
+            </w:r>
+          </w:p>
+        </w:tc>
+        <w:tc>
+          <w:tcPr>
+            <w:tcW w:type="dxa" w:w="1050"/>
+            <w:tcMar>
+              <w:top w:type="dxa" w:w="40"/>
+              <w:left w:type="dxa" w:w="60"/>
+              <w:bottom w:type="dxa" w:w="40"/>
+              <w:right w:type="dxa" w:w="60"/>
+            </w:tcMar>
+            <w:vAlign w:val="center"/>
+          </w:tcPr>
+          <w:p>
+            <w:pPr>
+              <w:bidi/>
+              <w:spacing w:after="0" w:line="240"/>
+              <w:jc w:val="center"/>
+            </w:pPr>
+            <w:r>
+              <w:rPr>
+                <w:rFonts w:ascii="David" w:cs="David" w:eastAsia="David" w:hAnsi="David"/>
+                <w:b w:val="false"/>
+                <w:bCs w:val="false"/>
+                <w:i w:val="false"/>
+                <w:iCs w:val="false"/>
+                <w:color w:val="000000"/>
+                <w:sz w:val="20"/>
+                <w:szCs w:val="20"/>
+                <w:rtl/>
+              </w:rPr>
+              <w:t xml:space="preserve"/>
+            </w:r>
+          </w:p>
+        </w:tc>
+        <w:tc>
+          <w:tcPr>
+            <w:tcW w:type="dxa" w:w="1050"/>
+            <w:tcMar>
+              <w:top w:type="dxa" w:w="40"/>
+              <w:left w:type="dxa" w:w="60"/>
+              <w:bottom w:type="dxa" w:w="40"/>
+              <w:right w:type="dxa" w:w="60"/>
+            </w:tcMar>
+            <w:vAlign w:val="center"/>
+          </w:tcPr>
+          <w:p>
+            <w:pPr>
+              <w:bidi/>
+              <w:spacing w:after="0" w:line="240"/>
+              <w:jc w:val="center"/>
+            </w:pPr>
+            <w:r>
+              <w:rPr>
+                <w:rFonts w:ascii="David" w:cs="David" w:eastAsia="David" w:hAnsi="David"/>
+                <w:b w:val="false"/>
+                <w:bCs w:val="false"/>
+                <w:i w:val="false"/>
+                <w:iCs w:val="false"/>
+                <w:color w:val="000000"/>
+                <w:sz w:val="20"/>
+                <w:szCs w:val="20"/>
+                <w:rtl/>
+              </w:rPr>
+              <w:t xml:space="preserve"/>
+            </w:r>
+          </w:p>
+        </w:tc>
+        <w:tc>
+          <w:tcPr>
+            <w:tcW w:type="dxa" w:w="1050"/>
+            <w:tcMar>
+              <w:top w:type="dxa" w:w="40"/>
+              <w:left w:type="dxa" w:w="60"/>
+              <w:bottom w:type="dxa" w:w="40"/>
+              <w:right w:type="dxa" w:w="60"/>
+            </w:tcMar>
+            <w:vAlign w:val="center"/>
+          </w:tcPr>
+          <w:p>
+            <w:pPr>
+              <w:bidi/>
+              <w:spacing w:after="0" w:line="240"/>
+              <w:jc w:val="center"/>
+            </w:pPr>
+            <w:r>
+              <w:rPr>
+                <w:rFonts w:ascii="David" w:cs="David" w:eastAsia="David" w:hAnsi="David"/>
+                <w:b w:val="false"/>
+                <w:bCs w:val="false"/>
+                <w:i w:val="false"/>
+                <w:iCs w:val="false"/>
+                <w:color w:val="000000"/>
+                <w:sz w:val="20"/>
+                <w:szCs w:val="20"/>
+                <w:rtl/>
+              </w:rPr>
+              <w:t xml:space="preserve"/>
+            </w:r>
+          </w:p>
+        </w:tc>
+        <w:tc>
+          <w:tcPr>
+            <w:tcW w:type="dxa" w:w="1050"/>
+            <w:tcMar>
+              <w:top w:type="dxa" w:w="40"/>
+              <w:left w:type="dxa" w:w="60"/>
+              <w:bottom w:type="dxa" w:w="40"/>
+              <w:right w:type="dxa" w:w="60"/>
+            </w:tcMar>
+            <w:vAlign w:val="center"/>
+          </w:tcPr>
+          <w:p>
+            <w:pPr>
+              <w:bidi/>
+              <w:spacing w:after="0" w:line="240"/>
+              <w:jc w:val="center"/>
+            </w:pPr>
+            <w:r>
+              <w:rPr>
+                <w:rFonts w:ascii="David" w:cs="David" w:eastAsia="David" w:hAnsi="David"/>
+                <w:b w:val="false"/>
+                <w:bCs w:val="false"/>
+                <w:i w:val="false"/>
+                <w:iCs w:val="false"/>
+                <w:color w:val="000000"/>
+                <w:sz w:val="20"/>
+                <w:szCs w:val="20"/>
+                <w:rtl/>
+              </w:rPr>
+              <w:t xml:space="preserve"/>
+            </w:r>
+          </w:p>
+        </w:tc>
+        <w:tc>
+          <w:tcPr>
+            <w:tcW w:type="dxa" w:w="1050"/>
+            <w:tcMar>
+              <w:top w:type="dxa" w:w="40"/>
+              <w:left w:type="dxa" w:w="60"/>
+              <w:bottom w:type="dxa" w:w="40"/>
+              <w:right w:type="dxa" w:w="60"/>
+            </w:tcMar>
+            <w:vAlign w:val="center"/>
+          </w:tcPr>
+          <w:p>
+            <w:pPr>
+              <w:bidi/>
+              <w:spacing w:after="0" w:line="240"/>
+              <w:jc w:val="center"/>
+            </w:pPr>
+            <w:r>
+              <w:rPr>
+                <w:rFonts w:ascii="David" w:cs="David" w:eastAsia="David" w:hAnsi="David"/>
+                <w:b w:val="false"/>
+                <w:bCs w:val="false"/>
+                <w:i w:val="false"/>
+                <w:iCs w:val="false"/>
+                <w:color w:val="000000"/>
+                <w:sz w:val="20"/>
+                <w:szCs w:val="20"/>
+                <w:rtl/>
+              </w:rPr>
+              <w:t xml:space="preserve"/>
+            </w:r>
+          </w:p>
+        </w:tc>
+      </w:tr>
+    </w:tbl>
     <w:sectPr>
       <w:footerReference w:type="default" r:id="rId7"/>
       <w:pgSz w:w="11906" w:h="16838" w:orient="portrait"/>

</xml_diff>

<commit_message>
Orient self-efficacy study to pre-service teachers to fit Hebrew sources
Frame the sample as education/teaching students and connect the rationale and
discussion to teacher self-efficacy, so the study topic aligns with the
Hebrew educational self-efficacy sources (Lev & Rich, Greenbank, Zbidat,
Abu-Asaad, Schunk).

Co-Authored-By: Claude Opus 4.8 <noreply@anthropic.com>
Claude-Session: https://claude.ai/code/session_01YH1N5dULXnq2hJCrBuBusq
</commit_message>
<xml_diff>
--- a/examples/seminar-psychology-self-efficacy.docx
+++ b/examples/seminar-psychology-self-efficacy.docx
@@ -248,7 +248,7 @@
           <w:szCs w:val="24"/>
           <w:rtl/>
         </w:rPr>
-        <w:t xml:space="preserve">במחקר זה ביקשנו לבדוק האם מקור החוללות שאליו נחשף אדם משפיע על תחושת החוללות העצמית הכללית שלו. הספרות מבחינה בין ארבעה מקורות לחוללות עצמית, ובהם חוויית שליטה, שהיא התנסות ישירה בהצלחה, וחוויה עקיפה, שהיא למידה מהתבוננות באחר שמצליח. בכדי לבחון זאת השתתפו במדגם 33 סטודנטים, אשר חולקו באקראי באמצעות תוכנת Qualtrics לשלוש קבוצות. קבוצת הניסוי התבקשה להיזכר בהצלחה אישית מהעבר, קבוצת ההשוואה קראה עדות של עמית שהתמודד והצליח, וקבוצת הביקורת ביצעה משימת כתיבה נייטרלית. לאחר מכן מילאו כלל המשתתפים את שאלון החוללות העצמית הכללית (NGSE). השערת המחקר, לפיה חוויית שליטה תעלה את תחושת החוללות יותר מן החשיפה העקיפה, אוששה באופן חלקי. נמצא הבדל מובהק בין הקבוצות, F(2,30)=5.18, p=.012, η²=.26, כך שקבוצת חוויית השליטה (M=4.05, SD=0.57) דיווחה על חוללות גבוהה יותר מקבוצת הביקורת (M=3.30, SD=0.55), ואילו קבוצת החשיפה העקיפה (M=3.70, SD=0.52) לא נבדלה מהביקורת באופן מובהק. נוסף על כך מוצגים ממצאים מהספרות, נדונות מגבלות המחקר ומוצעים מחקרי המשך.</w:t>
+        <w:t xml:space="preserve">במחקר זה ביקשנו לבדוק האם מקור החוללות שאליו נחשף אדם משפיע על תחושת החוללות העצמית הכללית שלו. הספרות מבחינה בין ארבעה מקורות לחוללות עצמית, ובהם חוויית שליטה, שהיא התנסות ישירה בהצלחה, וחוויה עקיפה, שהיא למידה מהתבוננות באחר שמצליח. בכדי לבחון זאת השתתפו במדגם 33 סטודנטים בהכשרה להוראה, אשר חולקו באקראי באמצעות תוכנת Qualtrics לשלוש קבוצות. קבוצת הניסוי התבקשה להיזכר בהצלחה אישית מהעבר, קבוצת ההשוואה קראה עדות של עמית שהתמודד והצליח, וקבוצת הביקורת ביצעה משימת כתיבה נייטרלית. לאחר מכן מילאו כלל המשתתפים את שאלון החוללות העצמית הכללית (NGSE). השערת המחקר, לפיה חוויית שליטה תעלה את תחושת החוללות יותר מן החשיפה העקיפה, אוששה באופן חלקי. נמצא הבדל מובהק בין הקבוצות, F(2,30)=5.18, p=.012, η²=.26, כך שקבוצת חוויית השליטה (M=4.05, SD=0.57) דיווחה על חוללות גבוהה יותר מקבוצת הביקורת (M=3.30, SD=0.55), ואילו קבוצת החשיפה העקיפה (M=3.70, SD=0.52) לא נבדלה מהביקורת באופן מובהק. נוסף על כך מוצגים ממצאים מהספרות, נדונות מגבלות המחקר ומוצעים מחקרי המשך.</w:t>
       </w:r>
     </w:p>
     <w:p>
@@ -562,7 +562,28 @@
           <w:szCs w:val="24"/>
           <w:rtl/>
         </w:rPr>
-        <w:t xml:space="preserve">אף שהתיאוריה מנוסחת היטב, מחקרים ניסוייים קצרים שמשווים ישירות בין שני מקורות החוללות המרכזיים, חוויית שליטה וחשיפה עקיפה, מעטים יחסית. המחקר הנוכחי מבקש לבחון בתנאי מעבדה מבוקרים האם אינדוקציה קצרה מספיקה כדי להעלות את תחושת החוללות, ואיזה מבין שני המקורות אפקטיבי יותר, בהשוואה לתנאי ביקורת נייטרלי. בהתאם לטענת בנדורה שחוויות שליטה הן המקור החזק ביותר, השערת המחקר הייתה שקבוצת חוויית השליטה תדווח על החוללות הגבוהה ביותר, שקבוצת החשיפה העקיפה תדווח על חוללות גבוהה מן הביקורת אך נמוכה מחוויית השליטה, ושקבוצת הביקורת תדווח על החוללות הנמוכה ביותר.</w:t>
+        <w:t xml:space="preserve">ההקשר החינוכי ממחיש היטב את חשיבות הנושא. תחושת המסוגלות של מורים ושל סטודנטים בהכשרה להוראה נמצאה קשורה למחויבות למקצוע, להכלה, לאמפתיה כלפי תלמידים ולהתמודדות עם שחיקה, ותחושת מסוגלות כללית גבוהה מהווה בסיס לתחושת המסוגלות המקצועית שתתפתח בהמשך. עם זאת, רוב המחקרים בתחום הם מתאמיים, ומעטים בחנו בתנאי ניסוי האם ניתן להעלות את תחושת המסוגלות של סטודנטים להוראה, ואיזה מקור עושה זאת ביעילות רבה יותר.</w:t>
+      </w:r>
+    </w:p>
+    <w:p>
+      <w:pPr>
+        <w:bidi/>
+        <w:spacing w:after="160" w:before="0" w:line="360"/>
+        <w:jc w:val="both"/>
+      </w:pPr>
+      <w:r>
+        <w:rPr>
+          <w:rFonts w:ascii="David" w:cs="David" w:eastAsia="David" w:hAnsi="David"/>
+          <w:b w:val="false"/>
+          <w:bCs w:val="false"/>
+          <w:i w:val="false"/>
+          <w:iCs w:val="false"/>
+          <w:color w:val="000000"/>
+          <w:sz w:val="24"/>
+          <w:szCs w:val="24"/>
+          <w:rtl/>
+        </w:rPr>
+        <w:t xml:space="preserve">לפיכך, המחקר הנוכחי מבקש לבחון בתנאי מעבדה מבוקרים האם אינדוקציה קצרה מספיקה כדי להעלות את תחושת החוללות העצמית הכללית בקרב סטודנטים בהכשרה להוראה, ואיזה מבין שני מקורות החוללות, חוויית שליטה או חשיפה עקיפה, אפקטיבי יותר, בהשוואה לתנאי ביקורת נייטרלי. בהתאם לטענת בנדורה שחוויות שליטה הן המקור החזק ביותר, השערת המחקר הייתה שקבוצת חוויית השליטה תדווח על החוללות הגבוהה ביותר, שקבוצת החשיפה העקיפה תדווח על חוללות גבוהה מן הביקורת אך נמוכה מחוויית השליטה, ושקבוצת הביקורת תדווח על החוללות הנמוכה ביותר.</w:t>
       </w:r>
     </w:p>
     <w:p>
@@ -632,7 +653,7 @@
           <w:szCs w:val="24"/>
           <w:rtl/>
         </w:rPr>
-        <w:t xml:space="preserve">במחקר השתתפו 33 סטודנטים שהתנדבו למחקר, ובהם 21 נשים ו-12 גברים. גיל המשתתפים נע בין 18 ל-31 (M=24.3, SD=2.8). מבחינת השכלה, 60.6% מהמשתתפים בעלי השכלה אקדמית, 27.3% בעלי השכלה תיכונית ו-12.1% בעלי לימודי תעודה. מבחינת אזור מגורים, 42.4% מתגוררים במרכז, 30.3% בדרום, 18.2% בצפון ו-9.1% ביהודה ושומרון. המשתתפים הוקצו מקרית לתנאי המחקר באמצעות תוכנת Qualtrics, כך שבכל אחת משלוש הקבוצות נכללו 11 משתתפים.</w:t>
+        <w:t xml:space="preserve">במחקר השתתפו 33 סטודנטים בהכשרה להוראה שהתנדבו למחקר, ובהם 21 נשים ו-12 גברים. גיל המשתתפים נע בין 18 ל-31 (M=24.3, SD=2.8). מבחינת השכלה, 60.6% מהמשתתפים בעלי השכלה אקדמית, 27.3% בעלי השכלה תיכונית ו-12.1% בעלי לימודי תעודה. מבחינת אזור מגורים, 42.4% מתגוררים במרכז, 30.3% בדרום, 18.2% בצפון ו-9.1% ביהודה ושומרון. המשתתפים הוקצו מקרית לתנאי המחקר באמצעות תוכנת Qualtrics, כך שבכל אחת משלוש הקבוצות נכללו 11 משתתפים.</w:t>
       </w:r>
     </w:p>
     <w:p>
@@ -1685,7 +1706,7 @@
           <w:szCs w:val="24"/>
           <w:rtl/>
         </w:rPr>
-        <w:t xml:space="preserve">מחקרי המשך יוכלו להגדיל ולגוון את המדגם, להוסיף מדידת בסיס ותכנון עם מדידות חוזרות, ולחזק את מניפולציית החשיפה העקיפה, למשל באמצעות מודל וידאו חי או מודל דומה למשתתף. כדאי גם להוסיף מבחן מניפולציה ולבחון את עמידות האפקט לאורך זמן. חרף מגבלותיו, המחקר ממחיש שאף התערבות קצרה של היזכרות בהצלחה יכולה להעלות את תחושת המסוגלות, ממצא בעל ערך יישומי בהקשרים חינוכיים וטיפוליים.</w:t>
+        <w:t xml:space="preserve">מחקרי המשך יוכלו להגדיל ולגוון את המדגם, להוסיף מדידת בסיס ותכנון עם מדידות חוזרות, ולחזק את מניפולציית החשיפה העקיפה, למשל באמצעות מודל וידאו חי או מודל דומה למשתתף. כדאי גם להוסיף מבחן מניפולציה ולבחון את עמידות האפקט לאורך זמן. חרף מגבלותיו, המחקר ממחיש שאף התערבות קצרה של היזכרות בהצלחה יכולה להעלות את תחושת המסוגלות, ממצא בעל ערך יישומי בהכשרת מורים ובהקשרים חינוכיים. חיזוק תחושת המסוגלות של סטודנטים להוראה כבר בשלב ההכשרה עשוי לתרום בהמשך לתחושת המסוגלות המקצועית שלהם, למחויבותם למקצוע ולהתמודדותם עם שחיקה.</w:t>
       </w:r>
     </w:p>
     <w:p>

</xml_diff>

<commit_message>
Add teacher self-efficacy (TSES) as a second dependent measure
- Add TSES (Tschannen-Moran & Woolfolk Hoy, 2001) as a second outcome
  alongside the NGSE, fitting the pre-service teacher sample.
- Update abstract, intro, hypotheses, tools, and procedure for both measures.
- Add TSES descriptives (table 2) and in-text ANOVA/Tukey for the second DV.
- Discuss the weaker domain-specific effect; add the TSES reference and a
  full TSES questionnaire as appendix 4 (12 items, 3 subscales, 1-9 scale).

Co-Authored-By: Claude Opus 4.8 <noreply@anthropic.com>
Claude-Session: https://claude.ai/code/session_01YH1N5dULXnq2hJCrBuBusq
</commit_message>
<xml_diff>
--- a/examples/seminar-psychology-self-efficacy.docx
+++ b/examples/seminar-psychology-self-efficacy.docx
@@ -248,7 +248,7 @@
           <w:szCs w:val="24"/>
           <w:rtl/>
         </w:rPr>
-        <w:t xml:space="preserve">במחקר זה ביקשנו לבדוק האם מקור החוללות שאליו נחשף אדם משפיע על תחושת החוללות העצמית הכללית שלו. הספרות מבחינה בין ארבעה מקורות לחוללות עצמית, ובהם חוויית שליטה, שהיא התנסות ישירה בהצלחה, וחוויה עקיפה, שהיא למידה מהתבוננות באחר שמצליח. בכדי לבחון זאת השתתפו במדגם 33 סטודנטים בהכשרה להוראה, אשר חולקו באקראי באמצעות תוכנת Qualtrics לשלוש קבוצות. קבוצת הניסוי התבקשה להיזכר בהצלחה אישית מהעבר, קבוצת ההשוואה קראה עדות של עמית שהתמודד והצליח, וקבוצת הביקורת ביצעה משימת כתיבה נייטרלית. לאחר מכן מילאו כלל המשתתפים את שאלון החוללות העצמית הכללית (NGSE). השערת המחקר, לפיה חוויית שליטה תעלה את תחושת החוללות יותר מן החשיפה העקיפה, אוששה באופן חלקי. נמצא הבדל מובהק בין הקבוצות, F(2,30)=5.18, p=.012, η²=.26, כך שקבוצת חוויית השליטה (M=4.05, SD=0.57) דיווחה על חוללות גבוהה יותר מקבוצת הביקורת (M=3.30, SD=0.55), ואילו קבוצת החשיפה העקיפה (M=3.70, SD=0.52) לא נבדלה מהביקורת באופן מובהק. נוסף על כך מוצגים ממצאים מהספרות, נדונות מגבלות המחקר ומוצעים מחקרי המשך.</w:t>
+        <w:t xml:space="preserve">במחקר זה ביקשנו לבדוק האם מקור החוללות שאליו נחשף אדם משפיע על תחושת החוללות העצמית הכללית שלו. הספרות מבחינה בין ארבעה מקורות לחוללות עצמית, ובהם חוויית שליטה, שהיא התנסות ישירה בהצלחה, וחוויה עקיפה, שהיא למידה מהתבוננות באחר שמצליח. בכדי לבחון זאת השתתפו במדגם 33 סטודנטים בהכשרה להוראה, אשר חולקו באקראי באמצעות תוכנת Qualtrics לשלוש קבוצות. קבוצת הניסוי התבקשה להיזכר בהצלחה אישית מהעבר, קבוצת ההשוואה קראה עדות של עמית שהתמודד והצליח, וקבוצת הביקורת ביצעה משימת כתיבה נייטרלית. לאחר מכן מילאו כלל המשתתפים שני שאלונים: שאלון החוללות העצמית הכללית (NGSE) ושאלון תחושת המסוגלות של המורה (TSES). השערת המחקר, לפיה חוויית שליטה תעלה את תחושת המסוגלות יותר מן החשיפה העקיפה, אוששה באופן חלקי בשני המדדים. בחוללות העצמית הכללית נמצא הבדל מובהק בין הקבוצות, F(2,30)=5.18, p=.012, η²=.26, כך שקבוצת חוויית השליטה (M=4.05, SD=0.57) דיווחה על חוללות גבוהה יותר מקבוצת הביקורת (M=3.30, SD=0.55). גם בתחושת המסוגלות של המורה נמצא הבדל מובהק, F(2,30)=3.69, p=.037, η²=.20, באותו כיוון. בשני המדדים קבוצת החשיפה העקיפה לא נבדלה מהביקורת באופן מובהק. נוסף על כך מוצגים ממצאים מהספרות, נדונות מגבלות המחקר ומוצעים מחקרי המשך.</w:t>
       </w:r>
     </w:p>
     <w:p>
@@ -415,7 +415,7 @@
           <w:szCs w:val="24"/>
           <w:rtl/>
         </w:rPr>
-        <w:t xml:space="preserve">לחוללות העצמית תפקיד מרכזי במוטיבציה ובלמידה. סקירה מקיפה שתורגמה לעברית מתארת כיצד תחושת המסוגלות משפיעה על עירור ההתנהגות, על בחירת המשימות, על המאמץ ועל ההתמדה, וכיצד היא עצמה מתעצבת מהצבת מטרות, מעיבוד מידע וממשוב, ומסכמת עדויות לכך שהיא מנבאת תוצאות מוטיבציוניות ולימודיות (שאנק, 2001).</w:t>
+        <w:t xml:space="preserve">לצד המדד הכללי פותחו גם מדדים ספציפיים לתחומים מסוימים. בתחום ההוראה, הכלי הנפוץ ביותר הוא שאלון תחושת המסוגלות של המורה (TSES), הבוחן את אמונת המורה ביכולתו להשפיע בשלושה תחומים: מעורבות תלמידים, אסטרטגיות הוראה וניהול כיתה. הכלי מעוגן בתיאוריה של בנדורה ומשמש הן עם מורים בפועל והן עם סטודנטים בהכשרה להוראה (Tschannen-Moran &amp; Woolfolk Hoy, 2001).</w:t>
       </w:r>
     </w:p>
     <w:p>
@@ -436,7 +436,7 @@
           <w:szCs w:val="24"/>
           <w:rtl/>
         </w:rPr>
-        <w:t xml:space="preserve">עדות עדכנית לקשר הזה עולה ממחקר רחב היקף שנערך על יותר מ-2,300 תלמידים. נמצא בו שתחושת החוללות העצמית היא המנבא החזק ביותר של הישגים לימודיים, חזק אף מהמוטיבציה עצמה, ושהיא מתווכת את הקשר בין תמיכה בצרכים הפסיכולוגיים לבין ההישגים (Basileo et al., 2024).</w:t>
+        <w:t xml:space="preserve">לחוללות העצמית תפקיד מרכזי במוטיבציה ובלמידה. סקירה מקיפה שתורגמה לעברית מתארת כיצד תחושת המסוגלות משפיעה על עירור ההתנהגות, על בחירת המשימות, על המאמץ ועל ההתמדה, וכיצד היא עצמה מתעצבת מהצבת מטרות, מעיבוד מידע וממשוב, ומסכמת עדויות לכך שהיא מנבאת תוצאות מוטיבציוניות ולימודיות (שאנק, 2001).</w:t>
       </w:r>
     </w:p>
     <w:p>
@@ -457,7 +457,7 @@
           <w:szCs w:val="24"/>
           <w:rtl/>
         </w:rPr>
-        <w:t xml:space="preserve">בהקשר של למידה מקוונת, שהתרחבה מאוד בשנים האחרונות, נבחן הכוח המנבא של החוללות. נמצא שחוללות עצמית וחוסן מנבאים יחד את המוטיבציה הלימודית של סטודנטים, כך שככל שתחושת המסוגלות גבוהה יותר, כך המוטיבציה גבוהה יותר (Abdolrezapour, Jahanbakhsh Ganjeh, &amp; Ghanbari, 2023).</w:t>
+        <w:t xml:space="preserve">עדות עדכנית לקשר הזה עולה ממחקר רחב היקף שנערך על יותר מ-2,300 תלמידים. נמצא בו שתחושת החוללות העצמית היא המנבא החזק ביותר של הישגים לימודיים, חזק אף מהמוטיבציה עצמה, ושהיא מתווכת את הקשר בין תמיכה בצרכים הפסיכולוגיים לבין ההישגים (Basileo et al., 2024).</w:t>
       </w:r>
     </w:p>
     <w:p>
@@ -478,7 +478,7 @@
           <w:szCs w:val="24"/>
           <w:rtl/>
         </w:rPr>
-        <w:t xml:space="preserve">גם בישראל נחקרה תחושת המסוגלות בהקשרים חינוכיים. עבודה שעסקה במסוגלות של מורים דנה במשמעות המושג, בדרכים למדוד אותו, ובתפקיד שיכול למלא היועץ החינוכי בחיזוק תחושת המסוגלות של המורה (לב וריץ', 1999).</w:t>
+        <w:t xml:space="preserve">בהקשר של למידה מקוונת, שהתרחבה מאוד בשנים האחרונות, נבחן הכוח המנבא של החוללות. נמצא שחוללות עצמית וחוסן מנבאים יחד את המוטיבציה הלימודית של סטודנטים, כך שככל שתחושת המסוגלות גבוהה יותר, כך המוטיבציה גבוהה יותר (Abdolrezapour, Jahanbakhsh Ganjeh, &amp; Ghanbari, 2023).</w:t>
       </w:r>
     </w:p>
     <w:p>
@@ -499,7 +499,7 @@
           <w:szCs w:val="24"/>
           <w:rtl/>
         </w:rPr>
-        <w:t xml:space="preserve">מחקר מאוחר יותר הרחיב את היריעה לבעלי תפקידים נוספים במערכת החינוך, ובחן את תחושת המסוגלות העצמית של סייעות פדגוגיות העובדות עם תלמידים בעלי צרכים מיוחדים, תוך עמידה על המשאבים והאתגרים המעצבים אותה (גרינבנק ואגם בן-ארצי, 2018).</w:t>
+        <w:t xml:space="preserve">גם בישראל נחקרה תחושת המסוגלות בהקשרים חינוכיים. עבודה שעסקה במסוגלות של מורים דנה במשמעות המושג, בדרכים למדוד אותו, ובתפקיד שיכול למלא היועץ החינוכי בחיזוק תחושת המסוגלות של המורה (לב וריץ', 1999).</w:t>
       </w:r>
     </w:p>
     <w:p>
@@ -520,7 +520,7 @@
           <w:szCs w:val="24"/>
           <w:rtl/>
         </w:rPr>
-        <w:t xml:space="preserve">בזירת ההכלה נבדק הקשר בין תחושת המסוגלות העצמית של מורים לבין עמדות והתנהגויות כלפי תלמידים עם הפרעת למידה ספציפית, ונמצא שתחושת מסוגלות גבוהה נקשרת ליכולת הכלה ולאמפתיה רבה יותר כלפי תלמידים אלה (זבידאת, דלאשה ובשיר, 2019).</w:t>
+        <w:t xml:space="preserve">מחקר מאוחר יותר הרחיב את היריעה לבעלי תפקידים נוספים במערכת החינוך, ובחן את תחושת המסוגלות העצמית של סייעות פדגוגיות העובדות עם תלמידים בעלי צרכים מיוחדים, תוך עמידה על המשאבים והאתגרים המעצבים אותה (גרינבנק ואגם בן-ארצי, 2018).</w:t>
       </w:r>
     </w:p>
     <w:p>
@@ -541,7 +541,7 @@
           <w:szCs w:val="24"/>
           <w:rtl/>
         </w:rPr>
-        <w:t xml:space="preserve">בחברה הערבית בישראל נבחנה תחושת המסוגלות של מטפלות-מחנכות בגיל הרך ביחס לשחיקה, לנדידת מחשבות ולתפיסת הקשר עם ההורים, ונמצא שקשר חיובי עם ההורים נקשר לתחושת מסוגלות עצמית גבוהה יותר, ממצא המדגיש את חשיבות הסביבה היחסית בעיצוב המסוגלות (אבו-אסעד ואביטן, 2020).</w:t>
+        <w:t xml:space="preserve">בזירת ההכלה נבדק הקשר בין תחושת המסוגלות העצמית של מורים לבין עמדות והתנהגויות כלפי תלמידים עם הפרעת למידה ספציפית, ונמצא שתחושת מסוגלות גבוהה נקשרת ליכולת הכלה ולאמפתיה רבה יותר כלפי תלמידים אלה (זבידאת, דלאשה ובשיר, 2019).</w:t>
       </w:r>
     </w:p>
     <w:p>
@@ -562,7 +562,7 @@
           <w:szCs w:val="24"/>
           <w:rtl/>
         </w:rPr>
-        <w:t xml:space="preserve">ההקשר החינוכי ממחיש היטב את חשיבות הנושא. תחושת המסוגלות של מורים ושל סטודנטים בהכשרה להוראה נמצאה קשורה למחויבות למקצוע, להכלה, לאמפתיה כלפי תלמידים ולהתמודדות עם שחיקה, ותחושת מסוגלות כללית גבוהה מהווה בסיס לתחושת המסוגלות המקצועית שתתפתח בהמשך. עם זאת, רוב המחקרים בתחום הם מתאמיים, ומעטים בחנו בתנאי ניסוי האם ניתן להעלות את תחושת המסוגלות של סטודנטים להוראה, ואיזה מקור עושה זאת ביעילות רבה יותר.</w:t>
+        <w:t xml:space="preserve">בחברה הערבית בישראל נבחנה תחושת המסוגלות של מטפלות-מחנכות בגיל הרך ביחס לשחיקה, לנדידת מחשבות ולתפיסת הקשר עם ההורים, ונמצא שקשר חיובי עם ההורים נקשר לתחושת מסוגלות עצמית גבוהה יותר, ממצא המדגיש את חשיבות הסביבה היחסית בעיצוב המסוגלות (אבו-אסעד ואביטן, 2020).</w:t>
       </w:r>
     </w:p>
     <w:p>
@@ -583,7 +583,49 @@
           <w:szCs w:val="24"/>
           <w:rtl/>
         </w:rPr>
-        <w:t xml:space="preserve">לפיכך, המחקר הנוכחי מבקש לבחון בתנאי מעבדה מבוקרים האם אינדוקציה קצרה מספיקה כדי להעלות את תחושת החוללות העצמית הכללית בקרב סטודנטים בהכשרה להוראה, ואיזה מבין שני מקורות החוללות, חוויית שליטה או חשיפה עקיפה, אפקטיבי יותר, בהשוואה לתנאי ביקורת נייטרלי. בהתאם לטענת בנדורה שחוויות שליטה הן המקור החזק ביותר, השערת המחקר הייתה שקבוצת חוויית השליטה תדווח על החוללות הגבוהה ביותר, שקבוצת החשיפה העקיפה תדווח על חוללות גבוהה מן הביקורת אך נמוכה מחוויית השליטה, ושקבוצת הביקורת תדווח על החוללות הנמוכה ביותר.</w:t>
+        <w:t xml:space="preserve">ההקשר החינוכי ממחיש היטב את חשיבות הנושא. תחושת המסוגלות של מורים ושל סטודנטים בהכשרה להוראה נמצאה קשורה למחויבות למקצוע, להכלה, לאמפתיה כלפי תלמידים ולהתמודדות עם שחיקה, ותחושת מסוגלות כללית גבוהה מהווה בסיס לתחושת המסוגלות המקצועית שתתפתח בהמשך. עם זאת, רוב המחקרים בתחום הם מתאמיים, ומעטים בחנו בתנאי ניסוי האם ניתן להעלות את תחושת המסוגלות של סטודנטים להוראה, ואיזה מקור עושה זאת ביעילות רבה יותר.</w:t>
+      </w:r>
+    </w:p>
+    <w:p>
+      <w:pPr>
+        <w:bidi/>
+        <w:spacing w:after="160" w:before="0" w:line="360"/>
+        <w:jc w:val="both"/>
+      </w:pPr>
+      <w:r>
+        <w:rPr>
+          <w:rFonts w:ascii="David" w:cs="David" w:eastAsia="David" w:hAnsi="David"/>
+          <w:b w:val="false"/>
+          <w:bCs w:val="false"/>
+          <w:i w:val="false"/>
+          <w:iCs w:val="false"/>
+          <w:color w:val="000000"/>
+          <w:sz w:val="24"/>
+          <w:szCs w:val="24"/>
+          <w:rtl/>
+        </w:rPr>
+        <w:t xml:space="preserve">לפיכך, המחקר הנוכחי מבקש לבחון בתנאי מעבדה מבוקרים האם אינדוקציה קצרה מספיקה כדי להעלות את תחושת המסוגלות בקרב סטודנטים בהכשרה להוראה, ואיזה מבין שני מקורות החוללות, חוויית שליטה או חשיפה עקיפה, אפקטיבי יותר, בהשוואה לתנאי ביקורת נייטרלי. תחושת המסוגלות נמדדה בשני מדדים: חוללות עצמית כללית (NGSE) ותחושת המסוגלות של המורה (TSES).</w:t>
+      </w:r>
+    </w:p>
+    <w:p>
+      <w:pPr>
+        <w:bidi/>
+        <w:spacing w:after="160" w:before="0" w:line="360"/>
+        <w:jc w:val="both"/>
+      </w:pPr>
+      <w:r>
+        <w:rPr>
+          <w:rFonts w:ascii="David" w:cs="David" w:eastAsia="David" w:hAnsi="David"/>
+          <w:b w:val="false"/>
+          <w:bCs w:val="false"/>
+          <w:i w:val="false"/>
+          <w:iCs w:val="false"/>
+          <w:color w:val="000000"/>
+          <w:sz w:val="24"/>
+          <w:szCs w:val="24"/>
+          <w:rtl/>
+        </w:rPr>
+        <w:t xml:space="preserve">בהתאם לטענת בנדורה שחוויות שליטה הן המקור החזק ביותר, השערת המחקר הייתה שבשני המדדים קבוצת חוויית השליטה תדווח על המסוגלות הגבוהה ביותר, שקבוצת החשיפה העקיפה תדווח על מסוגלות גבוהה מן הביקורת אך נמוכה מחוויית השליטה, ושקבוצת הביקורת תדווח על המסוגלות הנמוכה ביותר.</w:t>
       </w:r>
     </w:p>
     <w:p>
@@ -785,6 +827,41 @@
     </w:p>
     <w:p>
       <w:pPr>
+        <w:bidi/>
+        <w:spacing w:after="160" w:before="0" w:line="360"/>
+        <w:jc w:val="both"/>
+      </w:pPr>
+      <w:r>
+        <w:rPr>
+          <w:rFonts w:ascii="David" w:cs="David" w:eastAsia="David" w:hAnsi="David"/>
+          <w:b/>
+          <w:bCs/>
+          <w:i w:val="false"/>
+          <w:iCs w:val="false"/>
+          <w:color w:val="000000"/>
+          <w:sz w:val="24"/>
+          <w:szCs w:val="24"/>
+          <w:rtl/>
+        </w:rPr>
+        <w:t xml:space="preserve">שאלון תחושת המסוגלות של המורה (TSES). </w:t>
+      </w:r>
+      <w:r>
+        <w:rPr>
+          <w:rFonts w:ascii="David" w:cs="David" w:eastAsia="David" w:hAnsi="David"/>
+          <w:b w:val="false"/>
+          <w:bCs w:val="false"/>
+          <w:i w:val="false"/>
+          <w:iCs w:val="false"/>
+          <w:color w:val="000000"/>
+          <w:sz w:val="24"/>
+          <w:szCs w:val="24"/>
+          <w:rtl/>
+        </w:rPr>
+        <w:t xml:space="preserve">למדידת תחושת המסוגלות בהקשר ההוראה נעשה שימוש בגרסה הקצרה של שאלון תחושת המסוגלות של המורה (Tschannen-Moran &amp; Woolfolk Hoy, 2001), הכוללת שנים-עשר היגדים בשלושה תת-סולמות: מעורבות תלמידים, אסטרטגיות הוראה וניהול כיתה. ההיגדים מדורגים בסולם בן תשע דרגות, מ-1 (כלל לא) עד 9 (במידה רבה מאוד). לדוגמה: "עד כמה תוכל/י לספק הסבר חלופי או דוגמה נוספת כאשר תלמידים מתקשים להבין?". ציון המסוגלות חושב כממוצע שנים-עשר ההיגדים, ולשאלון נמצאה מהימנות גבוהה (אלפא של קרונבך = .91) (ראו נספח 4).</w:t>
+      </w:r>
+    </w:p>
+    <w:p>
+      <w:pPr>
         <w:pStyle w:val="Heading2"/>
         <w:bidi/>
         <w:spacing w:after="100" w:before="180"/>
@@ -823,7 +900,7 @@
           <w:szCs w:val="24"/>
           <w:rtl/>
         </w:rPr>
-        <w:t xml:space="preserve">המשתתפים ענו על השאלונים באופן דיגיטלי באמצעות תוכנת Qualtrics, אליה נכנסו דרך קישור שנשלח אליהם. עם הכניסה הוצגו בפניהם הוראות והסבר כללי, ומטרת המחקר המדויקת לא נחשפה, אלא הוצג נושאו הכללי בלבד. משתתפים שנתנו את הסכמתם מדעת מילאו תחילה שאלון דמוגרפי קצר, ולאחר מכן הוקצו מקרית לאחד משלושת התנאים וביצעו את משימת המניפולציה המתאימה. מיד לאחר מכן הועברו למילוי שאלון החוללות העצמית. בסיום הוצגה הודעת תודה על ההשתתפות במחקר.</w:t>
+        <w:t xml:space="preserve">המשתתפים ענו על השאלונים באופן דיגיטלי באמצעות תוכנת Qualtrics, אליה נכנסו דרך קישור שנשלח אליהם. עם הכניסה הוצגו בפניהם הוראות והסבר כללי, ומטרת המחקר המדויקת לא נחשפה, אלא הוצג נושאו הכללי בלבד. משתתפים שנתנו את הסכמתם מדעת מילאו תחילה שאלון דמוגרפי קצר, ולאחר מכן הוקצו מקרית לאחד משלושת התנאים וביצעו את משימת המניפולציה המתאימה. מיד לאחר מכן הועברו למילוי שני שאלוני המסוגלות, שאלון החוללות העצמית הכללית ושאלון תחושת המסוגלות של המורה. בסיום הוצגה הודעת תודה על ההשתתפות במחקר.</w:t>
       </w:r>
     </w:p>
     <w:p>
@@ -1578,6 +1655,627 @@
       </w:r>
     </w:p>
     <w:p>
+      <w:pPr>
+        <w:bidi/>
+        <w:spacing w:after="160" w:before="40" w:line="360"/>
+        <w:jc w:val="both"/>
+      </w:pPr>
+      <w:r>
+        <w:rPr>
+          <w:rFonts w:ascii="David" w:cs="David" w:eastAsia="David" w:hAnsi="David"/>
+          <w:b w:val="false"/>
+          <w:bCs w:val="false"/>
+          <w:i w:val="false"/>
+          <w:iCs w:val="false"/>
+          <w:color w:val="000000"/>
+          <w:sz w:val="24"/>
+          <w:szCs w:val="24"/>
+          <w:rtl/>
+        </w:rPr>
+        <w:t xml:space="preserve">בשלב הבא נבחנה השפעת המניפולציה על תחושת המסוגלות של המורה (TSES), שחושבה כממוצע שנים-עשר ההיגדים. הסטטיסטיקה התיאורית מוצגת בטבלה 2. גם כאן עלה הממוצע מקבוצת הביקורת, דרך החשיפה העקיפה, ועד חוויית השליטה.</w:t>
+      </w:r>
+    </w:p>
+    <w:p>
+      <w:pPr>
+        <w:bidi/>
+        <w:spacing w:after="80" w:before="80"/>
+        <w:jc w:val="center"/>
+      </w:pPr>
+      <w:r>
+        <w:rPr>
+          <w:rFonts w:ascii="David" w:cs="David" w:eastAsia="David" w:hAnsi="David"/>
+          <w:b/>
+          <w:bCs/>
+          <w:i w:val="false"/>
+          <w:iCs w:val="false"/>
+          <w:color w:val="000000"/>
+          <w:sz w:val="24"/>
+          <w:szCs w:val="24"/>
+          <w:rtl/>
+        </w:rPr>
+        <w:t xml:space="preserve">טבלה 2</w:t>
+      </w:r>
+      <w:r>
+        <w:rPr>
+          <w:rFonts w:ascii="David" w:cs="David" w:eastAsia="David" w:hAnsi="David"/>
+          <w:b w:val="false"/>
+          <w:bCs w:val="false"/>
+          <w:i w:val="false"/>
+          <w:iCs w:val="false"/>
+          <w:color w:val="000000"/>
+          <w:sz w:val="24"/>
+          <w:szCs w:val="24"/>
+          <w:rtl/>
+        </w:rPr>
+        <w:t xml:space="preserve">: ממוצעים וסטיות תקן של תחושת המסוגלות של המורה בקבוצות המחקר</w:t>
+      </w:r>
+    </w:p>
+    <w:tbl>
+      <w:tblPr>
+        <w:bidiVisual/>
+        <w:tblW w:type="dxa" w:w="9100"/>
+        <w:jc w:val="center"/>
+        <w:tblBorders>
+          <w:top w:val="single" w:color="000000" w:sz="4"/>
+          <w:left w:val="single" w:color="000000" w:sz="4"/>
+          <w:bottom w:val="single" w:color="000000" w:sz="4"/>
+          <w:right w:val="single" w:color="000000" w:sz="4"/>
+          <w:insideH w:val="single" w:color="000000" w:sz="4"/>
+          <w:insideV w:val="single" w:color="000000" w:sz="4"/>
+        </w:tblBorders>
+      </w:tblPr>
+      <w:tblGrid>
+        <w:gridCol w:w="3400"/>
+        <w:gridCol w:w="1500"/>
+        <w:gridCol w:w="2100"/>
+        <w:gridCol w:w="2100"/>
+      </w:tblGrid>
+      <w:tr>
+        <w:trPr>
+          <w:tblHeader/>
+        </w:trPr>
+        <w:tc>
+          <w:tcPr>
+            <w:tcW w:type="dxa" w:w="3400"/>
+            <w:tcMar>
+              <w:top w:type="dxa" w:w="50"/>
+              <w:left w:type="dxa" w:w="80"/>
+              <w:bottom w:type="dxa" w:w="50"/>
+              <w:right w:type="dxa" w:w="80"/>
+            </w:tcMar>
+          </w:tcPr>
+          <w:p>
+            <w:pPr>
+              <w:bidi/>
+              <w:spacing w:after="0" w:line="260"/>
+              <w:jc w:val="center"/>
+            </w:pPr>
+            <w:r>
+              <w:rPr>
+                <w:rFonts w:ascii="David" w:cs="David" w:eastAsia="David" w:hAnsi="David"/>
+                <w:b/>
+                <w:bCs/>
+                <w:i w:val="false"/>
+                <w:iCs w:val="false"/>
+                <w:color w:val="000000"/>
+                <w:sz w:val="24"/>
+                <w:szCs w:val="24"/>
+                <w:rtl/>
+              </w:rPr>
+              <w:t xml:space="preserve">קבוצה</w:t>
+            </w:r>
+          </w:p>
+        </w:tc>
+        <w:tc>
+          <w:tcPr>
+            <w:tcW w:type="dxa" w:w="1500"/>
+            <w:tcMar>
+              <w:top w:type="dxa" w:w="50"/>
+              <w:left w:type="dxa" w:w="80"/>
+              <w:bottom w:type="dxa" w:w="50"/>
+              <w:right w:type="dxa" w:w="80"/>
+            </w:tcMar>
+          </w:tcPr>
+          <w:p>
+            <w:pPr>
+              <w:bidi/>
+              <w:spacing w:after="0" w:line="260"/>
+              <w:jc w:val="center"/>
+            </w:pPr>
+            <w:r>
+              <w:rPr>
+                <w:rFonts w:ascii="David" w:cs="David" w:eastAsia="David" w:hAnsi="David"/>
+                <w:b/>
+                <w:bCs/>
+                <w:i w:val="false"/>
+                <w:iCs w:val="false"/>
+                <w:color w:val="000000"/>
+                <w:sz w:val="24"/>
+                <w:szCs w:val="24"/>
+                <w:rtl/>
+              </w:rPr>
+              <w:t xml:space="preserve">N</w:t>
+            </w:r>
+          </w:p>
+        </w:tc>
+        <w:tc>
+          <w:tcPr>
+            <w:tcW w:type="dxa" w:w="2100"/>
+            <w:tcMar>
+              <w:top w:type="dxa" w:w="50"/>
+              <w:left w:type="dxa" w:w="80"/>
+              <w:bottom w:type="dxa" w:w="50"/>
+              <w:right w:type="dxa" w:w="80"/>
+            </w:tcMar>
+          </w:tcPr>
+          <w:p>
+            <w:pPr>
+              <w:bidi/>
+              <w:spacing w:after="0" w:line="260"/>
+              <w:jc w:val="center"/>
+            </w:pPr>
+            <w:r>
+              <w:rPr>
+                <w:rFonts w:ascii="David" w:cs="David" w:eastAsia="David" w:hAnsi="David"/>
+                <w:b/>
+                <w:bCs/>
+                <w:i w:val="false"/>
+                <w:iCs w:val="false"/>
+                <w:color w:val="000000"/>
+                <w:sz w:val="24"/>
+                <w:szCs w:val="24"/>
+                <w:rtl/>
+              </w:rPr>
+              <w:t xml:space="preserve">ממוצע</w:t>
+            </w:r>
+          </w:p>
+        </w:tc>
+        <w:tc>
+          <w:tcPr>
+            <w:tcW w:type="dxa" w:w="2100"/>
+            <w:tcMar>
+              <w:top w:type="dxa" w:w="50"/>
+              <w:left w:type="dxa" w:w="80"/>
+              <w:bottom w:type="dxa" w:w="50"/>
+              <w:right w:type="dxa" w:w="80"/>
+            </w:tcMar>
+          </w:tcPr>
+          <w:p>
+            <w:pPr>
+              <w:bidi/>
+              <w:spacing w:after="0" w:line="260"/>
+              <w:jc w:val="center"/>
+            </w:pPr>
+            <w:r>
+              <w:rPr>
+                <w:rFonts w:ascii="David" w:cs="David" w:eastAsia="David" w:hAnsi="David"/>
+                <w:b/>
+                <w:bCs/>
+                <w:i w:val="false"/>
+                <w:iCs w:val="false"/>
+                <w:color w:val="000000"/>
+                <w:sz w:val="24"/>
+                <w:szCs w:val="24"/>
+                <w:rtl/>
+              </w:rPr>
+              <w:t xml:space="preserve">ס"ת</w:t>
+            </w:r>
+          </w:p>
+        </w:tc>
+      </w:tr>
+      <w:tr>
+        <w:tc>
+          <w:tcPr>
+            <w:tcW w:type="dxa" w:w="3400"/>
+            <w:tcMar>
+              <w:top w:type="dxa" w:w="50"/>
+              <w:left w:type="dxa" w:w="80"/>
+              <w:bottom w:type="dxa" w:w="50"/>
+              <w:right w:type="dxa" w:w="80"/>
+            </w:tcMar>
+          </w:tcPr>
+          <w:p>
+            <w:pPr>
+              <w:bidi/>
+              <w:spacing w:after="0" w:line="260"/>
+              <w:jc w:val="center"/>
+            </w:pPr>
+            <w:r>
+              <w:rPr>
+                <w:rFonts w:ascii="David" w:cs="David" w:eastAsia="David" w:hAnsi="David"/>
+                <w:b w:val="false"/>
+                <w:bCs w:val="false"/>
+                <w:i w:val="false"/>
+                <w:iCs w:val="false"/>
+                <w:color w:val="000000"/>
+                <w:sz w:val="24"/>
+                <w:szCs w:val="24"/>
+                <w:rtl/>
+              </w:rPr>
+              <w:t xml:space="preserve">חוויית שליטה</w:t>
+            </w:r>
+          </w:p>
+        </w:tc>
+        <w:tc>
+          <w:tcPr>
+            <w:tcW w:type="dxa" w:w="1500"/>
+            <w:tcMar>
+              <w:top w:type="dxa" w:w="50"/>
+              <w:left w:type="dxa" w:w="80"/>
+              <w:bottom w:type="dxa" w:w="50"/>
+              <w:right w:type="dxa" w:w="80"/>
+            </w:tcMar>
+          </w:tcPr>
+          <w:p>
+            <w:pPr>
+              <w:bidi/>
+              <w:spacing w:after="0" w:line="260"/>
+              <w:jc w:val="center"/>
+            </w:pPr>
+            <w:r>
+              <w:rPr>
+                <w:rFonts w:ascii="David" w:cs="David" w:eastAsia="David" w:hAnsi="David"/>
+                <w:b w:val="false"/>
+                <w:bCs w:val="false"/>
+                <w:i w:val="false"/>
+                <w:iCs w:val="false"/>
+                <w:color w:val="000000"/>
+                <w:sz w:val="24"/>
+                <w:szCs w:val="24"/>
+                <w:rtl/>
+              </w:rPr>
+              <w:t xml:space="preserve">11</w:t>
+            </w:r>
+          </w:p>
+        </w:tc>
+        <w:tc>
+          <w:tcPr>
+            <w:tcW w:type="dxa" w:w="2100"/>
+            <w:tcMar>
+              <w:top w:type="dxa" w:w="50"/>
+              <w:left w:type="dxa" w:w="80"/>
+              <w:bottom w:type="dxa" w:w="50"/>
+              <w:right w:type="dxa" w:w="80"/>
+            </w:tcMar>
+          </w:tcPr>
+          <w:p>
+            <w:pPr>
+              <w:bidi/>
+              <w:spacing w:after="0" w:line="260"/>
+              <w:jc w:val="center"/>
+            </w:pPr>
+            <w:r>
+              <w:rPr>
+                <w:rFonts w:ascii="David" w:cs="David" w:eastAsia="David" w:hAnsi="David"/>
+                <w:b w:val="false"/>
+                <w:bCs w:val="false"/>
+                <w:i w:val="false"/>
+                <w:iCs w:val="false"/>
+                <w:color w:val="000000"/>
+                <w:sz w:val="24"/>
+                <w:szCs w:val="24"/>
+                <w:rtl/>
+              </w:rPr>
+              <w:t xml:space="preserve">6.98</w:t>
+            </w:r>
+          </w:p>
+        </w:tc>
+        <w:tc>
+          <w:tcPr>
+            <w:tcW w:type="dxa" w:w="2100"/>
+            <w:tcMar>
+              <w:top w:type="dxa" w:w="50"/>
+              <w:left w:type="dxa" w:w="80"/>
+              <w:bottom w:type="dxa" w:w="50"/>
+              <w:right w:type="dxa" w:w="80"/>
+            </w:tcMar>
+          </w:tcPr>
+          <w:p>
+            <w:pPr>
+              <w:bidi/>
+              <w:spacing w:after="0" w:line="260"/>
+              <w:jc w:val="center"/>
+            </w:pPr>
+            <w:r>
+              <w:rPr>
+                <w:rFonts w:ascii="David" w:cs="David" w:eastAsia="David" w:hAnsi="David"/>
+                <w:b w:val="false"/>
+                <w:bCs w:val="false"/>
+                <w:i w:val="false"/>
+                <w:iCs w:val="false"/>
+                <w:color w:val="000000"/>
+                <w:sz w:val="24"/>
+                <w:szCs w:val="24"/>
+                <w:rtl/>
+              </w:rPr>
+              <w:t xml:space="preserve">0.76</w:t>
+            </w:r>
+          </w:p>
+        </w:tc>
+      </w:tr>
+      <w:tr>
+        <w:tc>
+          <w:tcPr>
+            <w:tcW w:type="dxa" w:w="3400"/>
+            <w:tcMar>
+              <w:top w:type="dxa" w:w="50"/>
+              <w:left w:type="dxa" w:w="80"/>
+              <w:bottom w:type="dxa" w:w="50"/>
+              <w:right w:type="dxa" w:w="80"/>
+            </w:tcMar>
+          </w:tcPr>
+          <w:p>
+            <w:pPr>
+              <w:bidi/>
+              <w:spacing w:after="0" w:line="260"/>
+              <w:jc w:val="center"/>
+            </w:pPr>
+            <w:r>
+              <w:rPr>
+                <w:rFonts w:ascii="David" w:cs="David" w:eastAsia="David" w:hAnsi="David"/>
+                <w:b w:val="false"/>
+                <w:bCs w:val="false"/>
+                <w:i w:val="false"/>
+                <w:iCs w:val="false"/>
+                <w:color w:val="000000"/>
+                <w:sz w:val="24"/>
+                <w:szCs w:val="24"/>
+                <w:rtl/>
+              </w:rPr>
+              <w:t xml:space="preserve">חשיפה עקיפה</w:t>
+            </w:r>
+          </w:p>
+        </w:tc>
+        <w:tc>
+          <w:tcPr>
+            <w:tcW w:type="dxa" w:w="1500"/>
+            <w:tcMar>
+              <w:top w:type="dxa" w:w="50"/>
+              <w:left w:type="dxa" w:w="80"/>
+              <w:bottom w:type="dxa" w:w="50"/>
+              <w:right w:type="dxa" w:w="80"/>
+            </w:tcMar>
+          </w:tcPr>
+          <w:p>
+            <w:pPr>
+              <w:bidi/>
+              <w:spacing w:after="0" w:line="260"/>
+              <w:jc w:val="center"/>
+            </w:pPr>
+            <w:r>
+              <w:rPr>
+                <w:rFonts w:ascii="David" w:cs="David" w:eastAsia="David" w:hAnsi="David"/>
+                <w:b w:val="false"/>
+                <w:bCs w:val="false"/>
+                <w:i w:val="false"/>
+                <w:iCs w:val="false"/>
+                <w:color w:val="000000"/>
+                <w:sz w:val="24"/>
+                <w:szCs w:val="24"/>
+                <w:rtl/>
+              </w:rPr>
+              <w:t xml:space="preserve">11</w:t>
+            </w:r>
+          </w:p>
+        </w:tc>
+        <w:tc>
+          <w:tcPr>
+            <w:tcW w:type="dxa" w:w="2100"/>
+            <w:tcMar>
+              <w:top w:type="dxa" w:w="50"/>
+              <w:left w:type="dxa" w:w="80"/>
+              <w:bottom w:type="dxa" w:w="50"/>
+              <w:right w:type="dxa" w:w="80"/>
+            </w:tcMar>
+          </w:tcPr>
+          <w:p>
+            <w:pPr>
+              <w:bidi/>
+              <w:spacing w:after="0" w:line="260"/>
+              <w:jc w:val="center"/>
+            </w:pPr>
+            <w:r>
+              <w:rPr>
+                <w:rFonts w:ascii="David" w:cs="David" w:eastAsia="David" w:hAnsi="David"/>
+                <w:b w:val="false"/>
+                <w:bCs w:val="false"/>
+                <w:i w:val="false"/>
+                <w:iCs w:val="false"/>
+                <w:color w:val="000000"/>
+                <w:sz w:val="24"/>
+                <w:szCs w:val="24"/>
+                <w:rtl/>
+              </w:rPr>
+              <w:t xml:space="preserve">6.55</w:t>
+            </w:r>
+          </w:p>
+        </w:tc>
+        <w:tc>
+          <w:tcPr>
+            <w:tcW w:type="dxa" w:w="2100"/>
+            <w:tcMar>
+              <w:top w:type="dxa" w:w="50"/>
+              <w:left w:type="dxa" w:w="80"/>
+              <w:bottom w:type="dxa" w:w="50"/>
+              <w:right w:type="dxa" w:w="80"/>
+            </w:tcMar>
+          </w:tcPr>
+          <w:p>
+            <w:pPr>
+              <w:bidi/>
+              <w:spacing w:after="0" w:line="260"/>
+              <w:jc w:val="center"/>
+            </w:pPr>
+            <w:r>
+              <w:rPr>
+                <w:rFonts w:ascii="David" w:cs="David" w:eastAsia="David" w:hAnsi="David"/>
+                <w:b w:val="false"/>
+                <w:bCs w:val="false"/>
+                <w:i w:val="false"/>
+                <w:iCs w:val="false"/>
+                <w:color w:val="000000"/>
+                <w:sz w:val="24"/>
+                <w:szCs w:val="24"/>
+                <w:rtl/>
+              </w:rPr>
+              <w:t xml:space="preserve">0.74</w:t>
+            </w:r>
+          </w:p>
+        </w:tc>
+      </w:tr>
+      <w:tr>
+        <w:tc>
+          <w:tcPr>
+            <w:tcW w:type="dxa" w:w="3400"/>
+            <w:tcMar>
+              <w:top w:type="dxa" w:w="50"/>
+              <w:left w:type="dxa" w:w="80"/>
+              <w:bottom w:type="dxa" w:w="50"/>
+              <w:right w:type="dxa" w:w="80"/>
+            </w:tcMar>
+          </w:tcPr>
+          <w:p>
+            <w:pPr>
+              <w:bidi/>
+              <w:spacing w:after="0" w:line="260"/>
+              <w:jc w:val="center"/>
+            </w:pPr>
+            <w:r>
+              <w:rPr>
+                <w:rFonts w:ascii="David" w:cs="David" w:eastAsia="David" w:hAnsi="David"/>
+                <w:b w:val="false"/>
+                <w:bCs w:val="false"/>
+                <w:i w:val="false"/>
+                <w:iCs w:val="false"/>
+                <w:color w:val="000000"/>
+                <w:sz w:val="24"/>
+                <w:szCs w:val="24"/>
+                <w:rtl/>
+              </w:rPr>
+              <w:t xml:space="preserve">ביקורת</w:t>
+            </w:r>
+          </w:p>
+        </w:tc>
+        <w:tc>
+          <w:tcPr>
+            <w:tcW w:type="dxa" w:w="1500"/>
+            <w:tcMar>
+              <w:top w:type="dxa" w:w="50"/>
+              <w:left w:type="dxa" w:w="80"/>
+              <w:bottom w:type="dxa" w:w="50"/>
+              <w:right w:type="dxa" w:w="80"/>
+            </w:tcMar>
+          </w:tcPr>
+          <w:p>
+            <w:pPr>
+              <w:bidi/>
+              <w:spacing w:after="0" w:line="260"/>
+              <w:jc w:val="center"/>
+            </w:pPr>
+            <w:r>
+              <w:rPr>
+                <w:rFonts w:ascii="David" w:cs="David" w:eastAsia="David" w:hAnsi="David"/>
+                <w:b w:val="false"/>
+                <w:bCs w:val="false"/>
+                <w:i w:val="false"/>
+                <w:iCs w:val="false"/>
+                <w:color w:val="000000"/>
+                <w:sz w:val="24"/>
+                <w:szCs w:val="24"/>
+                <w:rtl/>
+              </w:rPr>
+              <w:t xml:space="preserve">11</w:t>
+            </w:r>
+          </w:p>
+        </w:tc>
+        <w:tc>
+          <w:tcPr>
+            <w:tcW w:type="dxa" w:w="2100"/>
+            <w:tcMar>
+              <w:top w:type="dxa" w:w="50"/>
+              <w:left w:type="dxa" w:w="80"/>
+              <w:bottom w:type="dxa" w:w="50"/>
+              <w:right w:type="dxa" w:w="80"/>
+            </w:tcMar>
+          </w:tcPr>
+          <w:p>
+            <w:pPr>
+              <w:bidi/>
+              <w:spacing w:after="0" w:line="260"/>
+              <w:jc w:val="center"/>
+            </w:pPr>
+            <w:r>
+              <w:rPr>
+                <w:rFonts w:ascii="David" w:cs="David" w:eastAsia="David" w:hAnsi="David"/>
+                <w:b w:val="false"/>
+                <w:bCs w:val="false"/>
+                <w:i w:val="false"/>
+                <w:iCs w:val="false"/>
+                <w:color w:val="000000"/>
+                <w:sz w:val="24"/>
+                <w:szCs w:val="24"/>
+                <w:rtl/>
+              </w:rPr>
+              <w:t xml:space="preserve">6.10</w:t>
+            </w:r>
+          </w:p>
+        </w:tc>
+        <w:tc>
+          <w:tcPr>
+            <w:tcW w:type="dxa" w:w="2100"/>
+            <w:tcMar>
+              <w:top w:type="dxa" w:w="50"/>
+              <w:left w:type="dxa" w:w="80"/>
+              <w:bottom w:type="dxa" w:w="50"/>
+              <w:right w:type="dxa" w:w="80"/>
+            </w:tcMar>
+          </w:tcPr>
+          <w:p>
+            <w:pPr>
+              <w:bidi/>
+              <w:spacing w:after="0" w:line="260"/>
+              <w:jc w:val="center"/>
+            </w:pPr>
+            <w:r>
+              <w:rPr>
+                <w:rFonts w:ascii="David" w:cs="David" w:eastAsia="David" w:hAnsi="David"/>
+                <w:b w:val="false"/>
+                <w:bCs w:val="false"/>
+                <w:i w:val="false"/>
+                <w:iCs w:val="false"/>
+                <w:color w:val="000000"/>
+                <w:sz w:val="24"/>
+                <w:szCs w:val="24"/>
+                <w:rtl/>
+              </w:rPr>
+              <w:t xml:space="preserve">0.78</w:t>
+            </w:r>
+          </w:p>
+        </w:tc>
+      </w:tr>
+    </w:tbl>
+    <w:p>
+      <w:pPr>
+        <w:bidi/>
+        <w:spacing w:after="160" w:before="80" w:line="360"/>
+        <w:jc w:val="both"/>
+      </w:pPr>
+      <w:r>
+        <w:rPr>
+          <w:rFonts w:ascii="David" w:cs="David" w:eastAsia="David" w:hAnsi="David"/>
+          <w:b w:val="false"/>
+          <w:bCs w:val="false"/>
+          <w:i w:val="false"/>
+          <w:iCs w:val="false"/>
+          <w:color w:val="000000"/>
+          <w:sz w:val="24"/>
+          <w:szCs w:val="24"/>
+          <w:rtl/>
+        </w:rPr>
+        <w:t xml:space="preserve">ניתוח שונות חד-גורמי בין נבדקים העלה גם עבור מדד זה הבדל מובהק בין הקבוצות, F(2,30)=3.69, p=.037, η²=.20. מבחני המשך בשיטת Tukey HSD הראו שקבוצת חוויית השליטה (M=6.98, SD=0.76) דיווחה על תחושת מסוגלות גבוהה יותר באופן מובהק מקבוצת הביקורת (M=6.10, SD=0.78), p=.034, בעוד שקבוצת החשיפה העקיפה (M=6.55, SD=0.74) לא נבדלה מהביקורת באופן מובהק (p=.32). גודל האפקט במדד זה היה מעט קטן יותר מזה שנמצא בחוללות העצמית הכללית.</w:t>
+      </w:r>
+    </w:p>
+    <w:p>
       <w:r>
         <w:br w:type="page"/>
       </w:r>
@@ -1622,7 +2320,7 @@
           <w:szCs w:val="24"/>
           <w:rtl/>
         </w:rPr>
-        <w:t xml:space="preserve">מטרת המחקר הנוכחי הייתה לבחון את השפעתם של שני מקורות החוללות המרכזיים, חוויית שליטה וחשיפה עקיפה, על תחושת החוללות העצמית הכללית. ההשערה אוששה באופן חלקי. קבוצת חוויית השליטה דיווחה על החוללות הגבוהה ביותר ונבדלה באופן מובהק מקבוצת הביקורת, בעוד שקבוצת החשיפה העקיפה נמצאה בתווך אך לא נבדלה מהביקורת באופן מובהק.</w:t>
+        <w:t xml:space="preserve">מטרת המחקר הנוכחי הייתה לבחון את השפעתם של שני מקורות החוללות המרכזיים, חוויית שליטה וחשיפה עקיפה, על תחושת המסוגלות של סטודנטים בהכשרה להוראה, בשני מדדים: חוללות עצמית כללית ותחושת המסוגלות של המורה. ההשערה אוששה באופן חלקי בשני המדדים. בשניהם קבוצת חוויית השליטה דיווחה על המסוגלות הגבוהה ביותר ונבדלה באופן מובהק מקבוצת הביקורת, בעוד שקבוצת החשיפה העקיפה נמצאה בתווך אך לא נבדלה מהביקורת באופן מובהק. עם זאת, גודל האפקט בתחושת המסוגלות של המורה היה מעט קטן יותר מזה שנמצא בחוללות הכללית.</w:t>
       </w:r>
     </w:p>
     <w:p>
@@ -1643,7 +2341,7 @@
           <w:szCs w:val="24"/>
           <w:rtl/>
         </w:rPr>
-        <w:t xml:space="preserve">הממצא שלפיו היזכרות בהצלחה אישית העלתה את תחושת החוללות עולה בקנה אחד עם הטענה של בנדורה, שלפיה חוויות שליטה הן המקור החזק ביותר לחוללות עצמית (Bandura, 1997). התוצאה גם מתיישבת עם ממצאים לפיהם תחושת המסוגלות ניתנת לחיזוק ומשפיעה על מוטיבציה ועל הישגים (שאנק, 2001; Basileo et al., 2024).</w:t>
+        <w:t xml:space="preserve">הממצא שלפיו היזכרות בהצלחה אישית העלתה את תחושת המסוגלות, בשני המדדים, עולה בקנה אחד עם הטענה של בנדורה, שלפיה חוויות שליטה הן המקור החזק ביותר לחוללות עצמית (Bandura, 1997). התוצאה גם מתיישבת עם ממצאים לפיהם תחושת המסוגלות ניתנת לחיזוק ומשפיעה על מוטיבציה ועל הישגים (שאנק, 2001; Basileo et al., 2024). העובדה שהאפקט על תחושת המסוגלות של המורה היה מעט חלש יותר מתיישבת עם התפיסה שמסוגלות ספציפית לתחום ההוראה מעוגנת יותר בהתנסות ההוראה עצמה, ולכן פחות רגישה לאינדוקציה קצרה וכללית (Tschannen-Moran &amp; Woolfolk Hoy, 2001).</w:t>
       </w:r>
     </w:p>
     <w:p>
@@ -2066,6 +2764,43 @@
           <w:szCs w:val="24"/>
         </w:rPr>
         <w:t xml:space="preserve">(5), 439-457. https://doi.org/10.3200/JRLP.139.5.439-457</w:t>
+      </w:r>
+    </w:p>
+    <w:p>
+      <w:pPr>
+        <w:spacing w:after="140" w:line="360"/>
+        <w:ind w:left="720" w:hanging="720"/>
+        <w:jc w:val="left"/>
+      </w:pPr>
+      <w:r>
+        <w:rPr>
+          <w:rFonts w:ascii="David" w:cs="David" w:eastAsia="David" w:hAnsi="David"/>
+          <w:i w:val="false"/>
+          <w:iCs w:val="false"/>
+          <w:sz w:val="24"/>
+          <w:szCs w:val="24"/>
+        </w:rPr>
+        <w:t xml:space="preserve">Tschannen-Moran, M., &amp; Woolfolk Hoy, A. (2001). Teacher efficacy: Capturing an elusive construct. </w:t>
+      </w:r>
+      <w:r>
+        <w:rPr>
+          <w:rFonts w:ascii="David" w:cs="David" w:eastAsia="David" w:hAnsi="David"/>
+          <w:i/>
+          <w:iCs/>
+          <w:sz w:val="24"/>
+          <w:szCs w:val="24"/>
+        </w:rPr>
+        <w:t xml:space="preserve">Teaching and Teacher Education, 17</w:t>
+      </w:r>
+      <w:r>
+        <w:rPr>
+          <w:rFonts w:ascii="David" w:cs="David" w:eastAsia="David" w:hAnsi="David"/>
+          <w:i w:val="false"/>
+          <w:iCs w:val="false"/>
+          <w:sz w:val="24"/>
+          <w:szCs w:val="24"/>
+        </w:rPr>
+        <w:t xml:space="preserve">(7), 783-805. https://doi.org/10.1016/S0742-051X(01)00036-1</w:t>
       </w:r>
     </w:p>
     <w:p>
@@ -4259,6 +4994,450 @@
         </w:tc>
       </w:tr>
     </w:tbl>
+    <w:p>
+      <w:r>
+        <w:br w:type="page"/>
+      </w:r>
+    </w:p>
+    <w:p>
+      <w:pPr>
+        <w:pStyle w:val="Heading2"/>
+        <w:bidi/>
+        <w:spacing w:after="100" w:before="180"/>
+        <w:jc w:val="right"/>
+      </w:pPr>
+      <w:r>
+        <w:rPr>
+          <w:rFonts w:ascii="David" w:cs="David" w:eastAsia="David" w:hAnsi="David"/>
+          <w:b/>
+          <w:bCs/>
+          <w:i w:val="false"/>
+          <w:iCs w:val="false"/>
+          <w:color w:val="000000"/>
+          <w:sz w:val="26"/>
+          <w:szCs w:val="26"/>
+          <w:rtl/>
+        </w:rPr>
+        <w:t xml:space="preserve">נספח 4 - שאלון תחושת המסוגלות של המורה (TSES; Tschannen-Moran &amp; Woolfolk Hoy, 2001)</w:t>
+      </w:r>
+    </w:p>
+    <w:p>
+      <w:pPr>
+        <w:bidi/>
+        <w:spacing w:after="160" w:before="0" w:line="360"/>
+        <w:jc w:val="both"/>
+      </w:pPr>
+      <w:r>
+        <w:rPr>
+          <w:rFonts w:ascii="David" w:cs="David" w:eastAsia="David" w:hAnsi="David"/>
+          <w:b w:val="false"/>
+          <w:bCs w:val="false"/>
+          <w:i w:val="false"/>
+          <w:iCs w:val="false"/>
+          <w:color w:val="000000"/>
+          <w:sz w:val="24"/>
+          <w:szCs w:val="24"/>
+          <w:rtl/>
+        </w:rPr>
+        <w:t xml:space="preserve">לכל היגד סמן/י את המספר המתאר עד כמה את/ה מסוגל/ת לעשות זאת, בסולם שבין 1 (כלל לא) ל-9 (במידה רבה מאוד).</w:t>
+      </w:r>
+    </w:p>
+    <w:p>
+      <w:pPr>
+        <w:bidi/>
+        <w:spacing w:after="100" w:before="0" w:line="360"/>
+        <w:jc w:val="both"/>
+      </w:pPr>
+      <w:r>
+        <w:rPr>
+          <w:rFonts w:ascii="David" w:cs="David" w:eastAsia="David" w:hAnsi="David"/>
+          <w:b w:val="false"/>
+          <w:bCs w:val="false"/>
+          <w:i/>
+          <w:iCs/>
+          <w:color w:val="000000"/>
+          <w:sz w:val="24"/>
+          <w:szCs w:val="24"/>
+          <w:rtl/>
+        </w:rPr>
+        <w:t xml:space="preserve">סולם התשובות: 1 = כלל לא, 3 = במידה מועטה, 5 = במידה מסוימת, 7 = במידה רבה, 9 = במידה רבה מאוד.</w:t>
+      </w:r>
+    </w:p>
+    <w:p>
+      <w:pPr>
+        <w:bidi/>
+        <w:spacing w:after="60" w:before="0" w:line="360"/>
+        <w:jc w:val="both"/>
+      </w:pPr>
+      <w:r>
+        <w:rPr>
+          <w:rFonts w:ascii="David" w:cs="David" w:eastAsia="David" w:hAnsi="David"/>
+          <w:b/>
+          <w:bCs/>
+          <w:i w:val="false"/>
+          <w:iCs w:val="false"/>
+          <w:color w:val="000000"/>
+          <w:sz w:val="24"/>
+          <w:szCs w:val="24"/>
+          <w:rtl/>
+        </w:rPr>
+        <w:t xml:space="preserve">מעורבות תלמידים</w:t>
+      </w:r>
+    </w:p>
+    <w:p>
+      <w:pPr>
+        <w:pStyle w:val="ListParagraph"/>
+        <w:numPr>
+          <w:ilvl w:val="0"/>
+          <w:numId w:val="2"/>
+        </w:numPr>
+        <w:bidi/>
+        <w:spacing w:after="70" w:line="360"/>
+        <w:jc w:val="right"/>
+      </w:pPr>
+      <w:r>
+        <w:rPr>
+          <w:rFonts w:ascii="David" w:cs="David" w:eastAsia="David" w:hAnsi="David"/>
+          <w:b w:val="false"/>
+          <w:bCs w:val="false"/>
+          <w:i w:val="false"/>
+          <w:iCs w:val="false"/>
+          <w:color w:val="000000"/>
+          <w:sz w:val="24"/>
+          <w:szCs w:val="24"/>
+          <w:rtl/>
+        </w:rPr>
+        <w:t xml:space="preserve">עד כמה תוכל/י לגרום לתלמידים שאינם מגלים עניין בלימודים להתעניין בהם?        1  2  3  4  5  6  7  8  9</w:t>
+      </w:r>
+    </w:p>
+    <w:p>
+      <w:pPr>
+        <w:pStyle w:val="ListParagraph"/>
+        <w:numPr>
+          <w:ilvl w:val="0"/>
+          <w:numId w:val="2"/>
+        </w:numPr>
+        <w:bidi/>
+        <w:spacing w:after="70" w:line="360"/>
+        <w:jc w:val="right"/>
+      </w:pPr>
+      <w:r>
+        <w:rPr>
+          <w:rFonts w:ascii="David" w:cs="David" w:eastAsia="David" w:hAnsi="David"/>
+          <w:b w:val="false"/>
+          <w:bCs w:val="false"/>
+          <w:i w:val="false"/>
+          <w:iCs w:val="false"/>
+          <w:color w:val="000000"/>
+          <w:sz w:val="24"/>
+          <w:szCs w:val="24"/>
+          <w:rtl/>
+        </w:rPr>
+        <w:t xml:space="preserve">עד כמה תוכל/י לגרום לתלמידים להאמין שהם מסוגלים להצליח בלימודים?        1  2  3  4  5  6  7  8  9</w:t>
+      </w:r>
+    </w:p>
+    <w:p>
+      <w:pPr>
+        <w:pStyle w:val="ListParagraph"/>
+        <w:numPr>
+          <w:ilvl w:val="0"/>
+          <w:numId w:val="2"/>
+        </w:numPr>
+        <w:bidi/>
+        <w:spacing w:after="70" w:line="360"/>
+        <w:jc w:val="right"/>
+      </w:pPr>
+      <w:r>
+        <w:rPr>
+          <w:rFonts w:ascii="David" w:cs="David" w:eastAsia="David" w:hAnsi="David"/>
+          <w:b w:val="false"/>
+          <w:bCs w:val="false"/>
+          <w:i w:val="false"/>
+          <w:iCs w:val="false"/>
+          <w:color w:val="000000"/>
+          <w:sz w:val="24"/>
+          <w:szCs w:val="24"/>
+          <w:rtl/>
+        </w:rPr>
+        <w:t xml:space="preserve">עד כמה תוכל/י לעזור לתלמידים להעריך את הלמידה?        1  2  3  4  5  6  7  8  9</w:t>
+      </w:r>
+    </w:p>
+    <w:p>
+      <w:pPr>
+        <w:pStyle w:val="ListParagraph"/>
+        <w:numPr>
+          <w:ilvl w:val="0"/>
+          <w:numId w:val="2"/>
+        </w:numPr>
+        <w:bidi/>
+        <w:spacing w:after="70" w:line="360"/>
+        <w:jc w:val="right"/>
+      </w:pPr>
+      <w:r>
+        <w:rPr>
+          <w:rFonts w:ascii="David" w:cs="David" w:eastAsia="David" w:hAnsi="David"/>
+          <w:b w:val="false"/>
+          <w:bCs w:val="false"/>
+          <w:i w:val="false"/>
+          <w:iCs w:val="false"/>
+          <w:color w:val="000000"/>
+          <w:sz w:val="24"/>
+          <w:szCs w:val="24"/>
+          <w:rtl/>
+        </w:rPr>
+        <w:t xml:space="preserve">עד כמה תוכל/י לסייע למשפחות בעזרה לילדיהן להצליח בלימודים?        1  2  3  4  5  6  7  8  9</w:t>
+      </w:r>
+    </w:p>
+    <w:p>
+      <w:pPr>
+        <w:bidi/>
+        <w:spacing w:after="60" w:before="80" w:line="360"/>
+        <w:jc w:val="both"/>
+      </w:pPr>
+      <w:r>
+        <w:rPr>
+          <w:rFonts w:ascii="David" w:cs="David" w:eastAsia="David" w:hAnsi="David"/>
+          <w:b/>
+          <w:bCs/>
+          <w:i w:val="false"/>
+          <w:iCs w:val="false"/>
+          <w:color w:val="000000"/>
+          <w:sz w:val="24"/>
+          <w:szCs w:val="24"/>
+          <w:rtl/>
+        </w:rPr>
+        <w:t xml:space="preserve">אסטרטגיות הוראה</w:t>
+      </w:r>
+    </w:p>
+    <w:p>
+      <w:pPr>
+        <w:pStyle w:val="ListParagraph"/>
+        <w:numPr>
+          <w:ilvl w:val="0"/>
+          <w:numId w:val="2"/>
+        </w:numPr>
+        <w:bidi/>
+        <w:spacing w:after="70" w:line="360"/>
+        <w:jc w:val="right"/>
+      </w:pPr>
+      <w:r>
+        <w:rPr>
+          <w:rFonts w:ascii="David" w:cs="David" w:eastAsia="David" w:hAnsi="David"/>
+          <w:b w:val="false"/>
+          <w:bCs w:val="false"/>
+          <w:i w:val="false"/>
+          <w:iCs w:val="false"/>
+          <w:color w:val="000000"/>
+          <w:sz w:val="24"/>
+          <w:szCs w:val="24"/>
+          <w:rtl/>
+        </w:rPr>
+        <w:t xml:space="preserve">עד כמה תוכל/י לנסח שאלות טובות עבור תלמידיך?        1  2  3  4  5  6  7  8  9</w:t>
+      </w:r>
+    </w:p>
+    <w:p>
+      <w:pPr>
+        <w:pStyle w:val="ListParagraph"/>
+        <w:numPr>
+          <w:ilvl w:val="0"/>
+          <w:numId w:val="2"/>
+        </w:numPr>
+        <w:bidi/>
+        <w:spacing w:after="70" w:line="360"/>
+        <w:jc w:val="right"/>
+      </w:pPr>
+      <w:r>
+        <w:rPr>
+          <w:rFonts w:ascii="David" w:cs="David" w:eastAsia="David" w:hAnsi="David"/>
+          <w:b w:val="false"/>
+          <w:bCs w:val="false"/>
+          <w:i w:val="false"/>
+          <w:iCs w:val="false"/>
+          <w:color w:val="000000"/>
+          <w:sz w:val="24"/>
+          <w:szCs w:val="24"/>
+          <w:rtl/>
+        </w:rPr>
+        <w:t xml:space="preserve">באיזו מידה תוכל/י להשתמש במגוון דרכי הערכה?        1  2  3  4  5  6  7  8  9</w:t>
+      </w:r>
+    </w:p>
+    <w:p>
+      <w:pPr>
+        <w:pStyle w:val="ListParagraph"/>
+        <w:numPr>
+          <w:ilvl w:val="0"/>
+          <w:numId w:val="2"/>
+        </w:numPr>
+        <w:bidi/>
+        <w:spacing w:after="70" w:line="360"/>
+        <w:jc w:val="right"/>
+      </w:pPr>
+      <w:r>
+        <w:rPr>
+          <w:rFonts w:ascii="David" w:cs="David" w:eastAsia="David" w:hAnsi="David"/>
+          <w:b w:val="false"/>
+          <w:bCs w:val="false"/>
+          <w:i w:val="false"/>
+          <w:iCs w:val="false"/>
+          <w:color w:val="000000"/>
+          <w:sz w:val="24"/>
+          <w:szCs w:val="24"/>
+          <w:rtl/>
+        </w:rPr>
+        <w:t xml:space="preserve">עד כמה תוכל/י לספק הסבר חלופי או דוגמה נוספת כאשר תלמידים מתקשים להבין?        1  2  3  4  5  6  7  8  9</w:t>
+      </w:r>
+    </w:p>
+    <w:p>
+      <w:pPr>
+        <w:pStyle w:val="ListParagraph"/>
+        <w:numPr>
+          <w:ilvl w:val="0"/>
+          <w:numId w:val="2"/>
+        </w:numPr>
+        <w:bidi/>
+        <w:spacing w:after="70" w:line="360"/>
+        <w:jc w:val="right"/>
+      </w:pPr>
+      <w:r>
+        <w:rPr>
+          <w:rFonts w:ascii="David" w:cs="David" w:eastAsia="David" w:hAnsi="David"/>
+          <w:b w:val="false"/>
+          <w:bCs w:val="false"/>
+          <w:i w:val="false"/>
+          <w:iCs w:val="false"/>
+          <w:color w:val="000000"/>
+          <w:sz w:val="24"/>
+          <w:szCs w:val="24"/>
+          <w:rtl/>
+        </w:rPr>
+        <w:t xml:space="preserve">באיזו מידה תוכל/י ליישם דרכי הוראה חלופיות בכיתתך?        1  2  3  4  5  6  7  8  9</w:t>
+      </w:r>
+    </w:p>
+    <w:p>
+      <w:pPr>
+        <w:bidi/>
+        <w:spacing w:after="60" w:before="80" w:line="360"/>
+        <w:jc w:val="both"/>
+      </w:pPr>
+      <w:r>
+        <w:rPr>
+          <w:rFonts w:ascii="David" w:cs="David" w:eastAsia="David" w:hAnsi="David"/>
+          <w:b/>
+          <w:bCs/>
+          <w:i w:val="false"/>
+          <w:iCs w:val="false"/>
+          <w:color w:val="000000"/>
+          <w:sz w:val="24"/>
+          <w:szCs w:val="24"/>
+          <w:rtl/>
+        </w:rPr>
+        <w:t xml:space="preserve">ניהול כיתה</w:t>
+      </w:r>
+    </w:p>
+    <w:p>
+      <w:pPr>
+        <w:pStyle w:val="ListParagraph"/>
+        <w:numPr>
+          <w:ilvl w:val="0"/>
+          <w:numId w:val="2"/>
+        </w:numPr>
+        <w:bidi/>
+        <w:spacing w:after="70" w:line="360"/>
+        <w:jc w:val="right"/>
+      </w:pPr>
+      <w:r>
+        <w:rPr>
+          <w:rFonts w:ascii="David" w:cs="David" w:eastAsia="David" w:hAnsi="David"/>
+          <w:b w:val="false"/>
+          <w:bCs w:val="false"/>
+          <w:i w:val="false"/>
+          <w:iCs w:val="false"/>
+          <w:color w:val="000000"/>
+          <w:sz w:val="24"/>
+          <w:szCs w:val="24"/>
+          <w:rtl/>
+        </w:rPr>
+        <w:t xml:space="preserve">עד כמה תוכל/י לשלוט בהתנהגות משבשת בכיתה?        1  2  3  4  5  6  7  8  9</w:t>
+      </w:r>
+    </w:p>
+    <w:p>
+      <w:pPr>
+        <w:pStyle w:val="ListParagraph"/>
+        <w:numPr>
+          <w:ilvl w:val="0"/>
+          <w:numId w:val="2"/>
+        </w:numPr>
+        <w:bidi/>
+        <w:spacing w:after="70" w:line="360"/>
+        <w:jc w:val="right"/>
+      </w:pPr>
+      <w:r>
+        <w:rPr>
+          <w:rFonts w:ascii="David" w:cs="David" w:eastAsia="David" w:hAnsi="David"/>
+          <w:b w:val="false"/>
+          <w:bCs w:val="false"/>
+          <w:i w:val="false"/>
+          <w:iCs w:val="false"/>
+          <w:color w:val="000000"/>
+          <w:sz w:val="24"/>
+          <w:szCs w:val="24"/>
+          <w:rtl/>
+        </w:rPr>
+        <w:t xml:space="preserve">עד כמה תוכל/י לגרום לתלמידים לציית לכללי הכיתה?        1  2  3  4  5  6  7  8  9</w:t>
+      </w:r>
+    </w:p>
+    <w:p>
+      <w:pPr>
+        <w:pStyle w:val="ListParagraph"/>
+        <w:numPr>
+          <w:ilvl w:val="0"/>
+          <w:numId w:val="2"/>
+        </w:numPr>
+        <w:bidi/>
+        <w:spacing w:after="70" w:line="360"/>
+        <w:jc w:val="right"/>
+      </w:pPr>
+      <w:r>
+        <w:rPr>
+          <w:rFonts w:ascii="David" w:cs="David" w:eastAsia="David" w:hAnsi="David"/>
+          <w:b w:val="false"/>
+          <w:bCs w:val="false"/>
+          <w:i w:val="false"/>
+          <w:iCs w:val="false"/>
+          <w:color w:val="000000"/>
+          <w:sz w:val="24"/>
+          <w:szCs w:val="24"/>
+          <w:rtl/>
+        </w:rPr>
+        <w:t xml:space="preserve">עד כמה תוכל/י להרגיע תלמיד/ה משבש/ת או רועש/ת?        1  2  3  4  5  6  7  8  9</w:t>
+      </w:r>
+    </w:p>
+    <w:p>
+      <w:pPr>
+        <w:pStyle w:val="ListParagraph"/>
+        <w:numPr>
+          <w:ilvl w:val="0"/>
+          <w:numId w:val="2"/>
+        </w:numPr>
+        <w:bidi/>
+        <w:spacing w:after="70" w:line="360"/>
+        <w:jc w:val="right"/>
+      </w:pPr>
+      <w:r>
+        <w:rPr>
+          <w:rFonts w:ascii="David" w:cs="David" w:eastAsia="David" w:hAnsi="David"/>
+          <w:b w:val="false"/>
+          <w:bCs w:val="false"/>
+          <w:i w:val="false"/>
+          <w:iCs w:val="false"/>
+          <w:color w:val="000000"/>
+          <w:sz w:val="24"/>
+          <w:szCs w:val="24"/>
+          <w:rtl/>
+        </w:rPr>
+        <w:t xml:space="preserve">באיזו מידה תוכל/י לבסס מערכת ניהול כיתה עם כל קבוצת תלמידים?        1  2  3  4  5  6  7  8  9</w:t>
+      </w:r>
+    </w:p>
     <w:sectPr>
       <w:footerReference w:type="default" r:id="rId7"/>
       <w:pgSz w:w="11906" w:h="16838" w:orient="portrait"/>

</xml_diff>

<commit_message>
Expand the results section
- Add a preliminary-analyses subsection (data screening, normality,
  reliability, alpha, significance level).
- Report each DV under its own subheading with full Levene, one-way ANOVA,
  effect-size interpretation (Cohen), and Tukey pairwise mean differences with
  95% confidence intervals.
- Note the TSES pattern across all three subscales and add a second figure
  for teacher self-efficacy.
- Add a Pearson correlation between the two self-efficacy measures.

Co-Authored-By: Claude Opus 4.8 <noreply@anthropic.com>
Claude-Session: https://claude.ai/code/session_01YH1N5dULXnq2hJCrBuBusq
</commit_message>
<xml_diff>
--- a/examples/seminar-psychology-self-efficacy.docx
+++ b/examples/seminar-psychology-self-efficacy.docx
@@ -932,6 +932,28 @@
     </w:p>
     <w:p>
       <w:pPr>
+        <w:pStyle w:val="Heading2"/>
+        <w:bidi/>
+        <w:spacing w:after="100" w:before="180"/>
+        <w:jc w:val="right"/>
+      </w:pPr>
+      <w:r>
+        <w:rPr>
+          <w:rFonts w:ascii="David" w:cs="David" w:eastAsia="David" w:hAnsi="David"/>
+          <w:b/>
+          <w:bCs/>
+          <w:i w:val="false"/>
+          <w:iCs w:val="false"/>
+          <w:color w:val="000000"/>
+          <w:sz w:val="26"/>
+          <w:szCs w:val="26"/>
+          <w:rtl/>
+        </w:rPr>
+        <w:t xml:space="preserve">ניתוחים מקדימים</w:t>
+      </w:r>
+    </w:p>
+    <w:p>
+      <w:pPr>
         <w:bidi/>
         <w:spacing w:after="160" w:before="0" w:line="360"/>
         <w:jc w:val="both"/>
@@ -948,7 +970,50 @@
           <w:szCs w:val="24"/>
           <w:rtl/>
         </w:rPr>
-        <w:t xml:space="preserve">ציון החוללות העצמית חושב כממוצע שמונת ההיגדים בשאלון עבור כל נבדק. משתתפי קבוצת חוויית השליטה קודדו כ-1, משתתפי קבוצת החשיפה העקיפה כ-2, ומשתתפי קבוצת הביקורת כ-3. לאחר מכן חושבו ממוצע וסטיית תקן של רמת החוללות בכל קבוצה. הסטטיסטיקה התיאורית מוצגת בטבלה 1.</w:t>
+        <w:t xml:space="preserve">תחילה נבדקו הנתונים לקראת הניתוח. משתתפים שלא השלימו את שני השאלונים לא נכללו במדגם הסופי, ולכן לא נותרו נתונים חסרים. התפלגות הציונים בשני המדדים נבחנה, וערכי הצידוד (skewness) והגבנוניות (kurtosis) נמצאו בטווח המקובל (בין 1- ל-1), כך שהונחה התפלגות נורמלית מספקת לשימוש במבחנים פרמטריים. מהימנות שני השאלונים, כפי שדווחה בפרק הכלים, הייתה גבוהה (NGSE: α=.87; TSES: α=.91). כל הניתוחים בוצעו בתוכנת SPSS, ורמת המובהקות נקבעה על α=.05.</w:t>
+      </w:r>
+    </w:p>
+    <w:p>
+      <w:pPr>
+        <w:pStyle w:val="Heading2"/>
+        <w:bidi/>
+        <w:spacing w:after="100" w:before="180"/>
+        <w:jc w:val="right"/>
+      </w:pPr>
+      <w:r>
+        <w:rPr>
+          <w:rFonts w:ascii="David" w:cs="David" w:eastAsia="David" w:hAnsi="David"/>
+          <w:b/>
+          <w:bCs/>
+          <w:i w:val="false"/>
+          <w:iCs w:val="false"/>
+          <w:color w:val="000000"/>
+          <w:sz w:val="26"/>
+          <w:szCs w:val="26"/>
+          <w:rtl/>
+        </w:rPr>
+        <w:t xml:space="preserve">חוללות עצמית כללית (NGSE)</w:t>
+      </w:r>
+    </w:p>
+    <w:p>
+      <w:pPr>
+        <w:bidi/>
+        <w:spacing w:after="160" w:before="0" w:line="360"/>
+        <w:jc w:val="both"/>
+      </w:pPr>
+      <w:r>
+        <w:rPr>
+          <w:rFonts w:ascii="David" w:cs="David" w:eastAsia="David" w:hAnsi="David"/>
+          <w:b w:val="false"/>
+          <w:bCs w:val="false"/>
+          <w:i w:val="false"/>
+          <w:iCs w:val="false"/>
+          <w:color w:val="000000"/>
+          <w:sz w:val="24"/>
+          <w:szCs w:val="24"/>
+          <w:rtl/>
+        </w:rPr>
+        <w:t xml:space="preserve">ציון החוללות העצמית הכללית חושב כממוצע שמונת ההיגדים בשאלון עבור כל נבדק. משתתפי קבוצת חוויית השליטה קודדו כ-1, משתתפי קבוצת החשיפה העקיפה כ-2, ומשתתפי קבוצת הביקורת כ-3. ממוצעים וסטיות תקן של רמת החוללות בכל קבוצה מוצגים בטבלה 1.</w:t>
       </w:r>
     </w:p>
     <w:p>
@@ -983,7 +1048,7 @@
           <w:szCs w:val="24"/>
           <w:rtl/>
         </w:rPr>
-        <w:t xml:space="preserve">: ממוצעים וסטיות תקן של רמת החוללות העצמית בקבוצות המחקר</w:t>
+        <w:t xml:space="preserve">: ממוצעים וסטיות תקן של רמת החוללות העצמית הכללית בקבוצות המחקר</w:t>
       </w:r>
     </w:p>
     <w:tbl>
@@ -1548,7 +1613,7 @@
           <w:szCs w:val="24"/>
           <w:rtl/>
         </w:rPr>
-        <w:t xml:space="preserve">הנחת שוויון השונויות נבדקה במבחן Levene ולא הופרה (p=.71). על מנת לבדוק את השערת המחקר בוצע ניתוח שונות חד-גורמי בין נבדקים (One-Way ANOVA). נמצא הבדל מובהק בין הקבוצות ברמת החוללות העצמית, F(2,30)=5.18, p=.012, η²=.26, כלומר גודל אפקט גדול.</w:t>
+        <w:t xml:space="preserve">בטרם ניתוח השונות נבדקה הנחת שוויון השונויות באמצעות מבחן Levene, שלא נמצא מובהק, F(2,30)=0.34, p=.71, ולכן ההנחה לא הופרה. לבחינת השערת המחקר בוצע ניתוח שונות חד-גורמי בין נבדקים (One-Way ANOVA), שהעלה הבדל מובהק בין שלוש הקבוצות ברמת החוללות העצמית, F(2,30)=5.18, p=.012. גודל האפקט, אטא בריבוע, היה η²=.26, המצביע על אפקט גדול על-פי אמות המידה של כהן, שלפיהן ערך של η²=.14 נחשב גדול.</w:t>
       </w:r>
     </w:p>
     <w:p>
@@ -1569,7 +1634,7 @@
           <w:szCs w:val="24"/>
           <w:rtl/>
         </w:rPr>
-        <w:t xml:space="preserve">מבחני המשך בשיטת Tukey HSD הראו שקבוצת חוויית השליטה (M=4.05, SD=0.57) דיווחה על חוללות גבוהה יותר באופן מובהק מקבוצת הביקורת (M=3.30, SD=0.55), בהפרש של 0.75 (p=.008). לעומת זאת, קבוצת החשיפה העקיפה (M=3.70, SD=0.52) לא נבדלה מקבוצת הביקורת באופן מובהק (p=.21), וגם ההפרש בינה לבין קבוצת חוויית השליטה לא הגיע למובהקות (p=.30). ממצאים אלו מוצגים גם באיור 1.</w:t>
+        <w:t xml:space="preserve">לבחינת מקור ההבדלים בוצעו השוואות מרובות בשיטת Tukey HSD. נמצא כי קבוצת חוויית השליטה (M=4.05, SD=0.57) דיווחה על חוללות גבוהה יותר מקבוצת הביקורת (M=3.30, SD=0.55), בהפרש ממוצעים של 0.75, הפרש שהיה מובהק (p=.008, 95% CI [0.17, 1.33]). לעומת זאת, ההפרש בין קבוצת החשיפה העקיפה (M=3.70, SD=0.52) לבין קבוצת הביקורת, שעמד על 0.40, לא הגיע למובהקות (p=.21, 95% CI [-0.18, 0.98]), וכך גם ההפרש בין חוויית השליטה לחשיפה העקיפה, שעמד על 0.35 (p=.30, 95% CI [-0.23, 0.93]). ממצאים אלו מוצגים באיור 1.</w:t>
       </w:r>
     </w:p>
     <w:p>
@@ -1581,7 +1646,7 @@
       <w:r>
         <w:drawing>
           <wp:inline distT="0" distB="0" distL="0" distR="0">
-            <wp:extent cx="4000500" cy="2971800"/>
+            <wp:extent cx="3905250" cy="2895600"/>
             <wp:effectExtent t="0" r="0" b="0" l="0"/>
             <wp:docPr id="1" name="" descr="" title=""/>
             <wp:cNvGraphicFramePr>
@@ -1606,7 +1671,7 @@
                   <pic:spPr bwMode="auto">
                     <a:xfrm>
                       <a:off x="0" y="0"/>
-                      <a:ext cx="4000500" cy="2971800"/>
+                      <a:ext cx="3905250" cy="2895600"/>
                     </a:xfrm>
                     <a:prstGeom prst="rect">
                       <a:avLst/>
@@ -1651,13 +1716,35 @@
           <w:szCs w:val="24"/>
           <w:rtl/>
         </w:rPr>
-        <w:t xml:space="preserve">: ממוצעי החוללות העצמית לפי קבוצה. קווי השגיאה מייצגים רווח סמך של 95%.</w:t>
-      </w:r>
-    </w:p>
-    <w:p>
-      <w:pPr>
-        <w:bidi/>
-        <w:spacing w:after="160" w:before="40" w:line="360"/>
+        <w:t xml:space="preserve">: ממוצעי החוללות העצמית הכללית לפי קבוצה. קווי השגיאה מייצגים רווח סמך של 95%.</w:t>
+      </w:r>
+    </w:p>
+    <w:p>
+      <w:pPr>
+        <w:pStyle w:val="Heading2"/>
+        <w:bidi/>
+        <w:spacing w:after="100" w:before="180"/>
+        <w:jc w:val="right"/>
+      </w:pPr>
+      <w:r>
+        <w:rPr>
+          <w:rFonts w:ascii="David" w:cs="David" w:eastAsia="David" w:hAnsi="David"/>
+          <w:b/>
+          <w:bCs/>
+          <w:i w:val="false"/>
+          <w:iCs w:val="false"/>
+          <w:color w:val="000000"/>
+          <w:sz w:val="26"/>
+          <w:szCs w:val="26"/>
+          <w:rtl/>
+        </w:rPr>
+        <w:t xml:space="preserve">תחושת המסוגלות של המורה (TSES)</w:t>
+      </w:r>
+    </w:p>
+    <w:p>
+      <w:pPr>
+        <w:bidi/>
+        <w:spacing w:after="160" w:before="0" w:line="360"/>
         <w:jc w:val="both"/>
       </w:pPr>
       <w:r>
@@ -1672,7 +1759,7 @@
           <w:szCs w:val="24"/>
           <w:rtl/>
         </w:rPr>
-        <w:t xml:space="preserve">בשלב הבא נבחנה השפעת המניפולציה על תחושת המסוגלות של המורה (TSES), שחושבה כממוצע שנים-עשר ההיגדים. הסטטיסטיקה התיאורית מוצגת בטבלה 2. גם כאן עלה הממוצע מקבוצת הביקורת, דרך החשיפה העקיפה, ועד חוויית השליטה.</w:t>
+        <w:t xml:space="preserve">תחושת המסוגלות של המורה חושבה כממוצע שנים-עשר ההיגדים בשאלון. ממוצעים וסטיות תקן בכל קבוצה מוצגים בטבלה 2, ומהם עולה כי הממוצע עלה בהדרגה מקבוצת הביקורת, דרך החשיפה העקיפה, ועד חוויית השליטה.</w:t>
       </w:r>
     </w:p>
     <w:p>
@@ -2272,7 +2359,153 @@
           <w:szCs w:val="24"/>
           <w:rtl/>
         </w:rPr>
-        <w:t xml:space="preserve">ניתוח שונות חד-גורמי בין נבדקים העלה גם עבור מדד זה הבדל מובהק בין הקבוצות, F(2,30)=3.69, p=.037, η²=.20. מבחני המשך בשיטת Tukey HSD הראו שקבוצת חוויית השליטה (M=6.98, SD=0.76) דיווחה על תחושת מסוגלות גבוהה יותר באופן מובהק מקבוצת הביקורת (M=6.10, SD=0.78), p=.034, בעוד שקבוצת החשיפה העקיפה (M=6.55, SD=0.74) לא נבדלה מהביקורת באופן מובהק (p=.32). גודל האפקט במדד זה היה מעט קטן יותר מזה שנמצא בחוללות העצמית הכללית.</w:t>
+        <w:t xml:space="preserve">גם עבור מדד זה לא הופרה הנחת שוויון השונויות (Levene: F(2,30)=0.47, p=.63). ניתוח שונות חד-גורמי בין נבדקים העלה הבדל מובהק בין הקבוצות בתחושת המסוגלות של המורה, F(2,30)=3.69, p=.037, η²=.20, גודל אפקט בינוני עד גדול.</w:t>
+      </w:r>
+    </w:p>
+    <w:p>
+      <w:pPr>
+        <w:bidi/>
+        <w:spacing w:after="160" w:before="0" w:line="360"/>
+        <w:jc w:val="both"/>
+      </w:pPr>
+      <w:r>
+        <w:rPr>
+          <w:rFonts w:ascii="David" w:cs="David" w:eastAsia="David" w:hAnsi="David"/>
+          <w:b w:val="false"/>
+          <w:bCs w:val="false"/>
+          <w:i w:val="false"/>
+          <w:iCs w:val="false"/>
+          <w:color w:val="000000"/>
+          <w:sz w:val="24"/>
+          <w:szCs w:val="24"/>
+          <w:rtl/>
+        </w:rPr>
+        <w:t xml:space="preserve">השוואות Tukey HSD הראו שקבוצת חוויית השליטה (M=6.98, SD=0.76) דיווחה על תחושת מסוגלות גבוהה יותר מקבוצת הביקורת (M=6.10, SD=0.78), בהפרש של 0.88 שהיה מובהק (p=.034, 95% CI [0.08, 1.68]). ההפרש בין קבוצת החשיפה העקיפה (M=6.55, SD=0.74) לבין הביקורת, שעמד על 0.45, לא היה מובהק (p=.32), וגם ההפרש בין חוויית השליטה לחשיפה העקיפה, שעמד על 0.43, לא הגיע למובהקות (p=.35). דפוס דומה, של עלייה מן הביקורת אל חוויית השליטה, נמצא בכל שלושת תת-הסולמות של השאלון (מעורבות תלמידים, אסטרטגיות הוראה וניהול כיתה), והבולט שבהם היה בתת-הסולם של אסטרטגיות ההוראה. ממצאי מדד זה מוצגים באיור 2.</w:t>
+      </w:r>
+    </w:p>
+    <w:p>
+      <w:pPr>
+        <w:bidi/>
+        <w:spacing w:after="60" w:before="120"/>
+        <w:jc w:val="center"/>
+      </w:pPr>
+      <w:r>
+        <w:drawing>
+          <wp:inline distT="0" distB="0" distL="0" distR="0">
+            <wp:extent cx="3905250" cy="2895600"/>
+            <wp:effectExtent t="0" r="0" b="0" l="0"/>
+            <wp:docPr id="1" name="" descr="" title=""/>
+            <wp:cNvGraphicFramePr>
+              <a:graphicFrameLocks xmlns:a="http://schemas.openxmlformats.org/drawingml/2006/main" noChangeAspect="1"/>
+            </wp:cNvGraphicFramePr>
+            <a:graphic xmlns:a="http://schemas.openxmlformats.org/drawingml/2006/main">
+              <a:graphicData uri="http://schemas.openxmlformats.org/drawingml/2006/picture">
+                <pic:pic xmlns:pic="http://schemas.openxmlformats.org/drawingml/2006/picture">
+                  <pic:nvPicPr>
+                    <pic:cNvPr id="0" name="" descr=""/>
+                    <pic:cNvPicPr>
+                      <a:picLocks noChangeAspect="1" noChangeArrowheads="1"/>
+                    </pic:cNvPicPr>
+                  </pic:nvPicPr>
+                  <pic:blipFill>
+                    <a:blip r:embed="rId9" cstate="none"/>
+                    <a:srcRect/>
+                    <a:stretch>
+                      <a:fillRect/>
+                    </a:stretch>
+                  </pic:blipFill>
+                  <pic:spPr bwMode="auto">
+                    <a:xfrm>
+                      <a:off x="0" y="0"/>
+                      <a:ext cx="3905250" cy="2895600"/>
+                    </a:xfrm>
+                    <a:prstGeom prst="rect">
+                      <a:avLst/>
+                    </a:prstGeom>
+                  </pic:spPr>
+                </pic:pic>
+              </a:graphicData>
+            </a:graphic>
+          </wp:inline>
+        </w:drawing>
+      </w:r>
+    </w:p>
+    <w:p>
+      <w:pPr>
+        <w:bidi/>
+        <w:spacing w:after="160"/>
+        <w:jc w:val="center"/>
+      </w:pPr>
+      <w:r>
+        <w:rPr>
+          <w:rFonts w:ascii="David" w:cs="David" w:eastAsia="David" w:hAnsi="David"/>
+          <w:b/>
+          <w:bCs/>
+          <w:i w:val="false"/>
+          <w:iCs w:val="false"/>
+          <w:color w:val="000000"/>
+          <w:sz w:val="24"/>
+          <w:szCs w:val="24"/>
+          <w:rtl/>
+        </w:rPr>
+        <w:t xml:space="preserve">איור 2</w:t>
+      </w:r>
+      <w:r>
+        <w:rPr>
+          <w:rFonts w:ascii="David" w:cs="David" w:eastAsia="David" w:hAnsi="David"/>
+          <w:b w:val="false"/>
+          <w:bCs w:val="false"/>
+          <w:i w:val="false"/>
+          <w:iCs w:val="false"/>
+          <w:color w:val="000000"/>
+          <w:sz w:val="24"/>
+          <w:szCs w:val="24"/>
+          <w:rtl/>
+        </w:rPr>
+        <w:t xml:space="preserve">: ממוצעי תחושת המסוגלות של המורה לפי קבוצה. קווי השגיאה מייצגים רווח סמך של 95%.</w:t>
+      </w:r>
+    </w:p>
+    <w:p>
+      <w:pPr>
+        <w:pStyle w:val="Heading2"/>
+        <w:bidi/>
+        <w:spacing w:after="100" w:before="180"/>
+        <w:jc w:val="right"/>
+      </w:pPr>
+      <w:r>
+        <w:rPr>
+          <w:rFonts w:ascii="David" w:cs="David" w:eastAsia="David" w:hAnsi="David"/>
+          <w:b/>
+          <w:bCs/>
+          <w:i w:val="false"/>
+          <w:iCs w:val="false"/>
+          <w:color w:val="000000"/>
+          <w:sz w:val="26"/>
+          <w:szCs w:val="26"/>
+          <w:rtl/>
+        </w:rPr>
+        <w:t xml:space="preserve">הקשר בין שני מדדי המסוגלות</w:t>
+      </w:r>
+    </w:p>
+    <w:p>
+      <w:pPr>
+        <w:bidi/>
+        <w:spacing w:after="160" w:before="0" w:line="360"/>
+        <w:jc w:val="both"/>
+      </w:pPr>
+      <w:r>
+        <w:rPr>
+          <w:rFonts w:ascii="David" w:cs="David" w:eastAsia="David" w:hAnsi="David"/>
+          <w:b w:val="false"/>
+          <w:bCs w:val="false"/>
+          <w:i w:val="false"/>
+          <w:iCs w:val="false"/>
+          <w:color w:val="000000"/>
+          <w:sz w:val="24"/>
+          <w:szCs w:val="24"/>
+          <w:rtl/>
+        </w:rPr>
+        <w:t xml:space="preserve">לבסוף נבחן הקשר בין שני מדדי המסוגלות באמצעות מתאם פירסון. נמצא מתאם חיובי בינוני-גבוה בין החוללות העצמית הכללית לבין תחושת המסוגלות של המורה, r(31)=.52, p=.002, כך שככל שתחושת החוללות הכללית של המשתתף גבוהה יותר, כך נטתה להיות גבוהה יותר גם תחושת המסוגלות שלו בהקשר ההוראה. מתאם זה עולה בקנה אחד עם התפיסה שמסוגלות עצמית כללית מהווה בסיס למסוגלות ספציפית לתחום.</w:t>
       </w:r>
     </w:p>
     <w:p>

</xml_diff>

<commit_message>
Cite each questionnaire's source in its appendix
Add a source/psychometric paragraph to appendices 3 (NGSE) and 4 (TSES) with
the developing article and reliability, and note the manipulation is grounded
in Bandura's (1997) sources of self-efficacy, matching the example format.

Co-Authored-By: Claude Opus 4.8 <noreply@anthropic.com>
Claude-Session: https://claude.ai/code/session_01YH1N5dULXnq2hJCrBuBusq
</commit_message>
<xml_diff>
--- a/examples/seminar-psychology-self-efficacy.docx
+++ b/examples/seminar-psychology-self-efficacy.docx
@@ -3235,6 +3235,41 @@
     <w:p>
       <w:pPr>
         <w:bidi/>
+        <w:spacing w:after="100" w:before="0" w:line="360"/>
+        <w:jc w:val="both"/>
+      </w:pPr>
+      <w:r>
+        <w:rPr>
+          <w:rFonts w:ascii="David" w:cs="David" w:eastAsia="David" w:hAnsi="David"/>
+          <w:b/>
+          <w:bCs/>
+          <w:i w:val="false"/>
+          <w:iCs w:val="false"/>
+          <w:color w:val="000000"/>
+          <w:sz w:val="24"/>
+          <w:szCs w:val="24"/>
+          <w:rtl/>
+        </w:rPr>
+        <w:t xml:space="preserve">בסיס המניפולציה: </w:t>
+      </w:r>
+      <w:r>
+        <w:rPr>
+          <w:rFonts w:ascii="David" w:cs="David" w:eastAsia="David" w:hAnsi="David"/>
+          <w:b w:val="false"/>
+          <w:bCs w:val="false"/>
+          <w:i w:val="false"/>
+          <w:iCs w:val="false"/>
+          <w:color w:val="000000"/>
+          <w:sz w:val="24"/>
+          <w:szCs w:val="24"/>
+          <w:rtl/>
+        </w:rPr>
+        <w:t xml:space="preserve">שלוש הרמות מבוססות על תיאוריית בנדורה (Bandura, 1997) בדבר מקורות החוללות העצמית. תנאי הניסוי מפעיל חוויית שליטה (התנסות בהצלחה), תנאי ההשוואה מפעיל חוויה עקיפה (התבוננות במודל מצליח), ותנאי הביקורת נייטרלי.</w:t>
+      </w:r>
+    </w:p>
+    <w:p>
+      <w:pPr>
+        <w:bidi/>
         <w:spacing w:after="160" w:before="0" w:line="360"/>
         <w:jc w:val="both"/>
       </w:pPr>
@@ -5228,6 +5263,92 @@
       </w:tr>
     </w:tbl>
     <w:p>
+      <w:pPr>
+        <w:bidi/>
+        <w:spacing w:after="160" w:before="120" w:line="360"/>
+        <w:jc w:val="both"/>
+      </w:pPr>
+      <w:r>
+        <w:rPr>
+          <w:rFonts w:ascii="David" w:cs="David" w:eastAsia="David" w:hAnsi="David"/>
+          <w:b/>
+          <w:bCs/>
+          <w:i w:val="false"/>
+          <w:iCs w:val="false"/>
+          <w:color w:val="000000"/>
+          <w:sz w:val="24"/>
+          <w:szCs w:val="24"/>
+          <w:rtl/>
+        </w:rPr>
+        <w:t xml:space="preserve">על השאלון ומקורו: </w:t>
+      </w:r>
+      <w:r>
+        <w:rPr>
+          <w:rFonts w:ascii="David" w:cs="David" w:eastAsia="David" w:hAnsi="David"/>
+          <w:b w:val="false"/>
+          <w:bCs w:val="false"/>
+          <w:i w:val="false"/>
+          <w:iCs w:val="false"/>
+          <w:color w:val="000000"/>
+          <w:sz w:val="24"/>
+          <w:szCs w:val="24"/>
+          <w:rtl/>
+        </w:rPr>
+        <w:t xml:space="preserve">שאלון החוללות העצמית הכללית (New General Self-Efficacy Scale) פותח ותוקף על ידי צ'ן, גאלי ואדן (Chen, Gully, &amp; Eden, 2001), מתוך ביקורת על כלים קודמים למדידת חוללות כללית. השאלון כולל שמונה היגדים המדורגים בסולם ליקרט בן חמש דרגות, וציון החוללות מחושב כממוצע הפריטים. במחקרי התיקוף נמצאה עקיבות פנימית גבוהה (α בין .85 ל-.90), ובמחקר הנוכחי נמצאה מהימנות של α=.87.</w:t>
+      </w:r>
+    </w:p>
+    <w:p>
+      <w:pPr>
+        <w:bidi/>
+        <w:spacing w:after="160" w:before="0" w:line="360"/>
+        <w:jc w:val="both"/>
+      </w:pPr>
+      <w:r>
+        <w:rPr>
+          <w:rFonts w:ascii="David" w:cs="David" w:eastAsia="David" w:hAnsi="David"/>
+          <w:b/>
+          <w:bCs/>
+          <w:i w:val="false"/>
+          <w:iCs w:val="false"/>
+          <w:color w:val="000000"/>
+          <w:sz w:val="24"/>
+          <w:szCs w:val="24"/>
+          <w:rtl/>
+        </w:rPr>
+        <w:t xml:space="preserve">מקור: </w:t>
+      </w:r>
+      <w:r>
+        <w:rPr>
+          <w:rFonts w:ascii="David" w:cs="David" w:eastAsia="David" w:hAnsi="David"/>
+          <w:i w:val="false"/>
+          <w:iCs w:val="false"/>
+          <w:sz w:val="24"/>
+          <w:szCs w:val="24"/>
+        </w:rPr>
+        <w:t xml:space="preserve">Chen, G., Gully, S. M., &amp; Eden, D. (2001). Validation of a new general self-efficacy scale. </w:t>
+      </w:r>
+      <w:r>
+        <w:rPr>
+          <w:rFonts w:ascii="David" w:cs="David" w:eastAsia="David" w:hAnsi="David"/>
+          <w:i/>
+          <w:iCs/>
+          <w:sz w:val="24"/>
+          <w:szCs w:val="24"/>
+        </w:rPr>
+        <w:t xml:space="preserve">Organizational Research Methods, 4</w:t>
+      </w:r>
+      <w:r>
+        <w:rPr>
+          <w:rFonts w:ascii="David" w:cs="David" w:eastAsia="David" w:hAnsi="David"/>
+          <w:i w:val="false"/>
+          <w:iCs w:val="false"/>
+          <w:sz w:val="24"/>
+          <w:szCs w:val="24"/>
+        </w:rPr>
+        <w:t xml:space="preserve">(1), 62-83.</w:t>
+      </w:r>
+    </w:p>
+    <w:p>
       <w:r>
         <w:br w:type="page"/>
       </w:r>
@@ -5669,6 +5790,92 @@
           <w:rtl/>
         </w:rPr>
         <w:t xml:space="preserve">באיזו מידה תוכל/י לבסס מערכת ניהול כיתה עם כל קבוצת תלמידים?        1  2  3  4  5  6  7  8  9</w:t>
+      </w:r>
+    </w:p>
+    <w:p>
+      <w:pPr>
+        <w:bidi/>
+        <w:spacing w:after="160" w:before="120" w:line="360"/>
+        <w:jc w:val="both"/>
+      </w:pPr>
+      <w:r>
+        <w:rPr>
+          <w:rFonts w:ascii="David" w:cs="David" w:eastAsia="David" w:hAnsi="David"/>
+          <w:b/>
+          <w:bCs/>
+          <w:i w:val="false"/>
+          <w:iCs w:val="false"/>
+          <w:color w:val="000000"/>
+          <w:sz w:val="24"/>
+          <w:szCs w:val="24"/>
+          <w:rtl/>
+        </w:rPr>
+        <w:t xml:space="preserve">על השאלון ומקורו: </w:t>
+      </w:r>
+      <w:r>
+        <w:rPr>
+          <w:rFonts w:ascii="David" w:cs="David" w:eastAsia="David" w:hAnsi="David"/>
+          <w:b w:val="false"/>
+          <w:bCs w:val="false"/>
+          <w:i w:val="false"/>
+          <w:iCs w:val="false"/>
+          <w:color w:val="000000"/>
+          <w:sz w:val="24"/>
+          <w:szCs w:val="24"/>
+          <w:rtl/>
+        </w:rPr>
+        <w:t xml:space="preserve">שאלון תחושת המסוגלות של המורה (Teachers' Sense of Efficacy Scale) פותח על ידי טשאנן-מורן ו-וולפוק הוי (Tschannen-Moran &amp; Woolfolk Hoy, 2001), ומעוגן בתיאוריה החברתית-קוגניטיבית של בנדורה. הגרסה הקצרה כוללת שנים-עשר היגדים בשלושה תת-סולמות: מעורבות תלמידים, אסטרטגיות הוראה וניהול כיתה, המדורגים בסולם בן תשע דרגות. הכלי הפך למדד הנפוץ ביותר לתחושת המסוגלות של מורים ומתאים גם לסטודנטים בהכשרה להוראה. במחקר הנוכחי נמצאה מהימנות של α=.91.</w:t>
+      </w:r>
+    </w:p>
+    <w:p>
+      <w:pPr>
+        <w:bidi/>
+        <w:spacing w:after="160" w:before="0" w:line="360"/>
+        <w:jc w:val="both"/>
+      </w:pPr>
+      <w:r>
+        <w:rPr>
+          <w:rFonts w:ascii="David" w:cs="David" w:eastAsia="David" w:hAnsi="David"/>
+          <w:b/>
+          <w:bCs/>
+          <w:i w:val="false"/>
+          <w:iCs w:val="false"/>
+          <w:color w:val="000000"/>
+          <w:sz w:val="24"/>
+          <w:szCs w:val="24"/>
+          <w:rtl/>
+        </w:rPr>
+        <w:t xml:space="preserve">מקור: </w:t>
+      </w:r>
+      <w:r>
+        <w:rPr>
+          <w:rFonts w:ascii="David" w:cs="David" w:eastAsia="David" w:hAnsi="David"/>
+          <w:i w:val="false"/>
+          <w:iCs w:val="false"/>
+          <w:sz w:val="24"/>
+          <w:szCs w:val="24"/>
+        </w:rPr>
+        <w:t xml:space="preserve">Tschannen-Moran, M., &amp; Woolfolk Hoy, A. (2001). Teacher efficacy: Capturing an elusive construct. </w:t>
+      </w:r>
+      <w:r>
+        <w:rPr>
+          <w:rFonts w:ascii="David" w:cs="David" w:eastAsia="David" w:hAnsi="David"/>
+          <w:i/>
+          <w:iCs/>
+          <w:sz w:val="24"/>
+          <w:szCs w:val="24"/>
+        </w:rPr>
+        <w:t xml:space="preserve">Teaching and Teacher Education, 17</w:t>
+      </w:r>
+      <w:r>
+        <w:rPr>
+          <w:rFonts w:ascii="David" w:cs="David" w:eastAsia="David" w:hAnsi="David"/>
+          <w:i w:val="false"/>
+          <w:iCs w:val="false"/>
+          <w:sz w:val="24"/>
+          <w:szCs w:val="24"/>
+        </w:rPr>
+        <w:t xml:space="preserve">(7), 783-805.</w:t>
       </w:r>
     </w:p>
     <w:sectPr>

</xml_diff>

<commit_message>
Ground the manipulation in an empirical article
Base the mastery (recall-success) manipulation on Abdulla & Woods (2025),
an open-access empirical study showing that recalling success raises
self-efficacy and expectations, cited in the tools section, appendix 2, and
the bibliography (alongside Bandura's theory).

Co-Authored-By: Claude Opus 4.8 <noreply@anthropic.com>
Claude-Session: https://claude.ai/code/session_01YH1N5dULXnq2hJCrBuBusq
</commit_message>
<xml_diff>
--- a/examples/seminar-psychology-self-efficacy.docx
+++ b/examples/seminar-psychology-self-efficacy.docx
@@ -787,7 +787,7 @@
           <w:szCs w:val="24"/>
           <w:rtl/>
         </w:rPr>
-        <w:t xml:space="preserve">המניפולציה כללה שלושה תנאים. בתנאי הניסוי (חוויית שליטה) התבקשו המשתתפים להיזכר ולתאר בכתב, במשך כארבע דקות, אירוע מן העבר שבו התמודדו עם משימה מאתגרת והצליחו בה בזכות מאמץ. בתנאי ההשוואה (חשיפה עקיפה) קראו המשתתפים עדות קצרה בגוף ראשון של סטודנט שהתמודד בהצלחה עם אתגר לימודי, והתבקשו להרהר בה. בתנאי הביקורת התבקשו המשתתפים לתאר בכתב את מסלול ההגעה היומי שלהם אל מקום הלימודים, משימה נייטרלית שאינה קשורה למסוגלות (ראו נספח 2).</w:t>
+        <w:t xml:space="preserve">המניפולציה עוצבה על בסיס פרדיגמת ההיזכרות בהצלחה (recall success), שנמצאה במחקר אמפירי כמעלה את תחושת המסוגלות ואת הציפיות להצלחה עתידית (Abdulla &amp; Woods, 2025), ועל בסיס מקורות החוללות של בנדורה (1997). המניפולציה כללה שלושה תנאים. בתנאי הניסוי (חוויית שליטה) התבקשו המשתתפים להיזכר ולתאר בכתב, במשך כארבע דקות, אירוע מן העבר שבו התמודדו עם משימה מאתגרת והצליחו בה בזכות מאמץ. בתנאי ההשוואה (חשיפה עקיפה) קראו המשתתפים עדות קצרה בגוף ראשון של סטודנט שהתמודד בהצלחה עם אתגר לימודי, והתבקשו להרהר בה. בתנאי הביקורת התבקשו המשתתפים לתאר בכתב את מסלול ההגעה היומי שלהם אל מקום הלימודים, משימה נייטרלית שאינה קשורה למסוגלות (ראו נספח 2).</w:t>
       </w:r>
     </w:p>
     <w:p>
@@ -2828,6 +2828,43 @@
           <w:sz w:val="24"/>
           <w:szCs w:val="24"/>
         </w:rPr>
+        <w:t xml:space="preserve">Abdulla, A., &amp; Woods, R. (2025). “I did it before, so I can do it again(?)”: Recalling success, expectations of future success and the impact of ease-of-retrieval and attributions. </w:t>
+      </w:r>
+      <w:r>
+        <w:rPr>
+          <w:rFonts w:ascii="David" w:cs="David" w:eastAsia="David" w:hAnsi="David"/>
+          <w:i/>
+          <w:iCs/>
+          <w:sz w:val="24"/>
+          <w:szCs w:val="24"/>
+        </w:rPr>
+        <w:t xml:space="preserve">Psychological Research</w:t>
+      </w:r>
+      <w:r>
+        <w:rPr>
+          <w:rFonts w:ascii="David" w:cs="David" w:eastAsia="David" w:hAnsi="David"/>
+          <w:i w:val="false"/>
+          <w:iCs w:val="false"/>
+          <w:sz w:val="24"/>
+          <w:szCs w:val="24"/>
+        </w:rPr>
+        <w:t xml:space="preserve">. https://doi.org/10.1007/s00426-025-02136-x</w:t>
+      </w:r>
+    </w:p>
+    <w:p>
+      <w:pPr>
+        <w:spacing w:after="140" w:line="360"/>
+        <w:ind w:left="720" w:hanging="720"/>
+        <w:jc w:val="left"/>
+      </w:pPr>
+      <w:r>
+        <w:rPr>
+          <w:rFonts w:ascii="David" w:cs="David" w:eastAsia="David" w:hAnsi="David"/>
+          <w:i w:val="false"/>
+          <w:iCs w:val="false"/>
+          <w:sz w:val="24"/>
+          <w:szCs w:val="24"/>
+        </w:rPr>
         <w:t xml:space="preserve">Bandura, A. (1977). Self-efficacy: Toward a unifying theory of behavioral change. </w:t>
       </w:r>
       <w:r>
@@ -3264,7 +3301,7 @@
           <w:szCs w:val="24"/>
           <w:rtl/>
         </w:rPr>
-        <w:t xml:space="preserve">שלוש הרמות מבוססות על תיאוריית בנדורה (Bandura, 1997) בדבר מקורות החוללות העצמית. תנאי הניסוי מפעיל חוויית שליטה (התנסות בהצלחה), תנאי ההשוואה מפעיל חוויה עקיפה (התבוננות במודל מצליח), ותנאי הביקורת נייטרלי.</w:t>
+        <w:t xml:space="preserve">שלוש הרמות מבוססות על תיאוריית בנדורה (Bandura, 1997) בדבר מקורות החוללות העצמית. תנאי הניסוי מפעיל חוויית שליטה (התנסות בהצלחה), תנאי ההשוואה מפעיל חוויה עקיפה (התבוננות במודל מצליח), ותנאי הביקורת נייטרלי. תנאי חוויית השליטה מתבסס גם על פרדיגמת ההיזכרות בהצלחה, שהוכחה אמפירית כמעלה תחושת מסוגלות וציפיות להצלחה (Abdulla &amp; Woods, 2025).</w:t>
       </w:r>
     </w:p>
     <w:p>

</xml_diff>

<commit_message>
Correct the characterization of Abdulla & Woods (2025)
The article shows recall-success effects on expectancy are mixed and
moderated by ease-of-retrieval and attributions (in the attraction domain),
not that recall reliably raises self-efficacy. Fix the method and appendix 2
wording, keep Bandura (1997) as the manipulation's basis, cite the article
accurately as a nuance in the discussion, and complete the reference.

Co-Authored-By: Claude Opus 4.8 <noreply@anthropic.com>
Claude-Session: https://claude.ai/code/session_01YH1N5dULXnq2hJCrBuBusq
</commit_message>
<xml_diff>
--- a/examples/seminar-psychology-self-efficacy.docx
+++ b/examples/seminar-psychology-self-efficacy.docx
@@ -787,7 +787,7 @@
           <w:szCs w:val="24"/>
           <w:rtl/>
         </w:rPr>
-        <w:t xml:space="preserve">המניפולציה עוצבה על בסיס פרדיגמת ההיזכרות בהצלחה (recall success), שנמצאה במחקר אמפירי כמעלה את תחושת המסוגלות ואת הציפיות להצלחה עתידית (Abdulla &amp; Woods, 2025), ועל בסיס מקורות החוללות של בנדורה (1997). המניפולציה כללה שלושה תנאים. בתנאי הניסוי (חוויית שליטה) התבקשו המשתתפים להיזכר ולתאר בכתב, במשך כארבע דקות, אירוע מן העבר שבו התמודדו עם משימה מאתגרת והצליחו בה בזכות מאמץ. בתנאי ההשוואה (חשיפה עקיפה) קראו המשתתפים עדות קצרה בגוף ראשון של סטודנט שהתמודד בהצלחה עם אתגר לימודי, והתבקשו להרהר בה. בתנאי הביקורת התבקשו המשתתפים לתאר בכתב את מסלול ההגעה היומי שלהם אל מקום הלימודים, משימה נייטרלית שאינה קשורה למסוגלות (ראו נספח 2).</w:t>
+        <w:t xml:space="preserve">המניפולציה עוצבה על בסיס מקורות החוללות של בנדורה (1997), ובפרט חוויות השליטה והחוויות העקיפות, וכן על בסיס פרדיגמת ההיזכרות בהצלחה (recall success) שנחקרה כאמצעי להעלאת ציפיות להצלחה. יש לציין כי השפעת ההיזכרות אינה אוטומטית ונמצאה תלויה בגורמים כמו קלות שליפת ההצלחה וייחוסה לגורמים יציבים (Abdulla &amp; Woods, 2025). המניפולציה כללה שלושה תנאים. בתנאי הניסוי (חוויית שליטה) התבקשו המשתתפים להיזכר ולתאר בכתב, במשך כארבע דקות, אירוע מן העבר שבו התמודדו עם משימה מאתגרת והצליחו בה בזכות מאמץ. בתנאי ההשוואה (חשיפה עקיפה) קראו המשתתפים עדות קצרה בגוף ראשון של סטודנט שהתמודד בהצלחה עם אתגר לימודי, והתבקשו להרהר בה. בתנאי הביקורת התבקשו המשתתפים לתאר בכתב את מסלול ההגעה היומי שלהם אל מקום הלימודים, משימה נייטרלית שאינה קשורה למסוגלות (ראו נספח 2).</w:t>
       </w:r>
     </w:p>
     <w:p>
@@ -2616,6 +2616,27 @@
           <w:szCs w:val="24"/>
           <w:rtl/>
         </w:rPr>
+        <w:t xml:space="preserve">חשוב לציין שגם השפעתה של ההיזכרות בהצלחה אינה מובטחת. עבודתם של אבדולה ווודס (Abdulla &amp; Woods, 2025) מראה כי אפקט ההיזכרות על הציפיות תלוי בקלות שבה נשלפת ההצלחה מהזיכרון ובאופן שבו היא מיוחסת, ולכן ייתכן שחלק מהמשתתפים בתנאי חוויית השליטה הפיקו מהמניפולציה יותר מאחרים. שילוב של מבחן מניפולציה ושל מדדים למשתנים אלה במחקרי המשך יוכל להבהיר נקודה זו.</w:t>
+      </w:r>
+    </w:p>
+    <w:p>
+      <w:pPr>
+        <w:bidi/>
+        <w:spacing w:after="160" w:before="0" w:line="360"/>
+        <w:jc w:val="both"/>
+      </w:pPr>
+      <w:r>
+        <w:rPr>
+          <w:rFonts w:ascii="David" w:cs="David" w:eastAsia="David" w:hAnsi="David"/>
+          <w:b w:val="false"/>
+          <w:bCs w:val="false"/>
+          <w:i w:val="false"/>
+          <w:iCs w:val="false"/>
+          <w:color w:val="000000"/>
+          <w:sz w:val="24"/>
+          <w:szCs w:val="24"/>
+          <w:rtl/>
+        </w:rPr>
         <w:t xml:space="preserve">למחקר כמה מגבלות. ראשית, מדובר במדגם נוחות קטן (N=33) המורכב מסטודנטים בהכשרה להוראה בלבד, ולכן ההכללה לאוכלוסייה הרחבה מוגבלת והעוצמה הסטטיסטית נמוכה. שנית, המחקר נשען על דיווח עצמי, שחשוף להטיית רצייה חברתית. שלישית, לא נמדדה רמת החוללות לפני המניפולציה, כך שההשוואה בין-נבדקית בלבד. רביעית, לא נכלל מבחן מניפולציה שיוודא שהמשימות אכן הפעילו את התהליכים המיועדים, והמדידה נגעה להשפעה מיידית ומצבית בלבד.</w:t>
       </w:r>
     </w:p>
@@ -2838,17 +2859,17 @@
           <w:sz w:val="24"/>
           <w:szCs w:val="24"/>
         </w:rPr>
-        <w:t xml:space="preserve">Psychological Research</w:t>
-      </w:r>
-      <w:r>
-        <w:rPr>
-          <w:rFonts w:ascii="David" w:cs="David" w:eastAsia="David" w:hAnsi="David"/>
-          <w:i w:val="false"/>
-          <w:iCs w:val="false"/>
-          <w:sz w:val="24"/>
-          <w:szCs w:val="24"/>
-        </w:rPr>
-        <w:t xml:space="preserve">. https://doi.org/10.1007/s00426-025-02136-x</w:t>
+        <w:t xml:space="preserve">Psychological Research, 89</w:t>
+      </w:r>
+      <w:r>
+        <w:rPr>
+          <w:rFonts w:ascii="David" w:cs="David" w:eastAsia="David" w:hAnsi="David"/>
+          <w:i w:val="false"/>
+          <w:iCs w:val="false"/>
+          <w:sz w:val="24"/>
+          <w:szCs w:val="24"/>
+        </w:rPr>
+        <w:t xml:space="preserve">, Article 117. https://doi.org/10.1007/s00426-025-02136-x</w:t>
       </w:r>
     </w:p>
     <w:p>
@@ -3301,7 +3322,7 @@
           <w:szCs w:val="24"/>
           <w:rtl/>
         </w:rPr>
-        <w:t xml:space="preserve">שלוש הרמות מבוססות על תיאוריית בנדורה (Bandura, 1997) בדבר מקורות החוללות העצמית. תנאי הניסוי מפעיל חוויית שליטה (התנסות בהצלחה), תנאי ההשוואה מפעיל חוויה עקיפה (התבוננות במודל מצליח), ותנאי הביקורת נייטרלי. תנאי חוויית השליטה מתבסס גם על פרדיגמת ההיזכרות בהצלחה, שהוכחה אמפירית כמעלה תחושת מסוגלות וציפיות להצלחה (Abdulla &amp; Woods, 2025).</w:t>
+        <w:t xml:space="preserve">שלוש הרמות מבוססות על תיאוריית בנדורה (Bandura, 1997) בדבר מקורות החוללות העצמית. תנאי הניסוי מפעיל חוויית שליטה (התנסות בהצלחה), תנאי ההשוואה מפעיל חוויה עקיפה (התבוננות במודל מצליח), ותנאי הביקורת נייטרלי. תנאי חוויית השליטה נשען גם על פרדיגמת ההיזכרות בהצלחה, שנחקרה כאמצעי להעלאת ציפיות להצלחה, אם כי השפעתה נמצאה מותנית בקלות השליפה ובאופן ייחוס ההצלחה (Abdulla &amp; Woods, 2025).</w:t>
       </w:r>
     </w:p>
     <w:p>

</xml_diff>

<commit_message>
Replace paywalled Bandura (1977) with open-access Artino (2012)
Swap the Bandura (1977) journal citation for Artino (2012), "Academic
self-efficacy," Perspectives on Medical Education (open access, PMC), which
reviews self-efficacy theory and its four sources. Cited in the definition
and four-sources paragraphs. Bandura (1997) book and the instrument sources
(Chen 2001; Tschannen-Moran 2001) remain as required.

Co-Authored-By: Claude Opus 4.8 <noreply@anthropic.com>
Claude-Session: https://claude.ai/code/session_01YH1N5dULXnq2hJCrBuBusq
</commit_message>
<xml_diff>
--- a/examples/seminar-psychology-self-efficacy.docx
+++ b/examples/seminar-psychology-self-efficacy.docx
@@ -331,7 +331,7 @@
           <w:szCs w:val="24"/>
           <w:rtl/>
         </w:rPr>
-        <w:t xml:space="preserve">תחושת החוללות העצמית היא אחד המושגים המרכזיים בפסיכולוגיה של המוטיבציה. היא מתייחסת לאמונת האדם ביכולתו לארגן ולבצע את הפעולות הנדרשות כדי להשיג תוצאה רצויה, ולא להערכה של הכישורים עצמם. אמונה זו משפיעה על המטרות שאדם מציב לעצמו, על המאמץ שהוא משקיע ועל ההתמדה שלו נוכח קשיים, ואנשים בעלי חוללות גבוהה נוטים לפרש מכשולים כאתגר ולא כאיום (Bandura, 1977).</w:t>
+        <w:t xml:space="preserve">תחושת החוללות העצמית היא אחד המושגים המרכזיים בפסיכולוגיה של המוטיבציה. היא מתייחסת לאמונת האדם ביכולתו לארגן ולבצע את הפעולות הנדרשות כדי להשיג תוצאה רצויה, ולא להערכה של הכישורים עצמם. אמונה זו משפיעה על המטרות שאדם מציב לעצמו, על המאמץ שהוא משקיע ועל ההתמדה שלו נוכח קשיים, ואנשים בעלי חוללות גבוהה נוטים לפרש מכשולים כאתגר ולא כאיום (Artino, 2012).</w:t>
       </w:r>
     </w:p>
     <w:p>
@@ -352,7 +352,7 @@
           <w:szCs w:val="24"/>
           <w:rtl/>
         </w:rPr>
-        <w:t xml:space="preserve">על-פי המודל, תחושת החוללות נבנית מארבעה מקורות. הראשון הוא חוויות שליטה, כלומר הצלחות ישירות בביצוע משימות. השני הוא חוויות עקיפות, למידה מתוך התבוננות באחרים דומים שמצליחים. השלישי הוא שכנוע מילולי מהסביבה, והרביעי הוא מצבים גופניים ורגשיים והפרשנות שניתנת להם. מבין הארבעה, חוויות השליטה נחשבות למקור החזק ביותר, מפני שהן מספקות את העדות הישירה והמשכנעת ביותר ליכולת (Bandura, 1997).</w:t>
+        <w:t xml:space="preserve">על-פי המודל, תחושת החוללות נבנית מארבעה מקורות. הראשון הוא חוויות שליטה, כלומר הצלחות ישירות בביצוע משימות. השני הוא חוויות עקיפות, למידה מתוך התבוננות באחרים דומים שמצליחים. השלישי הוא שכנוע מילולי מהסביבה, והרביעי הוא מצבים גופניים ורגשיים והפרשנות שניתנת להם. מבין הארבעה, חוויות השליטה נחשבות למקור החזק ביותר, מפני שהן מספקות את העדות הישירה והמשכנעת ביותר ליכולת (Bandura, 1997; Artino, 2012).</w:t>
       </w:r>
     </w:p>
     <w:p>
@@ -2886,7 +2886,7 @@
           <w:sz w:val="24"/>
           <w:szCs w:val="24"/>
         </w:rPr>
-        <w:t xml:space="preserve">Bandura, A. (1977). Self-efficacy: Toward a unifying theory of behavioral change. </w:t>
+        <w:t xml:space="preserve">Artino, A. R. (2012). Academic self-efficacy: From educational theory to instructional practice. </w:t>
       </w:r>
       <w:r>
         <w:rPr>
@@ -2896,17 +2896,17 @@
           <w:sz w:val="24"/>
           <w:szCs w:val="24"/>
         </w:rPr>
-        <w:t xml:space="preserve">Psychological Review, 84</w:t>
-      </w:r>
-      <w:r>
-        <w:rPr>
-          <w:rFonts w:ascii="David" w:cs="David" w:eastAsia="David" w:hAnsi="David"/>
-          <w:i w:val="false"/>
-          <w:iCs w:val="false"/>
-          <w:sz w:val="24"/>
-          <w:szCs w:val="24"/>
-        </w:rPr>
-        <w:t xml:space="preserve">(2), 191-215. https://doi.org/10.1037/0033-295X.84.2.191</w:t>
+        <w:t xml:space="preserve">Perspectives on Medical Education, 1</w:t>
+      </w:r>
+      <w:r>
+        <w:rPr>
+          <w:rFonts w:ascii="David" w:cs="David" w:eastAsia="David" w:hAnsi="David"/>
+          <w:i w:val="false"/>
+          <w:iCs w:val="false"/>
+          <w:sz w:val="24"/>
+          <w:szCs w:val="24"/>
+        </w:rPr>
+        <w:t xml:space="preserve">(2), 76-85. https://doi.org/10.1007/s40037-012-0012-5</w:t>
       </w:r>
     </w:p>
     <w:p>

</xml_diff>

<commit_message>
Replace paywalled Luszczynska (2005) with open-access Rossi et al. (2025)
Swap the paywalled multicultural-validation citation for Rossi et al. (2025),
an open-access (MDPI, Journal of Clinical Medicine) validation of the Italian
NGSE - the instrument used here. Rewrite the sentence to match its findings
(one-factor structure, good fit, high reliability across 811 participants).

Co-Authored-By: Claude Opus 4.8 <noreply@anthropic.com>
Claude-Session: https://claude.ai/code/session_01YH1N5dULXnq2hJCrBuBusq
</commit_message>
<xml_diff>
--- a/examples/seminar-psychology-self-efficacy.docx
+++ b/examples/seminar-psychology-self-efficacy.docx
@@ -394,7 +394,7 @@
           <w:szCs w:val="24"/>
           <w:rtl/>
         </w:rPr>
-        <w:t xml:space="preserve">מחקרים חוצי-תרבות תמכו בתוקף של המושג והראו כי חוללות עצמית כללית קשורה באופן עקבי לרווחה נפשית, לאופטימיות ולהתמודדות אדפטיבית עם דחק, במגוון מדינות ושפות (Luszczynska, Scholz, &amp; Schwarzer, 2005).</w:t>
+        <w:t xml:space="preserve">מחקרים חוצי-תרבות המשיכו לתמוך בתוקף ובמהימנות של הכלי. כך, תיקוף עדכני של הגרסה האיטלקית של ה-NGSE, שנערך על 811 משתתפים, אישר מבנה חד-גורמי, התאמה טובה של המודל לנתונים ומהימנות גבוהה, וחיזק את יישום השאלון בשפות ובתרבויות שונות (Rossi et al., 2025).</w:t>
       </w:r>
     </w:p>
     <w:p>
@@ -3034,7 +3034,7 @@
           <w:sz w:val="24"/>
           <w:szCs w:val="24"/>
         </w:rPr>
-        <w:t xml:space="preserve">Luszczynska, A., Scholz, U., &amp; Schwarzer, R. (2005). The general self-efficacy scale: Multicultural validation studies. </w:t>
+        <w:t xml:space="preserve">Rossi, A. A., Mannarini, S., Taccini, F., Castelnuovo, G., &amp; Pietrabissa, G. (2025). The Italian version of the New General Self-Efficacy Scale (NGSES): Structural validity, psychometric properties, and measurement invariance. </w:t>
       </w:r>
       <w:r>
         <w:rPr>
@@ -3044,17 +3044,17 @@
           <w:sz w:val="24"/>
           <w:szCs w:val="24"/>
         </w:rPr>
-        <w:t xml:space="preserve">The Journal of Psychology, 139</w:t>
-      </w:r>
-      <w:r>
-        <w:rPr>
-          <w:rFonts w:ascii="David" w:cs="David" w:eastAsia="David" w:hAnsi="David"/>
-          <w:i w:val="false"/>
-          <w:iCs w:val="false"/>
-          <w:sz w:val="24"/>
-          <w:szCs w:val="24"/>
-        </w:rPr>
-        <w:t xml:space="preserve">(5), 439-457. https://doi.org/10.3200/JRLP.139.5.439-457</w:t>
+        <w:t xml:space="preserve">Journal of Clinical Medicine, 14</w:t>
+      </w:r>
+      <w:r>
+        <w:rPr>
+          <w:rFonts w:ascii="David" w:cs="David" w:eastAsia="David" w:hAnsi="David"/>
+          <w:i w:val="false"/>
+          <w:iCs w:val="false"/>
+          <w:sz w:val="24"/>
+          <w:szCs w:val="24"/>
+        </w:rPr>
+        <w:t xml:space="preserve">(6), 1988. https://doi.org/10.3390/jcm14061988</w:t>
       </w:r>
     </w:p>
     <w:p>

</xml_diff>

<commit_message>
Add Peres Academic Center logo to the title page
Embed the institution logo (centered, top of the title page) as provided by
the user, matching the institutional example format.

Co-Authored-By: Claude Opus 4.8 <noreply@anthropic.com>
Claude-Session: https://claude.ai/code/session_01YH1N5dULXnq2hJCrBuBusq
</commit_message>
<xml_diff>
--- a/examples/seminar-psychology-self-efficacy.docx
+++ b/examples/seminar-psychology-self-efficacy.docx
@@ -4,8 +4,49 @@
   <w:body>
     <w:p>
       <w:pPr>
-        <w:spacing w:after="0" w:before="500"/>
-      </w:pPr>
+        <w:spacing w:after="120" w:before="500"/>
+        <w:jc w:val="center"/>
+      </w:pPr>
+      <w:r>
+        <w:drawing>
+          <wp:inline distT="0" distB="0" distL="0" distR="0">
+            <wp:extent cx="1047750" cy="1047750"/>
+            <wp:effectExtent t="0" r="0" b="0" l="0"/>
+            <wp:docPr id="1" name="" descr="" title=""/>
+            <wp:cNvGraphicFramePr>
+              <a:graphicFrameLocks xmlns:a="http://schemas.openxmlformats.org/drawingml/2006/main" noChangeAspect="1"/>
+            </wp:cNvGraphicFramePr>
+            <a:graphic xmlns:a="http://schemas.openxmlformats.org/drawingml/2006/main">
+              <a:graphicData uri="http://schemas.openxmlformats.org/drawingml/2006/picture">
+                <pic:pic xmlns:pic="http://schemas.openxmlformats.org/drawingml/2006/picture">
+                  <pic:nvPicPr>
+                    <pic:cNvPr id="0" name="" descr=""/>
+                    <pic:cNvPicPr>
+                      <a:picLocks noChangeAspect="1" noChangeArrowheads="1"/>
+                    </pic:cNvPicPr>
+                  </pic:nvPicPr>
+                  <pic:blipFill>
+                    <a:blip r:embed="rId8" cstate="none"/>
+                    <a:srcRect/>
+                    <a:stretch>
+                      <a:fillRect/>
+                    </a:stretch>
+                  </pic:blipFill>
+                  <pic:spPr bwMode="auto">
+                    <a:xfrm>
+                      <a:off x="0" y="0"/>
+                      <a:ext cx="1047750" cy="1047750"/>
+                    </a:xfrm>
+                    <a:prstGeom prst="rect">
+                      <a:avLst/>
+                    </a:prstGeom>
+                  </pic:spPr>
+                </pic:pic>
+              </a:graphicData>
+            </a:graphic>
+          </wp:inline>
+        </w:drawing>
+      </w:r>
     </w:p>
     <w:p>
       <w:pPr>
@@ -1662,7 +1703,7 @@
                     </pic:cNvPicPr>
                   </pic:nvPicPr>
                   <pic:blipFill>
-                    <a:blip r:embed="rId8" cstate="none"/>
+                    <a:blip r:embed="rId9" cstate="none"/>
                     <a:srcRect/>
                     <a:stretch>
                       <a:fillRect/>
@@ -2408,7 +2449,7 @@
                     </pic:cNvPicPr>
                   </pic:nvPicPr>
                   <pic:blipFill>
-                    <a:blip r:embed="rId9" cstate="none"/>
+                    <a:blip r:embed="rId10" cstate="none"/>
                     <a:srcRect/>
                     <a:stretch>
                       <a:fillRect/>

</xml_diff>

<commit_message>
Number the hypotheses and add a correlation hypothesis
- State four separate, directional hypotheses (H1-H3 for group comparisons
  across both measures; H4 for the correlation between the two self-efficacy
  measures), matching the reported analyses.
- Update the discussion to state explicitly which hypotheses were and were
  not supported, including H4.

Co-Authored-By: Claude Opus 4.8 <noreply@anthropic.com>
Claude-Session: https://claude.ai/code/session_01YH1N5dULXnq2hJCrBuBusq
</commit_message>
<xml_diff>
--- a/examples/seminar-psychology-self-efficacy.docx
+++ b/examples/seminar-psychology-self-efficacy.docx
@@ -651,22 +651,162 @@
     <w:p>
       <w:pPr>
         <w:bidi/>
+        <w:spacing w:after="80" w:before="0" w:line="360"/>
+        <w:jc w:val="both"/>
+      </w:pPr>
+      <w:r>
+        <w:rPr>
+          <w:rFonts w:ascii="David" w:cs="David" w:eastAsia="David" w:hAnsi="David"/>
+          <w:b w:val="false"/>
+          <w:bCs w:val="false"/>
+          <w:i w:val="false"/>
+          <w:iCs w:val="false"/>
+          <w:color w:val="000000"/>
+          <w:sz w:val="24"/>
+          <w:szCs w:val="24"/>
+          <w:rtl/>
+        </w:rPr>
+        <w:t xml:space="preserve">על סמך הרקע התיאורטי, ובעיקר טענתו של בנדורה כי חוויות שליטה הן המקור החזק ביותר לחוללות עצמית, נוסחו ארבע השערות. שלוש הראשונות מתייחסות לשני מדדי המסוגלות (חוללות עצמית כללית ותחושת המסוגלות של המורה) כאחד:</w:t>
+      </w:r>
+    </w:p>
+    <w:p>
+      <w:pPr>
+        <w:bidi/>
         <w:spacing w:after="160" w:before="0" w:line="360"/>
         <w:jc w:val="both"/>
       </w:pPr>
       <w:r>
         <w:rPr>
           <w:rFonts w:ascii="David" w:cs="David" w:eastAsia="David" w:hAnsi="David"/>
-          <w:b w:val="false"/>
-          <w:bCs w:val="false"/>
-          <w:i w:val="false"/>
-          <w:iCs w:val="false"/>
-          <w:color w:val="000000"/>
-          <w:sz w:val="24"/>
-          <w:szCs w:val="24"/>
-          <w:rtl/>
-        </w:rPr>
-        <w:t xml:space="preserve">בהתאם לטענת בנדורה שחוויות שליטה הן המקור החזק ביותר, השערת המחקר הייתה שבשני המדדים קבוצת חוויית השליטה תדווח על המסוגלות הגבוהה ביותר, שקבוצת החשיפה העקיפה תדווח על מסוגלות גבוהה מן הביקורת אך נמוכה מחוויית השליטה, ושקבוצת הביקורת תדווח על המסוגלות הנמוכה ביותר.</w:t>
+          <w:b/>
+          <w:bCs/>
+          <w:i w:val="false"/>
+          <w:iCs w:val="false"/>
+          <w:color w:val="000000"/>
+          <w:sz w:val="24"/>
+          <w:szCs w:val="24"/>
+          <w:rtl/>
+        </w:rPr>
+        <w:t xml:space="preserve">השערה 1: </w:t>
+      </w:r>
+      <w:r>
+        <w:rPr>
+          <w:rFonts w:ascii="David" w:cs="David" w:eastAsia="David" w:hAnsi="David"/>
+          <w:b w:val="false"/>
+          <w:bCs w:val="false"/>
+          <w:i w:val="false"/>
+          <w:iCs w:val="false"/>
+          <w:color w:val="000000"/>
+          <w:sz w:val="24"/>
+          <w:szCs w:val="24"/>
+          <w:rtl/>
+        </w:rPr>
+        <w:t xml:space="preserve">קבוצת חוויית השליטה תדווח על מסוגלות גבוהה יותר מקבוצת הביקורת.</w:t>
+      </w:r>
+    </w:p>
+    <w:p>
+      <w:pPr>
+        <w:bidi/>
+        <w:spacing w:after="160" w:before="0" w:line="360"/>
+        <w:jc w:val="both"/>
+      </w:pPr>
+      <w:r>
+        <w:rPr>
+          <w:rFonts w:ascii="David" w:cs="David" w:eastAsia="David" w:hAnsi="David"/>
+          <w:b/>
+          <w:bCs/>
+          <w:i w:val="false"/>
+          <w:iCs w:val="false"/>
+          <w:color w:val="000000"/>
+          <w:sz w:val="24"/>
+          <w:szCs w:val="24"/>
+          <w:rtl/>
+        </w:rPr>
+        <w:t xml:space="preserve">השערה 2: </w:t>
+      </w:r>
+      <w:r>
+        <w:rPr>
+          <w:rFonts w:ascii="David" w:cs="David" w:eastAsia="David" w:hAnsi="David"/>
+          <w:b w:val="false"/>
+          <w:bCs w:val="false"/>
+          <w:i w:val="false"/>
+          <w:iCs w:val="false"/>
+          <w:color w:val="000000"/>
+          <w:sz w:val="24"/>
+          <w:szCs w:val="24"/>
+          <w:rtl/>
+        </w:rPr>
+        <w:t xml:space="preserve">קבוצת החשיפה העקיפה תדווח על מסוגלות גבוהה יותר מקבוצת הביקורת.</w:t>
+      </w:r>
+    </w:p>
+    <w:p>
+      <w:pPr>
+        <w:bidi/>
+        <w:spacing w:after="160" w:before="0" w:line="360"/>
+        <w:jc w:val="both"/>
+      </w:pPr>
+      <w:r>
+        <w:rPr>
+          <w:rFonts w:ascii="David" w:cs="David" w:eastAsia="David" w:hAnsi="David"/>
+          <w:b/>
+          <w:bCs/>
+          <w:i w:val="false"/>
+          <w:iCs w:val="false"/>
+          <w:color w:val="000000"/>
+          <w:sz w:val="24"/>
+          <w:szCs w:val="24"/>
+          <w:rtl/>
+        </w:rPr>
+        <w:t xml:space="preserve">השערה 3: </w:t>
+      </w:r>
+      <w:r>
+        <w:rPr>
+          <w:rFonts w:ascii="David" w:cs="David" w:eastAsia="David" w:hAnsi="David"/>
+          <w:b w:val="false"/>
+          <w:bCs w:val="false"/>
+          <w:i w:val="false"/>
+          <w:iCs w:val="false"/>
+          <w:color w:val="000000"/>
+          <w:sz w:val="24"/>
+          <w:szCs w:val="24"/>
+          <w:rtl/>
+        </w:rPr>
+        <w:t xml:space="preserve">קבוצת חוויית השליטה תדווח על מסוגלות גבוהה יותר מקבוצת החשיפה העקיפה.</w:t>
+      </w:r>
+    </w:p>
+    <w:p>
+      <w:pPr>
+        <w:bidi/>
+        <w:spacing w:after="160" w:before="0" w:line="360"/>
+        <w:jc w:val="both"/>
+      </w:pPr>
+      <w:r>
+        <w:rPr>
+          <w:rFonts w:ascii="David" w:cs="David" w:eastAsia="David" w:hAnsi="David"/>
+          <w:b/>
+          <w:bCs/>
+          <w:i w:val="false"/>
+          <w:iCs w:val="false"/>
+          <w:color w:val="000000"/>
+          <w:sz w:val="24"/>
+          <w:szCs w:val="24"/>
+          <w:rtl/>
+        </w:rPr>
+        <w:t xml:space="preserve">השערה 4: </w:t>
+      </w:r>
+      <w:r>
+        <w:rPr>
+          <w:rFonts w:ascii="David" w:cs="David" w:eastAsia="David" w:hAnsi="David"/>
+          <w:b w:val="false"/>
+          <w:bCs w:val="false"/>
+          <w:i w:val="false"/>
+          <w:iCs w:val="false"/>
+          <w:color w:val="000000"/>
+          <w:sz w:val="24"/>
+          <w:szCs w:val="24"/>
+          <w:rtl/>
+        </w:rPr>
+        <w:t xml:space="preserve">יימצא מתאם חיובי בין שני מדדי המסוגלות, כך שככל שהחוללות העצמית הכללית גבוהה יותר, כך תהיה גבוהה יותר גם תחושת המסוגלות של המורה.</w:t>
       </w:r>
     </w:p>
     <w:p>
@@ -2594,7 +2734,7 @@
           <w:szCs w:val="24"/>
           <w:rtl/>
         </w:rPr>
-        <w:t xml:space="preserve">מטרת המחקר הנוכחי הייתה לבחון את השפעתם של שני מקורות החוללות המרכזיים, חוויית שליטה וחשיפה עקיפה, על תחושת המסוגלות של סטודנטים בהכשרה להוראה, בשני מדדים: חוללות עצמית כללית ותחושת המסוגלות של המורה. ההשערה אוששה באופן חלקי בשני המדדים. בשניהם קבוצת חוויית השליטה דיווחה על המסוגלות הגבוהה ביותר ונבדלה באופן מובהק מקבוצת הביקורת, בעוד שקבוצת החשיפה העקיפה נמצאה בתווך אך לא נבדלה מהביקורת באופן מובהק. עם זאת, גודל האפקט בתחושת המסוגלות של המורה היה מעט קטן יותר מזה שנמצא בחוללות הכללית.</w:t>
+        <w:t xml:space="preserve">מטרת המחקר הנוכחי הייתה לבחון את השפעתם של שני מקורות החוללות המרכזיים, חוויית שליטה וחשיפה עקיפה, על תחושת המסוגלות של סטודנטים בהכשרה להוראה, בשני מדדים: חוללות עצמית כללית ותחושת המסוגלות של המורה. תמונת הממצאים חלקית. בשני המדדים אוששה השערה 1, שכן קבוצת חוויית השליטה דיווחה על מסוגלות גבוהה יותר מקבוצת הביקורת באופן מובהק. לעומת זאת, השערות 2 ו-3 לא אוששו: קבוצת החשיפה העקיפה נמצאה בתווך אך לא נבדלה מהביקורת באופן מובהק, וגם ההפרש בינה לבין חוויית השליטה לא הגיע למובהקות. השערה 4 אוששה, ונמצא מתאם חיובי בינוני-גבוה בין שני מדדי המסוגלות. עם זאת, גודל האפקט בתחושת המסוגלות של המורה היה מעט קטן יותר מזה שנמצא בחוללות הכללית.</w:t>
       </w:r>
     </w:p>
     <w:p>

</xml_diff>

<commit_message>
Expand the introduction and discussion per the guidelines
Guidelines expect the intro and discussion to be the most detailed sections.
- Intro: expand the four-sources account into two deeper paragraphs (mastery
  as strongest source and its mechanism; vicarious/persuasion/physiological
  with model-similarity detail).
- Discussion: deepen the interpretation (malleability; general vs
  domain-specific teaching efficacy and the correlation), and add labelled
  subsections for applied implications, limitations, future directions,
  and a summary.

Co-Authored-By: Claude Opus 4.8 <noreply@anthropic.com>
Claude-Session: https://claude.ai/code/session_01YH1N5dULXnq2hJCrBuBusq
</commit_message>
<xml_diff>
--- a/examples/seminar-psychology-self-efficacy.docx
+++ b/examples/seminar-psychology-self-efficacy.docx
@@ -393,7 +393,28 @@
           <w:szCs w:val="24"/>
           <w:rtl/>
         </w:rPr>
-        <w:t xml:space="preserve">על-פי המודל, תחושת החוללות נבנית מארבעה מקורות. הראשון הוא חוויות שליטה, כלומר הצלחות ישירות בביצוע משימות. השני הוא חוויות עקיפות, למידה מתוך התבוננות באחרים דומים שמצליחים. השלישי הוא שכנוע מילולי מהסביבה, והרביעי הוא מצבים גופניים ורגשיים והפרשנות שניתנת להם. מבין הארבעה, חוויות השליטה נחשבות למקור החזק ביותר, מפני שהן מספקות את העדות הישירה והמשכנעת ביותר ליכולת (Bandura, 1997; Artino, 2012).</w:t>
+        <w:t xml:space="preserve">על-פי המודל, תחושת החוללות נבנית מארבעה מקורות מרכזיים, הנבדלים זה מזה בעוצמת השפעתם. המקור הראשון והחזק ביותר הוא חוויות שליטה (mastery experiences), כלומר התנסויות ישירות של הצלחה בביצוע משימות. חוויות אלה משפיעות יותר מכל מקור אחר משום שהן מספקות לאדם עדות אותנטית ובלתי-אמצעית ליכולתו: הצלחות חוזרות מבססות אמונה יציבה במסוגלות, בעוד שכישלונות, בעיקר כשהם מתרחשים בטרם התגבשה תחושת מסוגלות מוצקה, עלולים לערער אותה. עם זאת, ההשפעה אינה אוטומטית, והיא תלויה באופן שבו האדם מפרש את ההצלחה ומייחס אותה למאמצו ולכישוריו (Bandura, 1997; Artino, 2012).</w:t>
+      </w:r>
+    </w:p>
+    <w:p>
+      <w:pPr>
+        <w:bidi/>
+        <w:spacing w:after="160" w:before="0" w:line="360"/>
+        <w:jc w:val="both"/>
+      </w:pPr>
+      <w:r>
+        <w:rPr>
+          <w:rFonts w:ascii="David" w:cs="David" w:eastAsia="David" w:hAnsi="David"/>
+          <w:b w:val="false"/>
+          <w:bCs w:val="false"/>
+          <w:i w:val="false"/>
+          <w:iCs w:val="false"/>
+          <w:color w:val="000000"/>
+          <w:sz w:val="24"/>
+          <w:szCs w:val="24"/>
+          <w:rtl/>
+        </w:rPr>
+        <w:t xml:space="preserve">שלושת המקורות הנוספים תורמים אף הם, אך במידה פחותה. חוויות עקיפות (vicarious experiences) נוצרות מהתבוננות באחרים המבצעים משימה בהצלחה, והשפעתן תלויה במידת הדמיון הנתפס בין הצופה למודל: ככל שהמודל נתפס דומה יותר לצופה מבחינת יכולת ורקע, כך גוברת השפעתו על אמונת המסוגלות. שכנוע מילולי, בדמות עידוד ומשוב מהסביבה, יכול לחזק זמנית את תחושת המסוגלות, אך השפעתו מוגבלת כאשר אינה נתמכת בהתנסות ממשית. לבסוף, מצבים גופניים ורגשיים, והפרשנות שאדם נותן להם, משמשים גם הם מקור מידע לגבי יכולתו, כך שעוררות המתפרשת כמתח עלולה להחליש את תחושת המסוגלות ואילו עוררות המתפרשת כמוכנות עשויה לחזקה (Bandura, 1997).</w:t>
       </w:r>
     </w:p>
     <w:p>
@@ -2755,7 +2776,7 @@
           <w:szCs w:val="24"/>
           <w:rtl/>
         </w:rPr>
-        <w:t xml:space="preserve">הממצא שלפיו היזכרות בהצלחה אישית העלתה את תחושת המסוגלות, בשני המדדים, עולה בקנה אחד עם הטענה של בנדורה, שלפיה חוויות שליטה הן המקור החזק ביותר לחוללות עצמית (Bandura, 1997). התוצאה גם מתיישבת עם ממצאים לפיהם תחושת המסוגלות ניתנת לחיזוק ומשפיעה על מוטיבציה ועל הישגים (שאנק, 2001; Basileo et al., 2024). העובדה שהאפקט על תחושת המסוגלות של המורה היה מעט חלש יותר מתיישבת עם התפיסה שמסוגלות ספציפית לתחום ההוראה מעוגנת יותר בהתנסות ההוראה עצמה, ולכן פחות רגישה לאינדוקציה קצרה וכללית (Tschannen-Moran &amp; Woolfolk Hoy, 2001).</w:t>
+        <w:t xml:space="preserve">הממצא המרכזי, שלפיו היזכרות בהצלחה אישית העלתה את תחושת המסוגלות בשני המדדים, עולה בקנה אחד עם הטענה של בנדורה שחוויות שליטה הן המקור החזק ביותר לחוללות עצמית (Bandura, 1997). מעניין במיוחד שדי היה במשימת כתיבה קצרה, בת כארבע דקות, כדי להזיז את תחושת המסוגלות. עובדה זו ממחישה את הפלסטיות של המשתנה ותומכת בתפיסה הרואה בחוללות לא רק תכונה יציבה אלא גם מצב הניתן לשינוי. התוצאה מתחברת גם לספרות המדגישה את מרכזיות המסוגלות במוטיבציה ובהישגים: אם התערבות פשוטה יכולה להעלות את תחושת המסוגלות, ומסוגלות זו מנבאת מאמץ, התמדה והישגים (שאנק, 2001; Basileo et al., 2024), הרי שיש כאן מנוף פוטנציאלי לקידום לומדים.</w:t>
       </w:r>
     </w:p>
     <w:p>
@@ -2776,7 +2797,7 @@
           <w:szCs w:val="24"/>
           <w:rtl/>
         </w:rPr>
-        <w:t xml:space="preserve">ההיעדר של אפקט מובהק בקבוצת החשיפה העקיפה ניתן להסבר בכמה דרכים. לפי בנדורה (Bandura, 1997), עוצמת ההשפעה של מודל תלויה במידת הדמיון הנתפס בינו לבין הצופה, וייתכן שעדות כתובה של עמית אנונימי לא יצרה תחושת דמיון מספקת. בנוסף, קריאת טקסט קצר עשויה להיות פחות משכנעת מהתבוננות במודל חי, וייתכן שחשיפה חד-פעמית אינה מספיקה כדי להשפיע.</w:t>
+        <w:t xml:space="preserve">ממצא שראוי לתשומת לב מיוחדת הוא הפער בין שני מדדי המסוגלות. האינדוקציה השפיעה חזק יותר על החוללות העצמית הכללית מאשר על תחושת המסוגלות של המורה. הסבר אפשרי נעוץ בהבחנה בין מסוגלות כללית לבין מסוגלות ספציפית לתחום. תחושת המסוגלות של המורה נשענת במידה רבה על התנסות ממשית בהוראה, מקור שסטודנטים בתחילת הכשרתם עדיין חסרים, ולכן ייתכן שהיא מעוגנת יותר ופחות רגישה לאינדוקציה קצרה וכללית (Tschannen-Moran &amp; Woolfolk Hoy, 2001). עם זאת, המתאם החיובי הבינוני-גבוה שנמצא בין שני המדדים (השערה 4) תומך בכך שחיזוק המסוגלות הכללית עשוי לתרום, ולו בעקיפין, גם לתחושת המסוגלות בהקשר ההוראה, מה שמחזק את הרלוונטיות של התערבויות כלליות לאוכלוסיית המורים לעתיד.</w:t>
       </w:r>
     </w:p>
     <w:p>
@@ -2797,7 +2818,7 @@
           <w:szCs w:val="24"/>
           <w:rtl/>
         </w:rPr>
-        <w:t xml:space="preserve">חשוב לציין שגם השפעתה של ההיזכרות בהצלחה אינה מובטחת. עבודתם של אבדולה ווודס (Abdulla &amp; Woods, 2025) מראה כי אפקט ההיזכרות על הציפיות תלוי בקלות שבה נשלפת ההצלחה מהזיכרון ובאופן שבו היא מיוחסת, ולכן ייתכן שחלק מהמשתתפים בתנאי חוויית השליטה הפיקו מהמניפולציה יותר מאחרים. שילוב של מבחן מניפולציה ושל מדדים למשתנים אלה במחקרי המשך יוכל להבהיר נקודה זו.</w:t>
+        <w:t xml:space="preserve">לעומת חוויית השליטה, החשיפה העקיפה לא הניבה אפקט מובהק, וגם לכך כמה הסברים אפשריים. ראשית, לפי בנדורה (Bandura, 1997), עוצמת ההשפעה של מודל תלויה במידת הדמיון הנתפס בינו לבין הצופה, וייתכן שעדות כתובה של עמית אנונימי לא יצרה תחושת דמיון מספקת. שנית, קריאת טקסט קצר עשויה להיות פחות משכנעת מהתבוננות במודל חי המבצע משימה בפועל, שכן היא חסרה את הפן החזותי והרגשי של ההתבוננות. שלישית, ייתכן שחשיפה חד-פעמית ובמינון נמוך אינה מספיקה כדי לחולל שינוי, וכי נדרשת חשיפה חוזרת או אינטנסיבית יותר.</w:t>
       </w:r>
     </w:p>
     <w:p>
@@ -2818,7 +2839,7 @@
           <w:szCs w:val="24"/>
           <w:rtl/>
         </w:rPr>
-        <w:t xml:space="preserve">למחקר כמה מגבלות. ראשית, מדובר במדגם נוחות קטן (N=33) המורכב מסטודנטים בהכשרה להוראה בלבד, ולכן ההכללה לאוכלוסייה הרחבה מוגבלת והעוצמה הסטטיסטית נמוכה. שנית, המחקר נשען על דיווח עצמי, שחשוף להטיית רצייה חברתית. שלישית, לא נמדדה רמת החוללות לפני המניפולציה, כך שההשוואה בין-נבדקית בלבד. רביעית, לא נכלל מבחן מניפולציה שיוודא שהמשימות אכן הפעילו את התהליכים המיועדים, והמדידה נגעה להשפעה מיידית ומצבית בלבד.</w:t>
+        <w:t xml:space="preserve">חשוב לציין שגם השפעתה של ההיזכרות בהצלחה אינה מובטחת. עבודתם של אבדולה ווודס (Abdulla &amp; Woods, 2025) מראה כי אפקט ההיזכרות על הציפיות תלוי בקלות שבה נשלפת ההצלחה מהזיכרון ובאופן שבו היא מיוחסת, ולכן ייתכן שחלק מהמשתתפים בתנאי חוויית השליטה הפיקו מהמניפולציה יותר מאחרים. אפשר שמי שהתקשה לשלוף דוגמה משמעותית להצלחה, או ייחס אותה לגורם חיצוני וחולף, נהנה פחות מהמניפולציה. נקודה זו מדגישה עד כמה חשוב לשלב במחקרי המשך מבחן מניפולציה ומדדים לתהליכים המתווכים.</w:t>
       </w:r>
     </w:p>
     <w:p>
@@ -2830,16 +2851,135 @@
       <w:r>
         <w:rPr>
           <w:rFonts w:ascii="David" w:cs="David" w:eastAsia="David" w:hAnsi="David"/>
-          <w:b w:val="false"/>
-          <w:bCs w:val="false"/>
-          <w:i w:val="false"/>
-          <w:iCs w:val="false"/>
-          <w:color w:val="000000"/>
-          <w:sz w:val="24"/>
-          <w:szCs w:val="24"/>
-          <w:rtl/>
-        </w:rPr>
-        <w:t xml:space="preserve">מחקרי המשך יוכלו להגדיל ולגוון את המדגם, להוסיף מדידת בסיס ותכנון עם מדידות חוזרות, ולחזק את מניפולציית החשיפה העקיפה, למשל באמצעות מודל וידאו חי או מודל דומה למשתתף. כדאי גם להוסיף מבחן מניפולציה ולבחון את עמידות האפקט לאורך זמן. חרף מגבלותיו, המחקר ממחיש שאף התערבות קצרה של היזכרות בהצלחה יכולה להעלות את תחושת המסוגלות, ממצא בעל ערך יישומי בהכשרת מורים ובהקשרים חינוכיים. חיזוק תחושת המסוגלות של סטודנטים להוראה כבר בשלב ההכשרה עשוי לתרום בהמשך לתחושת המסוגלות המקצועית שלהם, למחויבותם למקצוע ולהתמודדותם עם שחיקה.</w:t>
+          <w:b/>
+          <w:bCs/>
+          <w:i w:val="false"/>
+          <w:iCs w:val="false"/>
+          <w:color w:val="000000"/>
+          <w:sz w:val="24"/>
+          <w:szCs w:val="24"/>
+          <w:rtl/>
+        </w:rPr>
+        <w:t xml:space="preserve">השלכות יישומיות. </w:t>
+      </w:r>
+      <w:r>
+        <w:rPr>
+          <w:rFonts w:ascii="David" w:cs="David" w:eastAsia="David" w:hAnsi="David"/>
+          <w:b w:val="false"/>
+          <w:bCs w:val="false"/>
+          <w:i w:val="false"/>
+          <w:iCs w:val="false"/>
+          <w:color w:val="000000"/>
+          <w:sz w:val="24"/>
+          <w:szCs w:val="24"/>
+          <w:rtl/>
+        </w:rPr>
+        <w:t xml:space="preserve">מבחינה יישומית, הממצאים מצביעים על כך שאף התערבות קצרה, פשוטה וחסכונית במשאבים יכולה להעלות את תחושת המסוגלות של סטודנטים בהכשרה להוראה. שילוב של תרגילי היזכרות בהצלחות אישיות בתוך תוכניות ההכשרה, למשל לפני התנסות מעשית או לפני מטלה מאתגרת, עשוי לתמוך במוטיבציה, בהתמדה ובתחושת המוכנות של המתכשרים. מכיוון שתחושת המסוגלות של מורים נקשרה בספרות למחויבות למקצוע, להכלה ולהתמודדות עם שחיקה, חיזוקה כבר בשלב ההכשרה נושא ערך מעשי לטווח הארוך.</w:t>
+      </w:r>
+    </w:p>
+    <w:p>
+      <w:pPr>
+        <w:bidi/>
+        <w:spacing w:after="160" w:before="0" w:line="360"/>
+        <w:jc w:val="both"/>
+      </w:pPr>
+      <w:r>
+        <w:rPr>
+          <w:rFonts w:ascii="David" w:cs="David" w:eastAsia="David" w:hAnsi="David"/>
+          <w:b/>
+          <w:bCs/>
+          <w:i w:val="false"/>
+          <w:iCs w:val="false"/>
+          <w:color w:val="000000"/>
+          <w:sz w:val="24"/>
+          <w:szCs w:val="24"/>
+          <w:rtl/>
+        </w:rPr>
+        <w:t xml:space="preserve">מגבלות המחקר. </w:t>
+      </w:r>
+      <w:r>
+        <w:rPr>
+          <w:rFonts w:ascii="David" w:cs="David" w:eastAsia="David" w:hAnsi="David"/>
+          <w:b w:val="false"/>
+          <w:bCs w:val="false"/>
+          <w:i w:val="false"/>
+          <w:iCs w:val="false"/>
+          <w:color w:val="000000"/>
+          <w:sz w:val="24"/>
+          <w:szCs w:val="24"/>
+          <w:rtl/>
+        </w:rPr>
+        <w:t xml:space="preserve">לצד תרומותיו, למחקר כמה מגבלות. ראשית, מדובר במדגם נוחות קטן (N=33) המורכב מסטודנטים בהכשרה להוראה בלבד, ולכן ההכללה לאוכלוסייה הרחבה מוגבלת והעוצמה הסטטיסטית לזהות אפקטים בינוניים נמוכה. שנית, המחקר נשען על דיווח עצמי, החשוף להטיית רצייה חברתית ולמודעות המשתתף למטרת המשימה. שלישית, לא נמדדה רמת המסוגלות לפני המניפולציה, כך שההשוואה בין-נבדקית בלבד, וייתכן שהבדלים אישיים קודמים תרמו לשונות. רביעית, לא נכלל מבחן מניפולציה שיוודא שהמשימות אכן הפעילו את התהליכים המיועדים. לבסוף, נמדדה השפעה מיידית ומצבית בלבד, ואין בה כדי ללמד על שינוי יציב לאורך זמן.</w:t>
+      </w:r>
+    </w:p>
+    <w:p>
+      <w:pPr>
+        <w:bidi/>
+        <w:spacing w:after="160" w:before="0" w:line="360"/>
+        <w:jc w:val="both"/>
+      </w:pPr>
+      <w:r>
+        <w:rPr>
+          <w:rFonts w:ascii="David" w:cs="David" w:eastAsia="David" w:hAnsi="David"/>
+          <w:b/>
+          <w:bCs/>
+          <w:i w:val="false"/>
+          <w:iCs w:val="false"/>
+          <w:color w:val="000000"/>
+          <w:sz w:val="24"/>
+          <w:szCs w:val="24"/>
+          <w:rtl/>
+        </w:rPr>
+        <w:t xml:space="preserve">הצעות למחקר עתידי. </w:t>
+      </w:r>
+      <w:r>
+        <w:rPr>
+          <w:rFonts w:ascii="David" w:cs="David" w:eastAsia="David" w:hAnsi="David"/>
+          <w:b w:val="false"/>
+          <w:bCs w:val="false"/>
+          <w:i w:val="false"/>
+          <w:iCs w:val="false"/>
+          <w:color w:val="000000"/>
+          <w:sz w:val="24"/>
+          <w:szCs w:val="24"/>
+          <w:rtl/>
+        </w:rPr>
+        <w:t xml:space="preserve">מחקרי המשך יוכלו להגדיל ולגוון את המדגם, ולהוסיף מדידת בסיס ותכנון עם מדידות חוזרות שיאפשר לאמוד את השינוי ברמת הפרט. כדאי לחזק את מניפולציית החשיפה העקיפה, למשל באמצעות מודל וידאו חי או מודל דומה למשתתף מבחינת גיל ורקע, ולהוסיף מבחן מניפולציה וכן מדדים לקלות השליפה ולייחוסים. כיוון נוסף הוא לבחון את עמידות האפקט לאורך זמן באמצעות מדידות חוזרות לאחר יום, שבוע וחודש, ולבדוק אם שילוב של היזכרות בהצלחה עם התנסות מעשית מייצר אפקט חזק ויציב יותר.</w:t>
+      </w:r>
+    </w:p>
+    <w:p>
+      <w:pPr>
+        <w:bidi/>
+        <w:spacing w:after="160" w:before="0" w:line="360"/>
+        <w:jc w:val="both"/>
+      </w:pPr>
+      <w:r>
+        <w:rPr>
+          <w:rFonts w:ascii="David" w:cs="David" w:eastAsia="David" w:hAnsi="David"/>
+          <w:b/>
+          <w:bCs/>
+          <w:i w:val="false"/>
+          <w:iCs w:val="false"/>
+          <w:color w:val="000000"/>
+          <w:sz w:val="24"/>
+          <w:szCs w:val="24"/>
+          <w:rtl/>
+        </w:rPr>
+        <w:t xml:space="preserve">סיכום. </w:t>
+      </w:r>
+      <w:r>
+        <w:rPr>
+          <w:rFonts w:ascii="David" w:cs="David" w:eastAsia="David" w:hAnsi="David"/>
+          <w:b w:val="false"/>
+          <w:bCs w:val="false"/>
+          <w:i w:val="false"/>
+          <w:iCs w:val="false"/>
+          <w:color w:val="000000"/>
+          <w:sz w:val="24"/>
+          <w:szCs w:val="24"/>
+          <w:rtl/>
+        </w:rPr>
+        <w:t xml:space="preserve">המחקר ממחיש שאינדוקציה קצרה של חוויית שליטה, בדמות היזכרות בהצלחה אישית, מעלה את תחושת המסוגלות של סטודנטים בהכשרה להוראה, בעוד שחשיפה עקיפה קצרה בדמות עדות כתובה לא הניבה אפקט מובהק. הממצאים תומכים בבכורתן של חוויות השליטה כמקור לחוללות עצמית, ומדגישים את הפוטנציאל הטמון בהתערבויות פשוטות לחיזוק תחושת המסוגלות, לצד הצורך במחקר גדול ומבוקר יותר שיבחן את עמידות האפקט ואת התהליכים שבבסיסו.</w:t>
       </w:r>
     </w:p>
     <w:p>

</xml_diff>

<commit_message>
Add the raw SPSS-ready dataset and align reported stats to it
- Add examples/seminar-psychology-self-efficacy-data.xlsx: the 33-participant
  data matrix (condition, demographics, all 8 NGSE and 12 TSES items, plus
  computed scale means) with a Hebrew variable-coding legend sheet.
- Regenerate the reported statistics from this dataset and align the paper
  exactly: group SDs, F (NGSE 5.14), Cronbach alphas (.87 / .90), Tukey mean
  differences and CIs, the NGSE-TSES correlation (r=.52), and the age range.

Co-Authored-By: Claude Opus 4.8 <noreply@anthropic.com>
Claude-Session: https://claude.ai/code/session_01YH1N5dULXnq2hJCrBuBusq
</commit_message>
<xml_diff>
--- a/examples/seminar-psychology-self-efficacy.docx
+++ b/examples/seminar-psychology-self-efficacy.docx
@@ -289,7 +289,7 @@
           <w:szCs w:val="24"/>
           <w:rtl/>
         </w:rPr>
-        <w:t xml:space="preserve">במחקר זה ביקשנו לבדוק האם מקור החוללות שאליו נחשף אדם משפיע על תחושת החוללות העצמית הכללית שלו. הספרות מבחינה בין ארבעה מקורות לחוללות עצמית, ובהם חוויית שליטה, שהיא התנסות ישירה בהצלחה, וחוויה עקיפה, שהיא למידה מהתבוננות באחר שמצליח. בכדי לבחון זאת השתתפו במדגם 33 סטודנטים בהכשרה להוראה, אשר חולקו באקראי באמצעות תוכנת Qualtrics לשלוש קבוצות. קבוצת הניסוי התבקשה להיזכר בהצלחה אישית מהעבר, קבוצת ההשוואה קראה עדות של עמית שהתמודד והצליח, וקבוצת הביקורת ביצעה משימת כתיבה נייטרלית. לאחר מכן מילאו כלל המשתתפים שני שאלונים: שאלון החוללות העצמית הכללית (NGSE) ושאלון תחושת המסוגלות של המורה (TSES). השערת המחקר, לפיה חוויית שליטה תעלה את תחושת המסוגלות יותר מן החשיפה העקיפה, אוששה באופן חלקי בשני המדדים. בחוללות העצמית הכללית נמצא הבדל מובהק בין הקבוצות, F(2,30)=5.18, p=.012, η²=.26, כך שקבוצת חוויית השליטה (M=4.05, SD=0.57) דיווחה על חוללות גבוהה יותר מקבוצת הביקורת (M=3.30, SD=0.55). גם בתחושת המסוגלות של המורה נמצא הבדל מובהק, F(2,30)=3.69, p=.037, η²=.20, באותו כיוון. בשני המדדים קבוצת החשיפה העקיפה לא נבדלה מהביקורת באופן מובהק. נוסף על כך מוצגים ממצאים מהספרות, נדונות מגבלות המחקר ומוצעים מחקרי המשך.</w:t>
+        <w:t xml:space="preserve">במחקר זה ביקשנו לבדוק האם מקור החוללות שאליו נחשף אדם משפיע על תחושת החוללות העצמית הכללית שלו. הספרות מבחינה בין ארבעה מקורות לחוללות עצמית, ובהם חוויית שליטה, שהיא התנסות ישירה בהצלחה, וחוויה עקיפה, שהיא למידה מהתבוננות באחר שמצליח. בכדי לבחון זאת השתתפו במדגם 33 סטודנטים בהכשרה להוראה, אשר חולקו באקראי באמצעות תוכנת Qualtrics לשלוש קבוצות. קבוצת הניסוי התבקשה להיזכר בהצלחה אישית מהעבר, קבוצת ההשוואה קראה עדות של עמית שהתמודד והצליח, וקבוצת הביקורת ביצעה משימת כתיבה נייטרלית. לאחר מכן מילאו כלל המשתתפים שני שאלונים: שאלון החוללות העצמית הכללית (NGSE) ושאלון תחושת המסוגלות של המורה (TSES). השערת המחקר, לפיה חוויית שליטה תעלה את תחושת המסוגלות יותר מן החשיפה העקיפה, אוששה באופן חלקי בשני המדדים. בחוללות העצמית הכללית נמצא הבדל מובהק בין הקבוצות, F(2,30)=5.14, p=.012, η²=.26, כך שקבוצת חוויית השליטה (M=4.05, SD=0.57) דיווחה על חוללות גבוהה יותר מקבוצת הביקורת (M=3.30, SD=0.56). גם בתחושת המסוגלות של המורה נמצא הבדל מובהק, F(2,30)=3.69, p=.037, η²=.20, באותו כיוון. בשני המדדים קבוצת החשיפה העקיפה לא נבדלה מהביקורת באופן מובהק. נוסף על כך מוצגים ממצאים מהספרות, נדונות מגבלות המחקר ומוצעים מחקרי המשך.</w:t>
       </w:r>
     </w:p>
     <w:p>
@@ -897,7 +897,7 @@
           <w:szCs w:val="24"/>
           <w:rtl/>
         </w:rPr>
-        <w:t xml:space="preserve">במחקר השתתפו 33 סטודנטים בהכשרה להוראה שהתנדבו למחקר, ובהם 21 נשים ו-12 גברים. גיל המשתתפים נע בין 18 ל-31 (M=24.3, SD=2.8). מבחינת השכלה, 60.6% מהמשתתפים בעלי השכלה אקדמית, 27.3% בעלי השכלה תיכונית ו-12.1% בעלי לימודי תעודה. מבחינת אזור מגורים, 42.4% מתגוררים במרכז, 30.3% בדרום, 18.2% בצפון ו-9.1% ביהודה ושומרון. המשתתפים הוקצו מקרית לתנאי המחקר באמצעות תוכנת Qualtrics, כך שבכל אחת משלוש הקבוצות נכללו 11 משתתפים.</w:t>
+        <w:t xml:space="preserve">במחקר השתתפו 33 סטודנטים בהכשרה להוראה שהתנדבו למחקר, ובהם 21 נשים ו-12 גברים. גיל המשתתפים נע בין 18 ל-30 (M=24.3, SD=2.7). מבחינת השכלה, 60.6% מהמשתתפים בעלי השכלה אקדמית, 27.3% בעלי השכלה תיכונית ו-12.1% בעלי לימודי תעודה. מבחינת אזור מגורים, 42.4% מתגוררים במרכז, 30.3% בדרום, 18.2% בצפון ו-9.1% ביהודה ושומרון. המשתתפים הוקצו מקרית לתנאי המחקר באמצעות תוכנת Qualtrics, כך שבכל אחת משלוש הקבוצות נכללו 11 משתתפים.</w:t>
       </w:r>
     </w:p>
     <w:p>
@@ -1059,7 +1059,7 @@
           <w:szCs w:val="24"/>
           <w:rtl/>
         </w:rPr>
-        <w:t xml:space="preserve">למדידת תחושת המסוגלות בהקשר ההוראה נעשה שימוש בגרסה הקצרה של שאלון תחושת המסוגלות של המורה (Tschannen-Moran &amp; Woolfolk Hoy, 2001), הכוללת שנים-עשר היגדים בשלושה תת-סולמות: מעורבות תלמידים, אסטרטגיות הוראה וניהול כיתה. ההיגדים מדורגים בסולם בן תשע דרגות, מ-1 (כלל לא) עד 9 (במידה רבה מאוד). לדוגמה: "עד כמה תוכל/י לספק הסבר חלופי או דוגמה נוספת כאשר תלמידים מתקשים להבין?". ציון המסוגלות חושב כממוצע שנים-עשר ההיגדים, ולשאלון נמצאה מהימנות גבוהה (אלפא של קרונבך = .91) (ראו נספח 4).</w:t>
+        <w:t xml:space="preserve">למדידת תחושת המסוגלות בהקשר ההוראה נעשה שימוש בגרסה הקצרה של שאלון תחושת המסוגלות של המורה (Tschannen-Moran &amp; Woolfolk Hoy, 2001), הכוללת שנים-עשר היגדים בשלושה תת-סולמות: מעורבות תלמידים, אסטרטגיות הוראה וניהול כיתה. ההיגדים מדורגים בסולם בן תשע דרגות, מ-1 (כלל לא) עד 9 (במידה רבה מאוד). לדוגמה: "עד כמה תוכל/י לספק הסבר חלופי או דוגמה נוספת כאשר תלמידים מתקשים להבין?". ציון המסוגלות חושב כממוצע שנים-עשר ההיגדים, ולשאלון נמצאה מהימנות גבוהה (אלפא של קרונבך = .90) (ראו נספח 4).</w:t>
       </w:r>
     </w:p>
     <w:p>
@@ -1172,7 +1172,7 @@
           <w:szCs w:val="24"/>
           <w:rtl/>
         </w:rPr>
-        <w:t xml:space="preserve">תחילה נבדקו הנתונים לקראת הניתוח. משתתפים שלא השלימו את שני השאלונים לא נכללו במדגם הסופי, ולכן לא נותרו נתונים חסרים. התפלגות הציונים בשני המדדים נבחנה, וערכי הצידוד (skewness) והגבנוניות (kurtosis) נמצאו בטווח המקובל (בין 1- ל-1), כך שהונחה התפלגות נורמלית מספקת לשימוש במבחנים פרמטריים. מהימנות שני השאלונים, כפי שדווחה בפרק הכלים, הייתה גבוהה (NGSE: α=.87; TSES: α=.91). כל הניתוחים בוצעו בתוכנת SPSS, ורמת המובהקות נקבעה על α=.05.</w:t>
+        <w:t xml:space="preserve">תחילה נבדקו הנתונים לקראת הניתוח. משתתפים שלא השלימו את שני השאלונים לא נכללו במדגם הסופי, ולכן לא נותרו נתונים חסרים. התפלגות הציונים בשני המדדים נבחנה, וערכי הצידוד (skewness) והגבנוניות (kurtosis) נמצאו בטווח המקובל (בין 1- ל-1), כך שהונחה התפלגות נורמלית מספקת לשימוש במבחנים פרמטריים. מהימנות שני השאלונים, כפי שדווחה בפרק הכלים, הייתה גבוהה (NGSE: α=.87; TSES: α=.90). כל הניתוחים בוצעו בתוכנת SPSS, ורמת המובהקות נקבעה על α=.05.</w:t>
       </w:r>
     </w:p>
     <w:p>
@@ -1661,7 +1661,7 @@
                 <w:szCs w:val="24"/>
                 <w:rtl/>
               </w:rPr>
-              <w:t xml:space="preserve">0.52</w:t>
+              <w:t xml:space="preserve">0.51</w:t>
             </w:r>
           </w:p>
         </w:tc>
@@ -1791,7 +1791,7 @@
                 <w:szCs w:val="24"/>
                 <w:rtl/>
               </w:rPr>
-              <w:t xml:space="preserve">0.55</w:t>
+              <w:t xml:space="preserve">0.56</w:t>
             </w:r>
           </w:p>
         </w:tc>
@@ -1815,7 +1815,7 @@
           <w:szCs w:val="24"/>
           <w:rtl/>
         </w:rPr>
-        <w:t xml:space="preserve">בטרם ניתוח השונות נבדקה הנחת שוויון השונויות באמצעות מבחן Levene, שלא נמצא מובהק, F(2,30)=0.34, p=.71, ולכן ההנחה לא הופרה. לבחינת השערת המחקר בוצע ניתוח שונות חד-גורמי בין נבדקים (One-Way ANOVA), שהעלה הבדל מובהק בין שלוש הקבוצות ברמת החוללות העצמית, F(2,30)=5.18, p=.012. גודל האפקט, אטא בריבוע, היה η²=.26, המצביע על אפקט גדול על-פי אמות המידה של כהן, שלפיהן ערך של η²=.14 נחשב גדול.</w:t>
+        <w:t xml:space="preserve">בטרם ניתוח השונות נבדקה הנחת שוויון השונויות באמצעות מבחן Levene, שלא נמצא מובהק, F(2,30)=0.34, p=.71, ולכן ההנחה לא הופרה. לבחינת השערת המחקר בוצע ניתוח שונות חד-גורמי בין נבדקים (One-Way ANOVA), שהעלה הבדל מובהק בין שלוש הקבוצות ברמת החוללות העצמית, F(2,30)=5.14, p=.012. גודל האפקט, אטא בריבוע, היה η²=.26, המצביע על אפקט גדול על-פי אמות המידה של כהן, שלפיהן ערך של η²=.14 נחשב גדול.</w:t>
       </w:r>
     </w:p>
     <w:p>
@@ -1836,7 +1836,7 @@
           <w:szCs w:val="24"/>
           <w:rtl/>
         </w:rPr>
-        <w:t xml:space="preserve">לבחינת מקור ההבדלים בוצעו השוואות מרובות בשיטת Tukey HSD. נמצא כי קבוצת חוויית השליטה (M=4.05, SD=0.57) דיווחה על חוללות גבוהה יותר מקבוצת הביקורת (M=3.30, SD=0.55), בהפרש ממוצעים של 0.75, הפרש שהיה מובהק (p=.008, 95% CI [0.17, 1.33]). לעומת זאת, ההפרש בין קבוצת החשיפה העקיפה (M=3.70, SD=0.52) לבין קבוצת הביקורת, שעמד על 0.40, לא הגיע למובהקות (p=.21, 95% CI [-0.18, 0.98]), וכך גם ההפרש בין חוויית השליטה לחשיפה העקיפה, שעמד על 0.35 (p=.30, 95% CI [-0.23, 0.93]). ממצאים אלו מוצגים באיור 1.</w:t>
+        <w:t xml:space="preserve">לבחינת מקור ההבדלים בוצעו השוואות מרובות בשיטת Tukey HSD. נמצא כי קבוצת חוויית השליטה (M=4.05, SD=0.57) דיווחה על חוללות גבוהה יותר מקבוצת הביקורת (M=3.30, SD=0.56), בהפרש ממוצעים של 0.75, הפרש שהיה מובהק (p=.008, 95% CI [0.17, 1.33]). לעומת זאת, ההפרש בין קבוצת החשיפה העקיפה (M=3.70, SD=0.51) לבין קבוצת הביקורת, שעמד על 0.41, לא הגיע למובהקות (p=.21, 95% CI [-0.17, 0.99]), וכך גם ההפרש בין חוויית השליטה לחשיפה העקיפה, שעמד על 0.34 (p=.30, 95% CI [-0.24, 0.92]). ממצאים אלו מוצגים באיור 1.</w:t>
       </w:r>
     </w:p>
     <w:p>
@@ -2277,7 +2277,7 @@
                 <w:szCs w:val="24"/>
                 <w:rtl/>
               </w:rPr>
-              <w:t xml:space="preserve">0.76</w:t>
+              <w:t xml:space="preserve">0.75</w:t>
             </w:r>
           </w:p>
         </w:tc>
@@ -2537,7 +2537,7 @@
                 <w:szCs w:val="24"/>
                 <w:rtl/>
               </w:rPr>
-              <w:t xml:space="preserve">0.78</w:t>
+              <w:t xml:space="preserve">0.79</w:t>
             </w:r>
           </w:p>
         </w:tc>
@@ -2582,7 +2582,7 @@
           <w:szCs w:val="24"/>
           <w:rtl/>
         </w:rPr>
-        <w:t xml:space="preserve">השוואות Tukey HSD הראו שקבוצת חוויית השליטה (M=6.98, SD=0.76) דיווחה על תחושת מסוגלות גבוהה יותר מקבוצת הביקורת (M=6.10, SD=0.78), בהפרש של 0.88 שהיה מובהק (p=.034, 95% CI [0.08, 1.68]). ההפרש בין קבוצת החשיפה העקיפה (M=6.55, SD=0.74) לבין הביקורת, שעמד על 0.45, לא היה מובהק (p=.32), וגם ההפרש בין חוויית השליטה לחשיפה העקיפה, שעמד על 0.43, לא הגיע למובהקות (p=.35). דפוס דומה, של עלייה מן הביקורת אל חוויית השליטה, נמצא בכל שלושת תת-הסולמות של השאלון (מעורבות תלמידים, אסטרטגיות הוראה וניהול כיתה), והבולט שבהם היה בתת-הסולם של אסטרטגיות ההוראה. ממצאי מדד זה מוצגים באיור 2.</w:t>
+        <w:t xml:space="preserve">השוואות Tukey HSD הראו שקבוצת חוויית השליטה (M=6.98, SD=0.75) דיווחה על תחושת מסוגלות גבוהה יותר מקבוצת הביקורת (M=6.10, SD=0.79), בהפרש של 0.88 שהיה מובהק (p=.034, 95% CI [0.08, 1.68]). ההפרש בין קבוצת החשיפה העקיפה (M=6.55, SD=0.74) לבין הביקורת, שעמד על 0.45, לא היה מובהק (p=.32), וגם ההפרש בין חוויית השליטה לחשיפה העקיפה, שעמד על 0.42, לא הגיע למובהקות (p=.35). דפוס דומה, של עלייה מן הביקורת אל חוויית השליטה, נמצא בכל שלושת תת-הסולמות של השאלון (מעורבות תלמידים, אסטרטגיות הוראה וניהול כיתה), והבולט שבהם היה בתת-הסולם של אסטרטגיות ההוראה. ממצאי מדד זה מוצגים באיור 2.</w:t>
       </w:r>
     </w:p>
     <w:p>
@@ -6203,7 +6203,7 @@
           <w:szCs w:val="24"/>
           <w:rtl/>
         </w:rPr>
-        <w:t xml:space="preserve">שאלון תחושת המסוגלות של המורה (Teachers' Sense of Efficacy Scale) פותח על ידי טשאנן-מורן ו-וולפוק הוי (Tschannen-Moran &amp; Woolfolk Hoy, 2001), ומעוגן בתיאוריה החברתית-קוגניטיבית של בנדורה. הגרסה הקצרה כוללת שנים-עשר היגדים בשלושה תת-סולמות: מעורבות תלמידים, אסטרטגיות הוראה וניהול כיתה, המדורגים בסולם בן תשע דרגות. הכלי הפך למדד הנפוץ ביותר לתחושת המסוגלות של מורים ומתאים גם לסטודנטים בהכשרה להוראה. במחקר הנוכחי נמצאה מהימנות של α=.91.</w:t>
+        <w:t xml:space="preserve">שאלון תחושת המסוגלות של המורה (Teachers' Sense of Efficacy Scale) פותח על ידי טשאנן-מורן ו-וולפוק הוי (Tschannen-Moran &amp; Woolfolk Hoy, 2001), ומעוגן בתיאוריה החברתית-קוגניטיבית של בנדורה. הגרסה הקצרה כוללת שנים-עשר היגדים בשלושה תת-סולמות: מעורבות תלמידים, אסטרטגיות הוראה וניהול כיתה, המדורגים בסולם בן תשע דרגות. הכלי הפך למדד הנפוץ ביותר לתחושת המסוגלות של מורים ומתאים גם לסטודנטים בהכשרה להוראה. במחקר הנוכחי נמצאה מהימנות של α=.90.</w:t>
       </w:r>
     </w:p>
     <w:p>

</xml_diff>

<commit_message>
Clean up display: no spell-check underlines, live blue reference links, fuller intro/discussion
- Set noProof on all runs so Word stops flagging English names and terms with
  red spell-check underlines.
- Turn the bibliography DOI URLs into active blue hyperlinks.
- Expand the intro (distinguish self-efficacy from self-esteem and outcome
  expectations) and the discussion (add a theoretical-contribution paragraph).

Co-Authored-By: Claude Opus 4.8 <noreply@anthropic.com>
Claude-Session: https://claude.ai/code/session_01YH1N5dULXnq2hJCrBuBusq
</commit_message>
<xml_diff>
--- a/examples/seminar-psychology-self-efficacy.docx
+++ b/examples/seminar-psychology-self-efficacy.docx
@@ -61,6 +61,7 @@
           <w:bCs/>
           <w:i w:val="false"/>
           <w:iCs w:val="false"/>
+          <w:noProof/>
           <w:color w:val="000000"/>
           <w:sz w:val="30"/>
           <w:szCs w:val="30"/>
@@ -82,6 +83,7 @@
           <w:bCs/>
           <w:i w:val="false"/>
           <w:iCs w:val="false"/>
+          <w:noProof/>
           <w:color w:val="000000"/>
           <w:sz w:val="26"/>
           <w:szCs w:val="26"/>
@@ -107,6 +109,7 @@
           <w:bCs/>
           <w:i w:val="false"/>
           <w:iCs w:val="false"/>
+          <w:noProof/>
           <w:color w:val="000000"/>
           <w:sz w:val="34"/>
           <w:szCs w:val="34"/>
@@ -128,6 +131,7 @@
           <w:bCs w:val="false"/>
           <w:i/>
           <w:iCs/>
+          <w:noProof/>
           <w:color w:val="000000"/>
           <w:sz w:val="24"/>
           <w:szCs w:val="24"/>
@@ -149,6 +153,7 @@
           <w:bCs w:val="false"/>
           <w:i w:val="false"/>
           <w:iCs w:val="false"/>
+          <w:noProof/>
           <w:color w:val="000000"/>
           <w:sz w:val="24"/>
           <w:szCs w:val="24"/>
@@ -170,6 +175,7 @@
           <w:bCs w:val="false"/>
           <w:i w:val="false"/>
           <w:iCs w:val="false"/>
+          <w:noProof/>
           <w:color w:val="000000"/>
           <w:sz w:val="24"/>
           <w:szCs w:val="24"/>
@@ -191,6 +197,7 @@
           <w:bCs w:val="false"/>
           <w:i w:val="false"/>
           <w:iCs w:val="false"/>
+          <w:noProof/>
           <w:color w:val="000000"/>
           <w:sz w:val="24"/>
           <w:szCs w:val="24"/>
@@ -217,6 +224,7 @@
           <w:bCs/>
           <w:i w:val="false"/>
           <w:iCs w:val="false"/>
+          <w:noProof/>
           <w:color w:val="000000"/>
           <w:sz w:val="30"/>
           <w:szCs w:val="30"/>
@@ -263,6 +271,7 @@
           <w:bCs/>
           <w:i w:val="false"/>
           <w:iCs w:val="false"/>
+          <w:noProof/>
           <w:color w:val="000000"/>
           <w:sz w:val="30"/>
           <w:szCs w:val="30"/>
@@ -284,6 +293,7 @@
           <w:bCs w:val="false"/>
           <w:i w:val="false"/>
           <w:iCs w:val="false"/>
+          <w:noProof/>
           <w:color w:val="000000"/>
           <w:sz w:val="24"/>
           <w:szCs w:val="24"/>
@@ -305,6 +315,7 @@
           <w:bCs/>
           <w:i w:val="false"/>
           <w:iCs w:val="false"/>
+          <w:noProof/>
           <w:color w:val="000000"/>
           <w:sz w:val="24"/>
           <w:szCs w:val="24"/>
@@ -319,6 +330,7 @@
           <w:bCs w:val="false"/>
           <w:i w:val="false"/>
           <w:iCs w:val="false"/>
+          <w:noProof/>
           <w:color w:val="000000"/>
           <w:sz w:val="24"/>
           <w:szCs w:val="24"/>
@@ -346,6 +358,7 @@
           <w:bCs/>
           <w:i w:val="false"/>
           <w:iCs w:val="false"/>
+          <w:noProof/>
           <w:color w:val="000000"/>
           <w:sz w:val="30"/>
           <w:szCs w:val="30"/>
@@ -367,6 +380,7 @@
           <w:bCs w:val="false"/>
           <w:i w:val="false"/>
           <w:iCs w:val="false"/>
+          <w:noProof/>
           <w:color w:val="000000"/>
           <w:sz w:val="24"/>
           <w:szCs w:val="24"/>
@@ -388,6 +402,7 @@
           <w:bCs w:val="false"/>
           <w:i w:val="false"/>
           <w:iCs w:val="false"/>
+          <w:noProof/>
           <w:color w:val="000000"/>
           <w:sz w:val="24"/>
           <w:szCs w:val="24"/>
@@ -409,6 +424,7 @@
           <w:bCs w:val="false"/>
           <w:i w:val="false"/>
           <w:iCs w:val="false"/>
+          <w:noProof/>
           <w:color w:val="000000"/>
           <w:sz w:val="24"/>
           <w:szCs w:val="24"/>
@@ -430,12 +446,13 @@
           <w:bCs w:val="false"/>
           <w:i w:val="false"/>
           <w:iCs w:val="false"/>
-          <w:color w:val="000000"/>
-          <w:sz w:val="24"/>
-          <w:szCs w:val="24"/>
-          <w:rtl/>
-        </w:rPr>
-        <w:t xml:space="preserve">בעוד שהמודל המקורי עסק בעיקר בחוללות ספציפית למשימה, התפתח בהמשך המושג של חוללות עצמית כללית, אמונה יציבה יחסית ביכולת להתמודד עם מגוון רחב של מצבים ואתגרים. לצורך מדידתה פותח שאלון החוללות העצמית הכללית (NGSE), כלי בן שמונה פריטים שהראה עקיבות פנימית גבוהה ותכונות פסיכומטריות טובות, ונמצא עדיף על כלים קודמים (Chen, Gully, &amp; Eden, 2001).</w:t>
+          <w:noProof/>
+          <w:color w:val="000000"/>
+          <w:sz w:val="24"/>
+          <w:szCs w:val="24"/>
+          <w:rtl/>
+        </w:rPr>
+        <w:t xml:space="preserve">כדי להבין את המושג לעומק חשוב להבחין בינו לבין מושגים קרובים. בניגוד להערכה עצמית (self-esteem), העוסקת בתחושת הערך הכללית של האדם כלפי עצמו, החוללות העצמית ממוקדת באמונה ביכולת לבצע משימה נתונה. היא נבדלת גם מציפיות התוצאה (outcome expectations), שהן ההערכה בדבר התוצאה שתיגזר מהתנהגות מסוימת, בעוד שהחוללות עוסקת באמונה ביכולת לבצע את ההתנהגות עצמה. הבחנות אלה אינן סמנטיות בלבד, שכן דווקא האמונה הממוקדת ביכולת הביצוע נמצאה מנבא חזק במיוחד של מוטיבציה, בחירת מטלות והתמדה (Artino, 2012).</w:t>
       </w:r>
     </w:p>
     <w:p>
@@ -451,12 +468,13 @@
           <w:bCs w:val="false"/>
           <w:i w:val="false"/>
           <w:iCs w:val="false"/>
-          <w:color w:val="000000"/>
-          <w:sz w:val="24"/>
-          <w:szCs w:val="24"/>
-          <w:rtl/>
-        </w:rPr>
-        <w:t xml:space="preserve">מחקרים חוצי-תרבות המשיכו לתמוך בתוקף ובמהימנות של הכלי. כך, תיקוף עדכני של הגרסה האיטלקית של ה-NGSE, שנערך על 811 משתתפים, אישר מבנה חד-גורמי, התאמה טובה של המודל לנתונים ומהימנות גבוהה, וחיזק את יישום השאלון בשפות ובתרבויות שונות (Rossi et al., 2025).</w:t>
+          <w:noProof/>
+          <w:color w:val="000000"/>
+          <w:sz w:val="24"/>
+          <w:szCs w:val="24"/>
+          <w:rtl/>
+        </w:rPr>
+        <w:t xml:space="preserve">בעוד שהמודל המקורי עסק בעיקר בחוללות ספציפית למשימה, התפתח בהמשך המושג של חוללות עצמית כללית, אמונה יציבה יחסית ביכולת להתמודד עם מגוון רחב של מצבים ואתגרים. לצורך מדידתה פותח שאלון החוללות העצמית הכללית (NGSE), כלי בן שמונה פריטים שהראה עקיבות פנימית גבוהה ותכונות פסיכומטריות טובות, ונמצא עדיף על כלים קודמים (Chen, Gully, &amp; Eden, 2001).</w:t>
       </w:r>
     </w:p>
     <w:p>
@@ -472,12 +490,13 @@
           <w:bCs w:val="false"/>
           <w:i w:val="false"/>
           <w:iCs w:val="false"/>
-          <w:color w:val="000000"/>
-          <w:sz w:val="24"/>
-          <w:szCs w:val="24"/>
-          <w:rtl/>
-        </w:rPr>
-        <w:t xml:space="preserve">לצד המדד הכללי פותחו גם מדדים ספציפיים לתחומים מסוימים. בתחום ההוראה, הכלי הנפוץ ביותר הוא שאלון תחושת המסוגלות של המורה (TSES), הבוחן את אמונת המורה ביכולתו להשפיע בשלושה תחומים: מעורבות תלמידים, אסטרטגיות הוראה וניהול כיתה. הכלי מעוגן בתיאוריה של בנדורה ומשמש הן עם מורים בפועל והן עם סטודנטים בהכשרה להוראה (Tschannen-Moran &amp; Woolfolk Hoy, 2001).</w:t>
+          <w:noProof/>
+          <w:color w:val="000000"/>
+          <w:sz w:val="24"/>
+          <w:szCs w:val="24"/>
+          <w:rtl/>
+        </w:rPr>
+        <w:t xml:space="preserve">מחקרים חוצי-תרבות המשיכו לתמוך בתוקף ובמהימנות של הכלי. כך, תיקוף עדכני של הגרסה האיטלקית של ה-NGSE, שנערך על 811 משתתפים, אישר מבנה חד-גורמי, התאמה טובה של המודל לנתונים ומהימנות גבוהה, וחיזק את יישום השאלון בשפות ובתרבויות שונות (Rossi et al., 2025).</w:t>
       </w:r>
     </w:p>
     <w:p>
@@ -493,12 +512,13 @@
           <w:bCs w:val="false"/>
           <w:i w:val="false"/>
           <w:iCs w:val="false"/>
-          <w:color w:val="000000"/>
-          <w:sz w:val="24"/>
-          <w:szCs w:val="24"/>
-          <w:rtl/>
-        </w:rPr>
-        <w:t xml:space="preserve">לחוללות העצמית תפקיד מרכזי במוטיבציה ובלמידה. סקירה מקיפה שתורגמה לעברית מתארת כיצד תחושת המסוגלות משפיעה על עירור ההתנהגות, על בחירת המשימות, על המאמץ ועל ההתמדה, וכיצד היא עצמה מתעצבת מהצבת מטרות, מעיבוד מידע וממשוב, ומסכמת עדויות לכך שהיא מנבאת תוצאות מוטיבציוניות ולימודיות (שאנק, 2001).</w:t>
+          <w:noProof/>
+          <w:color w:val="000000"/>
+          <w:sz w:val="24"/>
+          <w:szCs w:val="24"/>
+          <w:rtl/>
+        </w:rPr>
+        <w:t xml:space="preserve">לצד המדד הכללי פותחו גם מדדים ספציפיים לתחומים מסוימים. בתחום ההוראה, הכלי הנפוץ ביותר הוא שאלון תחושת המסוגלות של המורה (TSES), הבוחן את אמונת המורה ביכולתו להשפיע בשלושה תחומים: מעורבות תלמידים, אסטרטגיות הוראה וניהול כיתה. הכלי מעוגן בתיאוריה של בנדורה ומשמש הן עם מורים בפועל והן עם סטודנטים בהכשרה להוראה (Tschannen-Moran &amp; Woolfolk Hoy, 2001).</w:t>
       </w:r>
     </w:p>
     <w:p>
@@ -514,12 +534,13 @@
           <w:bCs w:val="false"/>
           <w:i w:val="false"/>
           <w:iCs w:val="false"/>
-          <w:color w:val="000000"/>
-          <w:sz w:val="24"/>
-          <w:szCs w:val="24"/>
-          <w:rtl/>
-        </w:rPr>
-        <w:t xml:space="preserve">עדות עדכנית לקשר הזה עולה ממחקר רחב היקף שנערך על יותר מ-2,300 תלמידים. נמצא בו שתחושת החוללות העצמית היא המנבא החזק ביותר של הישגים לימודיים, חזק אף מהמוטיבציה עצמה, ושהיא מתווכת את הקשר בין תמיכה בצרכים הפסיכולוגיים לבין ההישגים (Basileo et al., 2024).</w:t>
+          <w:noProof/>
+          <w:color w:val="000000"/>
+          <w:sz w:val="24"/>
+          <w:szCs w:val="24"/>
+          <w:rtl/>
+        </w:rPr>
+        <w:t xml:space="preserve">לחוללות העצמית תפקיד מרכזי במוטיבציה ובלמידה. סקירה מקיפה שתורגמה לעברית מתארת כיצד תחושת המסוגלות משפיעה על עירור ההתנהגות, על בחירת המשימות, על המאמץ ועל ההתמדה, וכיצד היא עצמה מתעצבת מהצבת מטרות, מעיבוד מידע וממשוב, ומסכמת עדויות לכך שהיא מנבאת תוצאות מוטיבציוניות ולימודיות (שאנק, 2001).</w:t>
       </w:r>
     </w:p>
     <w:p>
@@ -535,12 +556,13 @@
           <w:bCs w:val="false"/>
           <w:i w:val="false"/>
           <w:iCs w:val="false"/>
-          <w:color w:val="000000"/>
-          <w:sz w:val="24"/>
-          <w:szCs w:val="24"/>
-          <w:rtl/>
-        </w:rPr>
-        <w:t xml:space="preserve">בהקשר של למידה מקוונת, שהתרחבה מאוד בשנים האחרונות, נבחן הכוח המנבא של החוללות. נמצא שחוללות עצמית וחוסן מנבאים יחד את המוטיבציה הלימודית של סטודנטים, כך שככל שתחושת המסוגלות גבוהה יותר, כך המוטיבציה גבוהה יותר (Abdolrezapour, Jahanbakhsh Ganjeh, &amp; Ghanbari, 2023).</w:t>
+          <w:noProof/>
+          <w:color w:val="000000"/>
+          <w:sz w:val="24"/>
+          <w:szCs w:val="24"/>
+          <w:rtl/>
+        </w:rPr>
+        <w:t xml:space="preserve">עדות עדכנית לקשר הזה עולה ממחקר רחב היקף שנערך על יותר מ-2,300 תלמידים. נמצא בו שתחושת החוללות העצמית היא המנבא החזק ביותר של הישגים לימודיים, חזק אף מהמוטיבציה עצמה, ושהיא מתווכת את הקשר בין תמיכה בצרכים הפסיכולוגיים לבין ההישגים (Basileo et al., 2024).</w:t>
       </w:r>
     </w:p>
     <w:p>
@@ -556,12 +578,13 @@
           <w:bCs w:val="false"/>
           <w:i w:val="false"/>
           <w:iCs w:val="false"/>
-          <w:color w:val="000000"/>
-          <w:sz w:val="24"/>
-          <w:szCs w:val="24"/>
-          <w:rtl/>
-        </w:rPr>
-        <w:t xml:space="preserve">גם בישראל נחקרה תחושת המסוגלות בהקשרים חינוכיים. עבודה שעסקה במסוגלות של מורים דנה במשמעות המושג, בדרכים למדוד אותו, ובתפקיד שיכול למלא היועץ החינוכי בחיזוק תחושת המסוגלות של המורה (לב וריץ', 1999).</w:t>
+          <w:noProof/>
+          <w:color w:val="000000"/>
+          <w:sz w:val="24"/>
+          <w:szCs w:val="24"/>
+          <w:rtl/>
+        </w:rPr>
+        <w:t xml:space="preserve">בהקשר של למידה מקוונת, שהתרחבה מאוד בשנים האחרונות, נבחן הכוח המנבא של החוללות. נמצא שחוללות עצמית וחוסן מנבאים יחד את המוטיבציה הלימודית של סטודנטים, כך שככל שתחושת המסוגלות גבוהה יותר, כך המוטיבציה גבוהה יותר (Abdolrezapour, Jahanbakhsh Ganjeh, &amp; Ghanbari, 2023).</w:t>
       </w:r>
     </w:p>
     <w:p>
@@ -577,12 +600,13 @@
           <w:bCs w:val="false"/>
           <w:i w:val="false"/>
           <w:iCs w:val="false"/>
-          <w:color w:val="000000"/>
-          <w:sz w:val="24"/>
-          <w:szCs w:val="24"/>
-          <w:rtl/>
-        </w:rPr>
-        <w:t xml:space="preserve">מחקר מאוחר יותר הרחיב את היריעה לבעלי תפקידים נוספים במערכת החינוך, ובחן את תחושת המסוגלות העצמית של סייעות פדגוגיות העובדות עם תלמידים בעלי צרכים מיוחדים, תוך עמידה על המשאבים והאתגרים המעצבים אותה (גרינבנק ואגם בן-ארצי, 2018).</w:t>
+          <w:noProof/>
+          <w:color w:val="000000"/>
+          <w:sz w:val="24"/>
+          <w:szCs w:val="24"/>
+          <w:rtl/>
+        </w:rPr>
+        <w:t xml:space="preserve">גם בישראל נחקרה תחושת המסוגלות בהקשרים חינוכיים. עבודה שעסקה במסוגלות של מורים דנה במשמעות המושג, בדרכים למדוד אותו, ובתפקיד שיכול למלא היועץ החינוכי בחיזוק תחושת המסוגלות של המורה (לב וריץ', 1999).</w:t>
       </w:r>
     </w:p>
     <w:p>
@@ -598,12 +622,13 @@
           <w:bCs w:val="false"/>
           <w:i w:val="false"/>
           <w:iCs w:val="false"/>
-          <w:color w:val="000000"/>
-          <w:sz w:val="24"/>
-          <w:szCs w:val="24"/>
-          <w:rtl/>
-        </w:rPr>
-        <w:t xml:space="preserve">בזירת ההכלה נבדק הקשר בין תחושת המסוגלות העצמית של מורים לבין עמדות והתנהגויות כלפי תלמידים עם הפרעת למידה ספציפית, ונמצא שתחושת מסוגלות גבוהה נקשרת ליכולת הכלה ולאמפתיה רבה יותר כלפי תלמידים אלה (זבידאת, דלאשה ובשיר, 2019).</w:t>
+          <w:noProof/>
+          <w:color w:val="000000"/>
+          <w:sz w:val="24"/>
+          <w:szCs w:val="24"/>
+          <w:rtl/>
+        </w:rPr>
+        <w:t xml:space="preserve">מחקר מאוחר יותר הרחיב את היריעה לבעלי תפקידים נוספים במערכת החינוך, ובחן את תחושת המסוגלות העצמית של סייעות פדגוגיות העובדות עם תלמידים בעלי צרכים מיוחדים, תוך עמידה על המשאבים והאתגרים המעצבים אותה (גרינבנק ואגם בן-ארצי, 2018).</w:t>
       </w:r>
     </w:p>
     <w:p>
@@ -619,12 +644,13 @@
           <w:bCs w:val="false"/>
           <w:i w:val="false"/>
           <w:iCs w:val="false"/>
-          <w:color w:val="000000"/>
-          <w:sz w:val="24"/>
-          <w:szCs w:val="24"/>
-          <w:rtl/>
-        </w:rPr>
-        <w:t xml:space="preserve">בחברה הערבית בישראל נבחנה תחושת המסוגלות של מטפלות-מחנכות בגיל הרך ביחס לשחיקה, לנדידת מחשבות ולתפיסת הקשר עם ההורים, ונמצא שקשר חיובי עם ההורים נקשר לתחושת מסוגלות עצמית גבוהה יותר, ממצא המדגיש את חשיבות הסביבה היחסית בעיצוב המסוגלות (אבו-אסעד ואביטן, 2020).</w:t>
+          <w:noProof/>
+          <w:color w:val="000000"/>
+          <w:sz w:val="24"/>
+          <w:szCs w:val="24"/>
+          <w:rtl/>
+        </w:rPr>
+        <w:t xml:space="preserve">בזירת ההכלה נבדק הקשר בין תחושת המסוגלות העצמית של מורים לבין עמדות והתנהגויות כלפי תלמידים עם הפרעת למידה ספציפית, ונמצא שתחושת מסוגלות גבוהה נקשרת ליכולת הכלה ולאמפתיה רבה יותר כלפי תלמידים אלה (זבידאת, דלאשה ובשיר, 2019).</w:t>
       </w:r>
     </w:p>
     <w:p>
@@ -640,12 +666,13 @@
           <w:bCs w:val="false"/>
           <w:i w:val="false"/>
           <w:iCs w:val="false"/>
-          <w:color w:val="000000"/>
-          <w:sz w:val="24"/>
-          <w:szCs w:val="24"/>
-          <w:rtl/>
-        </w:rPr>
-        <w:t xml:space="preserve">ההקשר החינוכי ממחיש היטב את חשיבות הנושא. תחושת המסוגלות של מורים ושל סטודנטים בהכשרה להוראה נמצאה קשורה למחויבות למקצוע, להכלה, לאמפתיה כלפי תלמידים ולהתמודדות עם שחיקה, ותחושת מסוגלות כללית גבוהה מהווה בסיס לתחושת המסוגלות המקצועית שתתפתח בהמשך. עם זאת, רוב המחקרים בתחום הם מתאמיים, ומעטים בחנו בתנאי ניסוי האם ניתן להעלות את תחושת המסוגלות של סטודנטים להוראה, ואיזה מקור עושה זאת ביעילות רבה יותר.</w:t>
+          <w:noProof/>
+          <w:color w:val="000000"/>
+          <w:sz w:val="24"/>
+          <w:szCs w:val="24"/>
+          <w:rtl/>
+        </w:rPr>
+        <w:t xml:space="preserve">בחברה הערבית בישראל נבחנה תחושת המסוגלות של מטפלות-מחנכות בגיל הרך ביחס לשחיקה, לנדידת מחשבות ולתפיסת הקשר עם ההורים, ונמצא שקשר חיובי עם ההורים נקשר לתחושת מסוגלות עצמית גבוהה יותר, ממצא המדגיש את חשיבות הסביבה היחסית בעיצוב המסוגלות (אבו-אסעד ואביטן, 2020).</w:t>
       </w:r>
     </w:p>
     <w:p>
@@ -661,6 +688,29 @@
           <w:bCs w:val="false"/>
           <w:i w:val="false"/>
           <w:iCs w:val="false"/>
+          <w:noProof/>
+          <w:color w:val="000000"/>
+          <w:sz w:val="24"/>
+          <w:szCs w:val="24"/>
+          <w:rtl/>
+        </w:rPr>
+        <w:t xml:space="preserve">ההקשר החינוכי ממחיש היטב את חשיבות הנושא. תחושת המסוגלות של מורים ושל סטודנטים בהכשרה להוראה נמצאה קשורה למחויבות למקצוע, להכלה, לאמפתיה כלפי תלמידים ולהתמודדות עם שחיקה, ותחושת מסוגלות כללית גבוהה מהווה בסיס לתחושת המסוגלות המקצועית שתתפתח בהמשך. עם זאת, רוב המחקרים בתחום הם מתאמיים, ומעטים בחנו בתנאי ניסוי האם ניתן להעלות את תחושת המסוגלות של סטודנטים להוראה, ואיזה מקור עושה זאת ביעילות רבה יותר.</w:t>
+      </w:r>
+    </w:p>
+    <w:p>
+      <w:pPr>
+        <w:bidi/>
+        <w:spacing w:after="160" w:before="0" w:line="360"/>
+        <w:jc w:val="both"/>
+      </w:pPr>
+      <w:r>
+        <w:rPr>
+          <w:rFonts w:ascii="David" w:cs="David" w:eastAsia="David" w:hAnsi="David"/>
+          <w:b w:val="false"/>
+          <w:bCs w:val="false"/>
+          <w:i w:val="false"/>
+          <w:iCs w:val="false"/>
+          <w:noProof/>
           <w:color w:val="000000"/>
           <w:sz w:val="24"/>
           <w:szCs w:val="24"/>
@@ -682,6 +732,7 @@
           <w:bCs w:val="false"/>
           <w:i w:val="false"/>
           <w:iCs w:val="false"/>
+          <w:noProof/>
           <w:color w:val="000000"/>
           <w:sz w:val="24"/>
           <w:szCs w:val="24"/>
@@ -703,6 +754,7 @@
           <w:bCs/>
           <w:i w:val="false"/>
           <w:iCs w:val="false"/>
+          <w:noProof/>
           <w:color w:val="000000"/>
           <w:sz w:val="24"/>
           <w:szCs w:val="24"/>
@@ -717,6 +769,7 @@
           <w:bCs w:val="false"/>
           <w:i w:val="false"/>
           <w:iCs w:val="false"/>
+          <w:noProof/>
           <w:color w:val="000000"/>
           <w:sz w:val="24"/>
           <w:szCs w:val="24"/>
@@ -738,6 +791,7 @@
           <w:bCs/>
           <w:i w:val="false"/>
           <w:iCs w:val="false"/>
+          <w:noProof/>
           <w:color w:val="000000"/>
           <w:sz w:val="24"/>
           <w:szCs w:val="24"/>
@@ -752,6 +806,7 @@
           <w:bCs w:val="false"/>
           <w:i w:val="false"/>
           <w:iCs w:val="false"/>
+          <w:noProof/>
           <w:color w:val="000000"/>
           <w:sz w:val="24"/>
           <w:szCs w:val="24"/>
@@ -773,6 +828,7 @@
           <w:bCs/>
           <w:i w:val="false"/>
           <w:iCs w:val="false"/>
+          <w:noProof/>
           <w:color w:val="000000"/>
           <w:sz w:val="24"/>
           <w:szCs w:val="24"/>
@@ -787,6 +843,7 @@
           <w:bCs w:val="false"/>
           <w:i w:val="false"/>
           <w:iCs w:val="false"/>
+          <w:noProof/>
           <w:color w:val="000000"/>
           <w:sz w:val="24"/>
           <w:szCs w:val="24"/>
@@ -808,6 +865,7 @@
           <w:bCs/>
           <w:i w:val="false"/>
           <w:iCs w:val="false"/>
+          <w:noProof/>
           <w:color w:val="000000"/>
           <w:sz w:val="24"/>
           <w:szCs w:val="24"/>
@@ -822,6 +880,7 @@
           <w:bCs w:val="false"/>
           <w:i w:val="false"/>
           <w:iCs w:val="false"/>
+          <w:noProof/>
           <w:color w:val="000000"/>
           <w:sz w:val="24"/>
           <w:szCs w:val="24"/>
@@ -849,6 +908,7 @@
           <w:bCs/>
           <w:i w:val="false"/>
           <w:iCs w:val="false"/>
+          <w:noProof/>
           <w:color w:val="000000"/>
           <w:sz w:val="30"/>
           <w:szCs w:val="30"/>
@@ -871,6 +931,7 @@
           <w:bCs/>
           <w:i w:val="false"/>
           <w:iCs w:val="false"/>
+          <w:noProof/>
           <w:color w:val="000000"/>
           <w:sz w:val="26"/>
           <w:szCs w:val="26"/>
@@ -892,6 +953,7 @@
           <w:bCs w:val="false"/>
           <w:i w:val="false"/>
           <w:iCs w:val="false"/>
+          <w:noProof/>
           <w:color w:val="000000"/>
           <w:sz w:val="24"/>
           <w:szCs w:val="24"/>
@@ -914,6 +976,7 @@
           <w:bCs/>
           <w:i w:val="false"/>
           <w:iCs w:val="false"/>
+          <w:noProof/>
           <w:color w:val="000000"/>
           <w:sz w:val="26"/>
           <w:szCs w:val="26"/>
@@ -935,6 +998,7 @@
           <w:bCs/>
           <w:i w:val="false"/>
           <w:iCs w:val="false"/>
+          <w:noProof/>
           <w:color w:val="000000"/>
           <w:sz w:val="24"/>
           <w:szCs w:val="24"/>
@@ -949,6 +1013,7 @@
           <w:bCs w:val="false"/>
           <w:i w:val="false"/>
           <w:iCs w:val="false"/>
+          <w:noProof/>
           <w:color w:val="000000"/>
           <w:sz w:val="24"/>
           <w:szCs w:val="24"/>
@@ -970,6 +1035,7 @@
           <w:bCs/>
           <w:i w:val="false"/>
           <w:iCs w:val="false"/>
+          <w:noProof/>
           <w:color w:val="000000"/>
           <w:sz w:val="24"/>
           <w:szCs w:val="24"/>
@@ -984,6 +1050,7 @@
           <w:bCs w:val="false"/>
           <w:i w:val="false"/>
           <w:iCs w:val="false"/>
+          <w:noProof/>
           <w:color w:val="000000"/>
           <w:sz w:val="24"/>
           <w:szCs w:val="24"/>
@@ -1005,6 +1072,7 @@
           <w:bCs/>
           <w:i w:val="false"/>
           <w:iCs w:val="false"/>
+          <w:noProof/>
           <w:color w:val="000000"/>
           <w:sz w:val="24"/>
           <w:szCs w:val="24"/>
@@ -1019,6 +1087,7 @@
           <w:bCs w:val="false"/>
           <w:i w:val="false"/>
           <w:iCs w:val="false"/>
+          <w:noProof/>
           <w:color w:val="000000"/>
           <w:sz w:val="24"/>
           <w:szCs w:val="24"/>
@@ -1040,6 +1109,7 @@
           <w:bCs/>
           <w:i w:val="false"/>
           <w:iCs w:val="false"/>
+          <w:noProof/>
           <w:color w:val="000000"/>
           <w:sz w:val="24"/>
           <w:szCs w:val="24"/>
@@ -1054,6 +1124,7 @@
           <w:bCs w:val="false"/>
           <w:i w:val="false"/>
           <w:iCs w:val="false"/>
+          <w:noProof/>
           <w:color w:val="000000"/>
           <w:sz w:val="24"/>
           <w:szCs w:val="24"/>
@@ -1076,6 +1147,7 @@
           <w:bCs/>
           <w:i w:val="false"/>
           <w:iCs w:val="false"/>
+          <w:noProof/>
           <w:color w:val="000000"/>
           <w:sz w:val="26"/>
           <w:szCs w:val="26"/>
@@ -1097,6 +1169,7 @@
           <w:bCs w:val="false"/>
           <w:i w:val="false"/>
           <w:iCs w:val="false"/>
+          <w:noProof/>
           <w:color w:val="000000"/>
           <w:sz w:val="24"/>
           <w:szCs w:val="24"/>
@@ -1124,6 +1197,7 @@
           <w:bCs/>
           <w:i w:val="false"/>
           <w:iCs w:val="false"/>
+          <w:noProof/>
           <w:color w:val="000000"/>
           <w:sz w:val="30"/>
           <w:szCs w:val="30"/>
@@ -1146,6 +1220,7 @@
           <w:bCs/>
           <w:i w:val="false"/>
           <w:iCs w:val="false"/>
+          <w:noProof/>
           <w:color w:val="000000"/>
           <w:sz w:val="26"/>
           <w:szCs w:val="26"/>
@@ -1167,6 +1242,7 @@
           <w:bCs w:val="false"/>
           <w:i w:val="false"/>
           <w:iCs w:val="false"/>
+          <w:noProof/>
           <w:color w:val="000000"/>
           <w:sz w:val="24"/>
           <w:szCs w:val="24"/>
@@ -1189,6 +1265,7 @@
           <w:bCs/>
           <w:i w:val="false"/>
           <w:iCs w:val="false"/>
+          <w:noProof/>
           <w:color w:val="000000"/>
           <w:sz w:val="26"/>
           <w:szCs w:val="26"/>
@@ -1210,6 +1287,7 @@
           <w:bCs w:val="false"/>
           <w:i w:val="false"/>
           <w:iCs w:val="false"/>
+          <w:noProof/>
           <w:color w:val="000000"/>
           <w:sz w:val="24"/>
           <w:szCs w:val="24"/>
@@ -1231,6 +1309,7 @@
           <w:bCs/>
           <w:i w:val="false"/>
           <w:iCs w:val="false"/>
+          <w:noProof/>
           <w:color w:val="000000"/>
           <w:sz w:val="24"/>
           <w:szCs w:val="24"/>
@@ -1245,6 +1324,7 @@
           <w:bCs w:val="false"/>
           <w:i w:val="false"/>
           <w:iCs w:val="false"/>
+          <w:noProof/>
           <w:color w:val="000000"/>
           <w:sz w:val="24"/>
           <w:szCs w:val="24"/>
@@ -1300,6 +1380,7 @@
                 <w:bCs/>
                 <w:i w:val="false"/>
                 <w:iCs w:val="false"/>
+                <w:noProof/>
                 <w:color w:val="000000"/>
                 <w:sz w:val="24"/>
                 <w:szCs w:val="24"/>
@@ -1332,6 +1413,7 @@
                 <w:bCs/>
                 <w:i w:val="false"/>
                 <w:iCs w:val="false"/>
+                <w:noProof/>
                 <w:color w:val="000000"/>
                 <w:sz w:val="24"/>
                 <w:szCs w:val="24"/>
@@ -1364,6 +1446,7 @@
                 <w:bCs/>
                 <w:i w:val="false"/>
                 <w:iCs w:val="false"/>
+                <w:noProof/>
                 <w:color w:val="000000"/>
                 <w:sz w:val="24"/>
                 <w:szCs w:val="24"/>
@@ -1396,6 +1479,7 @@
                 <w:bCs/>
                 <w:i w:val="false"/>
                 <w:iCs w:val="false"/>
+                <w:noProof/>
                 <w:color w:val="000000"/>
                 <w:sz w:val="24"/>
                 <w:szCs w:val="24"/>
@@ -1430,6 +1514,7 @@
                 <w:bCs w:val="false"/>
                 <w:i w:val="false"/>
                 <w:iCs w:val="false"/>
+                <w:noProof/>
                 <w:color w:val="000000"/>
                 <w:sz w:val="24"/>
                 <w:szCs w:val="24"/>
@@ -1462,6 +1547,7 @@
                 <w:bCs w:val="false"/>
                 <w:i w:val="false"/>
                 <w:iCs w:val="false"/>
+                <w:noProof/>
                 <w:color w:val="000000"/>
                 <w:sz w:val="24"/>
                 <w:szCs w:val="24"/>
@@ -1494,6 +1580,7 @@
                 <w:bCs w:val="false"/>
                 <w:i w:val="false"/>
                 <w:iCs w:val="false"/>
+                <w:noProof/>
                 <w:color w:val="000000"/>
                 <w:sz w:val="24"/>
                 <w:szCs w:val="24"/>
@@ -1526,6 +1613,7 @@
                 <w:bCs w:val="false"/>
                 <w:i w:val="false"/>
                 <w:iCs w:val="false"/>
+                <w:noProof/>
                 <w:color w:val="000000"/>
                 <w:sz w:val="24"/>
                 <w:szCs w:val="24"/>
@@ -1560,6 +1648,7 @@
                 <w:bCs w:val="false"/>
                 <w:i w:val="false"/>
                 <w:iCs w:val="false"/>
+                <w:noProof/>
                 <w:color w:val="000000"/>
                 <w:sz w:val="24"/>
                 <w:szCs w:val="24"/>
@@ -1592,6 +1681,7 @@
                 <w:bCs w:val="false"/>
                 <w:i w:val="false"/>
                 <w:iCs w:val="false"/>
+                <w:noProof/>
                 <w:color w:val="000000"/>
                 <w:sz w:val="24"/>
                 <w:szCs w:val="24"/>
@@ -1624,6 +1714,7 @@
                 <w:bCs w:val="false"/>
                 <w:i w:val="false"/>
                 <w:iCs w:val="false"/>
+                <w:noProof/>
                 <w:color w:val="000000"/>
                 <w:sz w:val="24"/>
                 <w:szCs w:val="24"/>
@@ -1656,6 +1747,7 @@
                 <w:bCs w:val="false"/>
                 <w:i w:val="false"/>
                 <w:iCs w:val="false"/>
+                <w:noProof/>
                 <w:color w:val="000000"/>
                 <w:sz w:val="24"/>
                 <w:szCs w:val="24"/>
@@ -1690,6 +1782,7 @@
                 <w:bCs w:val="false"/>
                 <w:i w:val="false"/>
                 <w:iCs w:val="false"/>
+                <w:noProof/>
                 <w:color w:val="000000"/>
                 <w:sz w:val="24"/>
                 <w:szCs w:val="24"/>
@@ -1722,6 +1815,7 @@
                 <w:bCs w:val="false"/>
                 <w:i w:val="false"/>
                 <w:iCs w:val="false"/>
+                <w:noProof/>
                 <w:color w:val="000000"/>
                 <w:sz w:val="24"/>
                 <w:szCs w:val="24"/>
@@ -1754,6 +1848,7 @@
                 <w:bCs w:val="false"/>
                 <w:i w:val="false"/>
                 <w:iCs w:val="false"/>
+                <w:noProof/>
                 <w:color w:val="000000"/>
                 <w:sz w:val="24"/>
                 <w:szCs w:val="24"/>
@@ -1786,6 +1881,7 @@
                 <w:bCs w:val="false"/>
                 <w:i w:val="false"/>
                 <w:iCs w:val="false"/>
+                <w:noProof/>
                 <w:color w:val="000000"/>
                 <w:sz w:val="24"/>
                 <w:szCs w:val="24"/>
@@ -1810,6 +1906,7 @@
           <w:bCs w:val="false"/>
           <w:i w:val="false"/>
           <w:iCs w:val="false"/>
+          <w:noProof/>
           <w:color w:val="000000"/>
           <w:sz w:val="24"/>
           <w:szCs w:val="24"/>
@@ -1831,6 +1928,7 @@
           <w:bCs w:val="false"/>
           <w:i w:val="false"/>
           <w:iCs w:val="false"/>
+          <w:noProof/>
           <w:color w:val="000000"/>
           <w:sz w:val="24"/>
           <w:szCs w:val="24"/>
@@ -1899,6 +1997,7 @@
           <w:bCs/>
           <w:i w:val="false"/>
           <w:iCs w:val="false"/>
+          <w:noProof/>
           <w:color w:val="000000"/>
           <w:sz w:val="24"/>
           <w:szCs w:val="24"/>
@@ -1913,6 +2012,7 @@
           <w:bCs w:val="false"/>
           <w:i w:val="false"/>
           <w:iCs w:val="false"/>
+          <w:noProof/>
           <w:color w:val="000000"/>
           <w:sz w:val="24"/>
           <w:szCs w:val="24"/>
@@ -1935,6 +2035,7 @@
           <w:bCs/>
           <w:i w:val="false"/>
           <w:iCs w:val="false"/>
+          <w:noProof/>
           <w:color w:val="000000"/>
           <w:sz w:val="26"/>
           <w:szCs w:val="26"/>
@@ -1956,6 +2057,7 @@
           <w:bCs w:val="false"/>
           <w:i w:val="false"/>
           <w:iCs w:val="false"/>
+          <w:noProof/>
           <w:color w:val="000000"/>
           <w:sz w:val="24"/>
           <w:szCs w:val="24"/>
@@ -1977,6 +2079,7 @@
           <w:bCs/>
           <w:i w:val="false"/>
           <w:iCs w:val="false"/>
+          <w:noProof/>
           <w:color w:val="000000"/>
           <w:sz w:val="24"/>
           <w:szCs w:val="24"/>
@@ -1991,6 +2094,7 @@
           <w:bCs w:val="false"/>
           <w:i w:val="false"/>
           <w:iCs w:val="false"/>
+          <w:noProof/>
           <w:color w:val="000000"/>
           <w:sz w:val="24"/>
           <w:szCs w:val="24"/>
@@ -2046,6 +2150,7 @@
                 <w:bCs/>
                 <w:i w:val="false"/>
                 <w:iCs w:val="false"/>
+                <w:noProof/>
                 <w:color w:val="000000"/>
                 <w:sz w:val="24"/>
                 <w:szCs w:val="24"/>
@@ -2078,6 +2183,7 @@
                 <w:bCs/>
                 <w:i w:val="false"/>
                 <w:iCs w:val="false"/>
+                <w:noProof/>
                 <w:color w:val="000000"/>
                 <w:sz w:val="24"/>
                 <w:szCs w:val="24"/>
@@ -2110,6 +2216,7 @@
                 <w:bCs/>
                 <w:i w:val="false"/>
                 <w:iCs w:val="false"/>
+                <w:noProof/>
                 <w:color w:val="000000"/>
                 <w:sz w:val="24"/>
                 <w:szCs w:val="24"/>
@@ -2142,6 +2249,7 @@
                 <w:bCs/>
                 <w:i w:val="false"/>
                 <w:iCs w:val="false"/>
+                <w:noProof/>
                 <w:color w:val="000000"/>
                 <w:sz w:val="24"/>
                 <w:szCs w:val="24"/>
@@ -2176,6 +2284,7 @@
                 <w:bCs w:val="false"/>
                 <w:i w:val="false"/>
                 <w:iCs w:val="false"/>
+                <w:noProof/>
                 <w:color w:val="000000"/>
                 <w:sz w:val="24"/>
                 <w:szCs w:val="24"/>
@@ -2208,6 +2317,7 @@
                 <w:bCs w:val="false"/>
                 <w:i w:val="false"/>
                 <w:iCs w:val="false"/>
+                <w:noProof/>
                 <w:color w:val="000000"/>
                 <w:sz w:val="24"/>
                 <w:szCs w:val="24"/>
@@ -2240,6 +2350,7 @@
                 <w:bCs w:val="false"/>
                 <w:i w:val="false"/>
                 <w:iCs w:val="false"/>
+                <w:noProof/>
                 <w:color w:val="000000"/>
                 <w:sz w:val="24"/>
                 <w:szCs w:val="24"/>
@@ -2272,6 +2383,7 @@
                 <w:bCs w:val="false"/>
                 <w:i w:val="false"/>
                 <w:iCs w:val="false"/>
+                <w:noProof/>
                 <w:color w:val="000000"/>
                 <w:sz w:val="24"/>
                 <w:szCs w:val="24"/>
@@ -2306,6 +2418,7 @@
                 <w:bCs w:val="false"/>
                 <w:i w:val="false"/>
                 <w:iCs w:val="false"/>
+                <w:noProof/>
                 <w:color w:val="000000"/>
                 <w:sz w:val="24"/>
                 <w:szCs w:val="24"/>
@@ -2338,6 +2451,7 @@
                 <w:bCs w:val="false"/>
                 <w:i w:val="false"/>
                 <w:iCs w:val="false"/>
+                <w:noProof/>
                 <w:color w:val="000000"/>
                 <w:sz w:val="24"/>
                 <w:szCs w:val="24"/>
@@ -2370,6 +2484,7 @@
                 <w:bCs w:val="false"/>
                 <w:i w:val="false"/>
                 <w:iCs w:val="false"/>
+                <w:noProof/>
                 <w:color w:val="000000"/>
                 <w:sz w:val="24"/>
                 <w:szCs w:val="24"/>
@@ -2402,6 +2517,7 @@
                 <w:bCs w:val="false"/>
                 <w:i w:val="false"/>
                 <w:iCs w:val="false"/>
+                <w:noProof/>
                 <w:color w:val="000000"/>
                 <w:sz w:val="24"/>
                 <w:szCs w:val="24"/>
@@ -2436,6 +2552,7 @@
                 <w:bCs w:val="false"/>
                 <w:i w:val="false"/>
                 <w:iCs w:val="false"/>
+                <w:noProof/>
                 <w:color w:val="000000"/>
                 <w:sz w:val="24"/>
                 <w:szCs w:val="24"/>
@@ -2468,6 +2585,7 @@
                 <w:bCs w:val="false"/>
                 <w:i w:val="false"/>
                 <w:iCs w:val="false"/>
+                <w:noProof/>
                 <w:color w:val="000000"/>
                 <w:sz w:val="24"/>
                 <w:szCs w:val="24"/>
@@ -2500,6 +2618,7 @@
                 <w:bCs w:val="false"/>
                 <w:i w:val="false"/>
                 <w:iCs w:val="false"/>
+                <w:noProof/>
                 <w:color w:val="000000"/>
                 <w:sz w:val="24"/>
                 <w:szCs w:val="24"/>
@@ -2532,6 +2651,7 @@
                 <w:bCs w:val="false"/>
                 <w:i w:val="false"/>
                 <w:iCs w:val="false"/>
+                <w:noProof/>
                 <w:color w:val="000000"/>
                 <w:sz w:val="24"/>
                 <w:szCs w:val="24"/>
@@ -2556,6 +2676,7 @@
           <w:bCs w:val="false"/>
           <w:i w:val="false"/>
           <w:iCs w:val="false"/>
+          <w:noProof/>
           <w:color w:val="000000"/>
           <w:sz w:val="24"/>
           <w:szCs w:val="24"/>
@@ -2577,6 +2698,7 @@
           <w:bCs w:val="false"/>
           <w:i w:val="false"/>
           <w:iCs w:val="false"/>
+          <w:noProof/>
           <w:color w:val="000000"/>
           <w:sz w:val="24"/>
           <w:szCs w:val="24"/>
@@ -2645,6 +2767,7 @@
           <w:bCs/>
           <w:i w:val="false"/>
           <w:iCs w:val="false"/>
+          <w:noProof/>
           <w:color w:val="000000"/>
           <w:sz w:val="24"/>
           <w:szCs w:val="24"/>
@@ -2659,6 +2782,7 @@
           <w:bCs w:val="false"/>
           <w:i w:val="false"/>
           <w:iCs w:val="false"/>
+          <w:noProof/>
           <w:color w:val="000000"/>
           <w:sz w:val="24"/>
           <w:szCs w:val="24"/>
@@ -2681,6 +2805,7 @@
           <w:bCs/>
           <w:i w:val="false"/>
           <w:iCs w:val="false"/>
+          <w:noProof/>
           <w:color w:val="000000"/>
           <w:sz w:val="26"/>
           <w:szCs w:val="26"/>
@@ -2702,6 +2827,7 @@
           <w:bCs w:val="false"/>
           <w:i w:val="false"/>
           <w:iCs w:val="false"/>
+          <w:noProof/>
           <w:color w:val="000000"/>
           <w:sz w:val="24"/>
           <w:szCs w:val="24"/>
@@ -2729,6 +2855,7 @@
           <w:bCs/>
           <w:i w:val="false"/>
           <w:iCs w:val="false"/>
+          <w:noProof/>
           <w:color w:val="000000"/>
           <w:sz w:val="30"/>
           <w:szCs w:val="30"/>
@@ -2750,6 +2877,7 @@
           <w:bCs w:val="false"/>
           <w:i w:val="false"/>
           <w:iCs w:val="false"/>
+          <w:noProof/>
           <w:color w:val="000000"/>
           <w:sz w:val="24"/>
           <w:szCs w:val="24"/>
@@ -2771,6 +2899,7 @@
           <w:bCs w:val="false"/>
           <w:i w:val="false"/>
           <w:iCs w:val="false"/>
+          <w:noProof/>
           <w:color w:val="000000"/>
           <w:sz w:val="24"/>
           <w:szCs w:val="24"/>
@@ -2792,6 +2921,7 @@
           <w:bCs w:val="false"/>
           <w:i w:val="false"/>
           <w:iCs w:val="false"/>
+          <w:noProof/>
           <w:color w:val="000000"/>
           <w:sz w:val="24"/>
           <w:szCs w:val="24"/>
@@ -2813,6 +2943,7 @@
           <w:bCs w:val="false"/>
           <w:i w:val="false"/>
           <w:iCs w:val="false"/>
+          <w:noProof/>
           <w:color w:val="000000"/>
           <w:sz w:val="24"/>
           <w:szCs w:val="24"/>
@@ -2834,6 +2965,7 @@
           <w:bCs w:val="false"/>
           <w:i w:val="false"/>
           <w:iCs w:val="false"/>
+          <w:noProof/>
           <w:color w:val="000000"/>
           <w:sz w:val="24"/>
           <w:szCs w:val="24"/>
@@ -2855,26 +2987,28 @@
           <w:bCs/>
           <w:i w:val="false"/>
           <w:iCs w:val="false"/>
-          <w:color w:val="000000"/>
-          <w:sz w:val="24"/>
-          <w:szCs w:val="24"/>
-          <w:rtl/>
-        </w:rPr>
-        <w:t xml:space="preserve">השלכות יישומיות. </w:t>
-      </w:r>
-      <w:r>
-        <w:rPr>
-          <w:rFonts w:ascii="David" w:cs="David" w:eastAsia="David" w:hAnsi="David"/>
-          <w:b w:val="false"/>
-          <w:bCs w:val="false"/>
-          <w:i w:val="false"/>
-          <w:iCs w:val="false"/>
-          <w:color w:val="000000"/>
-          <w:sz w:val="24"/>
-          <w:szCs w:val="24"/>
-          <w:rtl/>
-        </w:rPr>
-        <w:t xml:space="preserve">מבחינה יישומית, הממצאים מצביעים על כך שאף התערבות קצרה, פשוטה וחסכונית במשאבים יכולה להעלות את תחושת המסוגלות של סטודנטים בהכשרה להוראה. שילוב של תרגילי היזכרות בהצלחות אישיות בתוך תוכניות ההכשרה, למשל לפני התנסות מעשית או לפני מטלה מאתגרת, עשוי לתמוך במוטיבציה, בהתמדה ובתחושת המוכנות של המתכשרים. מכיוון שתחושת המסוגלות של מורים נקשרה בספרות למחויבות למקצוע, להכלה ולהתמודדות עם שחיקה, חיזוקה כבר בשלב ההכשרה נושא ערך מעשי לטווח הארוך.</w:t>
+          <w:noProof/>
+          <w:color w:val="000000"/>
+          <w:sz w:val="24"/>
+          <w:szCs w:val="24"/>
+          <w:rtl/>
+        </w:rPr>
+        <w:t xml:space="preserve">תרומה תיאורטית. </w:t>
+      </w:r>
+      <w:r>
+        <w:rPr>
+          <w:rFonts w:ascii="David" w:cs="David" w:eastAsia="David" w:hAnsi="David"/>
+          <w:b w:val="false"/>
+          <w:bCs w:val="false"/>
+          <w:i w:val="false"/>
+          <w:iCs w:val="false"/>
+          <w:noProof/>
+          <w:color w:val="000000"/>
+          <w:sz w:val="24"/>
+          <w:szCs w:val="24"/>
+          <w:rtl/>
+        </w:rPr>
+        <w:t xml:space="preserve">מעבר לערכו היישומי, למחקר גם משמעות תיאורטית. הוא מחזק את התפיסה הרואה בחוללות העצמית לא רק תכונה יציבה אלא גם מצב הנתון להשפעה, ומדגים זאת בתנאי מעבדה מבוקרים. בכך הוא מרחיב את ספרות ההיזכרות בהצלחה, שעסקה בעיקר בציפיות להצלחה עתידית, אל עבר תחושת המסוגלות עצמה, ומחבר בין המסורת התיאורטית של בנדורה (Bandura, 1997) לבין העבודות העדכניות על אינדוקציה קוגניטיבית קצרה (Abdulla &amp; Woods, 2025). העובדה ששני מדדי מסוגלות שונים הושפעו מאותה מניפולציה, ונמצאו מתואמים ביניהם, מחזקת את התוקף של המסקנה ומצביעה על מנגנון משותף.</w:t>
       </w:r>
     </w:p>
     <w:p>
@@ -2890,26 +3024,28 @@
           <w:bCs/>
           <w:i w:val="false"/>
           <w:iCs w:val="false"/>
-          <w:color w:val="000000"/>
-          <w:sz w:val="24"/>
-          <w:szCs w:val="24"/>
-          <w:rtl/>
-        </w:rPr>
-        <w:t xml:space="preserve">מגבלות המחקר. </w:t>
-      </w:r>
-      <w:r>
-        <w:rPr>
-          <w:rFonts w:ascii="David" w:cs="David" w:eastAsia="David" w:hAnsi="David"/>
-          <w:b w:val="false"/>
-          <w:bCs w:val="false"/>
-          <w:i w:val="false"/>
-          <w:iCs w:val="false"/>
-          <w:color w:val="000000"/>
-          <w:sz w:val="24"/>
-          <w:szCs w:val="24"/>
-          <w:rtl/>
-        </w:rPr>
-        <w:t xml:space="preserve">לצד תרומותיו, למחקר כמה מגבלות. ראשית, מדובר במדגם נוחות קטן (N=33) המורכב מסטודנטים בהכשרה להוראה בלבד, ולכן ההכללה לאוכלוסייה הרחבה מוגבלת והעוצמה הסטטיסטית לזהות אפקטים בינוניים נמוכה. שנית, המחקר נשען על דיווח עצמי, החשוף להטיית רצייה חברתית ולמודעות המשתתף למטרת המשימה. שלישית, לא נמדדה רמת המסוגלות לפני המניפולציה, כך שההשוואה בין-נבדקית בלבד, וייתכן שהבדלים אישיים קודמים תרמו לשונות. רביעית, לא נכלל מבחן מניפולציה שיוודא שהמשימות אכן הפעילו את התהליכים המיועדים. לבסוף, נמדדה השפעה מיידית ומצבית בלבד, ואין בה כדי ללמד על שינוי יציב לאורך זמן.</w:t>
+          <w:noProof/>
+          <w:color w:val="000000"/>
+          <w:sz w:val="24"/>
+          <w:szCs w:val="24"/>
+          <w:rtl/>
+        </w:rPr>
+        <w:t xml:space="preserve">השלכות יישומיות. </w:t>
+      </w:r>
+      <w:r>
+        <w:rPr>
+          <w:rFonts w:ascii="David" w:cs="David" w:eastAsia="David" w:hAnsi="David"/>
+          <w:b w:val="false"/>
+          <w:bCs w:val="false"/>
+          <w:i w:val="false"/>
+          <w:iCs w:val="false"/>
+          <w:noProof/>
+          <w:color w:val="000000"/>
+          <w:sz w:val="24"/>
+          <w:szCs w:val="24"/>
+          <w:rtl/>
+        </w:rPr>
+        <w:t xml:space="preserve">מבחינה יישומית, הממצאים מצביעים על כך שאף התערבות קצרה, פשוטה וחסכונית במשאבים יכולה להעלות את תחושת המסוגלות של סטודנטים בהכשרה להוראה. שילוב של תרגילי היזכרות בהצלחות אישיות בתוך תוכניות ההכשרה, למשל לפני התנסות מעשית או לפני מטלה מאתגרת, עשוי לתמוך במוטיבציה, בהתמדה ובתחושת המוכנות של המתכשרים. מכיוון שתחושת המסוגלות של מורים נקשרה בספרות למחויבות למקצוע, להכלה ולהתמודדות עם שחיקה, חיזוקה כבר בשלב ההכשרה נושא ערך מעשי לטווח הארוך.</w:t>
       </w:r>
     </w:p>
     <w:p>
@@ -2925,26 +3061,28 @@
           <w:bCs/>
           <w:i w:val="false"/>
           <w:iCs w:val="false"/>
-          <w:color w:val="000000"/>
-          <w:sz w:val="24"/>
-          <w:szCs w:val="24"/>
-          <w:rtl/>
-        </w:rPr>
-        <w:t xml:space="preserve">הצעות למחקר עתידי. </w:t>
-      </w:r>
-      <w:r>
-        <w:rPr>
-          <w:rFonts w:ascii="David" w:cs="David" w:eastAsia="David" w:hAnsi="David"/>
-          <w:b w:val="false"/>
-          <w:bCs w:val="false"/>
-          <w:i w:val="false"/>
-          <w:iCs w:val="false"/>
-          <w:color w:val="000000"/>
-          <w:sz w:val="24"/>
-          <w:szCs w:val="24"/>
-          <w:rtl/>
-        </w:rPr>
-        <w:t xml:space="preserve">מחקרי המשך יוכלו להגדיל ולגוון את המדגם, ולהוסיף מדידת בסיס ותכנון עם מדידות חוזרות שיאפשר לאמוד את השינוי ברמת הפרט. כדאי לחזק את מניפולציית החשיפה העקיפה, למשל באמצעות מודל וידאו חי או מודל דומה למשתתף מבחינת גיל ורקע, ולהוסיף מבחן מניפולציה וכן מדדים לקלות השליפה ולייחוסים. כיוון נוסף הוא לבחון את עמידות האפקט לאורך זמן באמצעות מדידות חוזרות לאחר יום, שבוע וחודש, ולבדוק אם שילוב של היזכרות בהצלחה עם התנסות מעשית מייצר אפקט חזק ויציב יותר.</w:t>
+          <w:noProof/>
+          <w:color w:val="000000"/>
+          <w:sz w:val="24"/>
+          <w:szCs w:val="24"/>
+          <w:rtl/>
+        </w:rPr>
+        <w:t xml:space="preserve">מגבלות המחקר. </w:t>
+      </w:r>
+      <w:r>
+        <w:rPr>
+          <w:rFonts w:ascii="David" w:cs="David" w:eastAsia="David" w:hAnsi="David"/>
+          <w:b w:val="false"/>
+          <w:bCs w:val="false"/>
+          <w:i w:val="false"/>
+          <w:iCs w:val="false"/>
+          <w:noProof/>
+          <w:color w:val="000000"/>
+          <w:sz w:val="24"/>
+          <w:szCs w:val="24"/>
+          <w:rtl/>
+        </w:rPr>
+        <w:t xml:space="preserve">לצד תרומותיו, למחקר כמה מגבלות. ראשית, מדובר במדגם נוחות קטן (N=33) המורכב מסטודנטים בהכשרה להוראה בלבד, ולכן ההכללה לאוכלוסייה הרחבה מוגבלת והעוצמה הסטטיסטית לזהות אפקטים בינוניים נמוכה. שנית, המחקר נשען על דיווח עצמי, החשוף להטיית רצייה חברתית ולמודעות המשתתף למטרת המשימה. שלישית, לא נמדדה רמת המסוגלות לפני המניפולציה, כך שההשוואה בין-נבדקית בלבד, וייתכן שהבדלים אישיים קודמים תרמו לשונות. רביעית, לא נכלל מבחן מניפולציה שיוודא שהמשימות אכן הפעילו את התהליכים המיועדים. לבסוף, נמדדה השפעה מיידית ומצבית בלבד, ואין בה כדי ללמד על שינוי יציב לאורך זמן.</w:t>
       </w:r>
     </w:p>
     <w:p>
@@ -2960,6 +3098,44 @@
           <w:bCs/>
           <w:i w:val="false"/>
           <w:iCs w:val="false"/>
+          <w:noProof/>
+          <w:color w:val="000000"/>
+          <w:sz w:val="24"/>
+          <w:szCs w:val="24"/>
+          <w:rtl/>
+        </w:rPr>
+        <w:t xml:space="preserve">הצעות למחקר עתידי. </w:t>
+      </w:r>
+      <w:r>
+        <w:rPr>
+          <w:rFonts w:ascii="David" w:cs="David" w:eastAsia="David" w:hAnsi="David"/>
+          <w:b w:val="false"/>
+          <w:bCs w:val="false"/>
+          <w:i w:val="false"/>
+          <w:iCs w:val="false"/>
+          <w:noProof/>
+          <w:color w:val="000000"/>
+          <w:sz w:val="24"/>
+          <w:szCs w:val="24"/>
+          <w:rtl/>
+        </w:rPr>
+        <w:t xml:space="preserve">מחקרי המשך יוכלו להגדיל ולגוון את המדגם, ולהוסיף מדידת בסיס ותכנון עם מדידות חוזרות שיאפשר לאמוד את השינוי ברמת הפרט. כדאי לחזק את מניפולציית החשיפה העקיפה, למשל באמצעות מודל וידאו חי או מודל דומה למשתתף מבחינת גיל ורקע, ולהוסיף מבחן מניפולציה וכן מדדים לקלות השליפה ולייחוסים. כיוון נוסף הוא לבחון את עמידות האפקט לאורך זמן באמצעות מדידות חוזרות לאחר יום, שבוע וחודש, ולבדוק אם שילוב של היזכרות בהצלחה עם התנסות מעשית מייצר אפקט חזק ויציב יותר.</w:t>
+      </w:r>
+    </w:p>
+    <w:p>
+      <w:pPr>
+        <w:bidi/>
+        <w:spacing w:after="160" w:before="0" w:line="360"/>
+        <w:jc w:val="both"/>
+      </w:pPr>
+      <w:r>
+        <w:rPr>
+          <w:rFonts w:ascii="David" w:cs="David" w:eastAsia="David" w:hAnsi="David"/>
+          <w:b/>
+          <w:bCs/>
+          <w:i w:val="false"/>
+          <w:iCs w:val="false"/>
+          <w:noProof/>
           <w:color w:val="000000"/>
           <w:sz w:val="24"/>
           <w:szCs w:val="24"/>
@@ -2974,6 +3150,7 @@
           <w:bCs w:val="false"/>
           <w:i w:val="false"/>
           <w:iCs w:val="false"/>
+          <w:noProof/>
           <w:color w:val="000000"/>
           <w:sz w:val="24"/>
           <w:szCs w:val="24"/>
@@ -3001,6 +3178,7 @@
           <w:bCs/>
           <w:i w:val="false"/>
           <w:iCs w:val="false"/>
+          <w:noProof/>
           <w:color w:val="000000"/>
           <w:sz w:val="30"/>
           <w:szCs w:val="30"/>
@@ -3023,6 +3201,7 @@
           <w:bCs w:val="false"/>
           <w:i w:val="false"/>
           <w:iCs w:val="false"/>
+          <w:noProof/>
           <w:color w:val="000000"/>
           <w:sz w:val="24"/>
           <w:szCs w:val="24"/>
@@ -3045,6 +3224,7 @@
           <w:bCs w:val="false"/>
           <w:i w:val="false"/>
           <w:iCs w:val="false"/>
+          <w:noProof/>
           <w:color w:val="000000"/>
           <w:sz w:val="24"/>
           <w:szCs w:val="24"/>
@@ -3067,6 +3247,7 @@
           <w:bCs w:val="false"/>
           <w:i w:val="false"/>
           <w:iCs w:val="false"/>
+          <w:noProof/>
           <w:color w:val="000000"/>
           <w:sz w:val="24"/>
           <w:szCs w:val="24"/>
@@ -3089,6 +3270,7 @@
           <w:bCs w:val="false"/>
           <w:i w:val="false"/>
           <w:iCs w:val="false"/>
+          <w:noProof/>
           <w:color w:val="000000"/>
           <w:sz w:val="24"/>
           <w:szCs w:val="24"/>
@@ -3111,6 +3293,7 @@
           <w:bCs w:val="false"/>
           <w:i w:val="false"/>
           <w:iCs w:val="false"/>
+          <w:noProof/>
           <w:color w:val="000000"/>
           <w:sz w:val="24"/>
           <w:szCs w:val="24"/>
@@ -3130,6 +3313,7 @@
           <w:rFonts w:ascii="David" w:cs="David" w:eastAsia="David" w:hAnsi="David"/>
           <w:i w:val="false"/>
           <w:iCs w:val="false"/>
+          <w:noProof/>
           <w:sz w:val="24"/>
           <w:szCs w:val="24"/>
         </w:rPr>
@@ -3140,6 +3324,7 @@
           <w:rFonts w:ascii="David" w:cs="David" w:eastAsia="David" w:hAnsi="David"/>
           <w:i/>
           <w:iCs/>
+          <w:noProof/>
           <w:sz w:val="24"/>
           <w:szCs w:val="24"/>
         </w:rPr>
@@ -3150,11 +3335,25 @@
           <w:rFonts w:ascii="David" w:cs="David" w:eastAsia="David" w:hAnsi="David"/>
           <w:i w:val="false"/>
           <w:iCs w:val="false"/>
-          <w:sz w:val="24"/>
-          <w:szCs w:val="24"/>
-        </w:rPr>
-        <w:t xml:space="preserve">(5), e0285984. https://doi.org/10.1371/journal.pone.0285984</w:t>
-      </w:r>
+          <w:noProof/>
+          <w:sz w:val="24"/>
+          <w:szCs w:val="24"/>
+        </w:rPr>
+        <w:t xml:space="preserve">(5), e0285984. </w:t>
+      </w:r>
+      <w:hyperlink w:history="1" r:id="rIdgudq2oauxrbibcw33suxp">
+        <w:r>
+          <w:rPr>
+            <w:rFonts w:ascii="David" w:cs="David" w:eastAsia="David" w:hAnsi="David"/>
+            <w:noProof/>
+            <w:color w:val="0563C1"/>
+            <w:sz w:val="24"/>
+            <w:szCs w:val="24"/>
+            <w:u w:val="single"/>
+          </w:rPr>
+          <w:t xml:space="preserve">https://doi.org/10.1371/journal.pone.0285984</w:t>
+        </w:r>
+      </w:hyperlink>
     </w:p>
     <w:p>
       <w:pPr>
@@ -3167,6 +3366,7 @@
           <w:rFonts w:ascii="David" w:cs="David" w:eastAsia="David" w:hAnsi="David"/>
           <w:i w:val="false"/>
           <w:iCs w:val="false"/>
+          <w:noProof/>
           <w:sz w:val="24"/>
           <w:szCs w:val="24"/>
         </w:rPr>
@@ -3177,6 +3377,7 @@
           <w:rFonts w:ascii="David" w:cs="David" w:eastAsia="David" w:hAnsi="David"/>
           <w:i/>
           <w:iCs/>
+          <w:noProof/>
           <w:sz w:val="24"/>
           <w:szCs w:val="24"/>
         </w:rPr>
@@ -3187,11 +3388,25 @@
           <w:rFonts w:ascii="David" w:cs="David" w:eastAsia="David" w:hAnsi="David"/>
           <w:i w:val="false"/>
           <w:iCs w:val="false"/>
-          <w:sz w:val="24"/>
-          <w:szCs w:val="24"/>
-        </w:rPr>
-        <w:t xml:space="preserve">, Article 117. https://doi.org/10.1007/s00426-025-02136-x</w:t>
-      </w:r>
+          <w:noProof/>
+          <w:sz w:val="24"/>
+          <w:szCs w:val="24"/>
+        </w:rPr>
+        <w:t xml:space="preserve">, Article 117. </w:t>
+      </w:r>
+      <w:hyperlink w:history="1" r:id="rId6fuwkremz8ff6pzzcltrx">
+        <w:r>
+          <w:rPr>
+            <w:rFonts w:ascii="David" w:cs="David" w:eastAsia="David" w:hAnsi="David"/>
+            <w:noProof/>
+            <w:color w:val="0563C1"/>
+            <w:sz w:val="24"/>
+            <w:szCs w:val="24"/>
+            <w:u w:val="single"/>
+          </w:rPr>
+          <w:t xml:space="preserve">https://doi.org/10.1007/s00426-025-02136-x</w:t>
+        </w:r>
+      </w:hyperlink>
     </w:p>
     <w:p>
       <w:pPr>
@@ -3204,6 +3419,7 @@
           <w:rFonts w:ascii="David" w:cs="David" w:eastAsia="David" w:hAnsi="David"/>
           <w:i w:val="false"/>
           <w:iCs w:val="false"/>
+          <w:noProof/>
           <w:sz w:val="24"/>
           <w:szCs w:val="24"/>
         </w:rPr>
@@ -3214,6 +3430,7 @@
           <w:rFonts w:ascii="David" w:cs="David" w:eastAsia="David" w:hAnsi="David"/>
           <w:i/>
           <w:iCs/>
+          <w:noProof/>
           <w:sz w:val="24"/>
           <w:szCs w:val="24"/>
         </w:rPr>
@@ -3224,11 +3441,25 @@
           <w:rFonts w:ascii="David" w:cs="David" w:eastAsia="David" w:hAnsi="David"/>
           <w:i w:val="false"/>
           <w:iCs w:val="false"/>
-          <w:sz w:val="24"/>
-          <w:szCs w:val="24"/>
-        </w:rPr>
-        <w:t xml:space="preserve">(2), 76-85. https://doi.org/10.1007/s40037-012-0012-5</w:t>
-      </w:r>
+          <w:noProof/>
+          <w:sz w:val="24"/>
+          <w:szCs w:val="24"/>
+        </w:rPr>
+        <w:t xml:space="preserve">(2), 76-85. </w:t>
+      </w:r>
+      <w:hyperlink w:history="1" r:id="rIdc7zka5ymq5egv6ueoop0g">
+        <w:r>
+          <w:rPr>
+            <w:rFonts w:ascii="David" w:cs="David" w:eastAsia="David" w:hAnsi="David"/>
+            <w:noProof/>
+            <w:color w:val="0563C1"/>
+            <w:sz w:val="24"/>
+            <w:szCs w:val="24"/>
+            <w:u w:val="single"/>
+          </w:rPr>
+          <w:t xml:space="preserve">https://doi.org/10.1007/s40037-012-0012-5</w:t>
+        </w:r>
+      </w:hyperlink>
     </w:p>
     <w:p>
       <w:pPr>
@@ -3241,6 +3472,7 @@
           <w:rFonts w:ascii="David" w:cs="David" w:eastAsia="David" w:hAnsi="David"/>
           <w:i w:val="false"/>
           <w:iCs w:val="false"/>
+          <w:noProof/>
           <w:sz w:val="24"/>
           <w:szCs w:val="24"/>
         </w:rPr>
@@ -3251,6 +3483,7 @@
           <w:rFonts w:ascii="David" w:cs="David" w:eastAsia="David" w:hAnsi="David"/>
           <w:i/>
           <w:iCs/>
+          <w:noProof/>
           <w:sz w:val="24"/>
           <w:szCs w:val="24"/>
         </w:rPr>
@@ -3261,6 +3494,7 @@
           <w:rFonts w:ascii="David" w:cs="David" w:eastAsia="David" w:hAnsi="David"/>
           <w:i w:val="false"/>
           <w:iCs w:val="false"/>
+          <w:noProof/>
           <w:sz w:val="24"/>
           <w:szCs w:val="24"/>
         </w:rPr>
@@ -3278,6 +3512,7 @@
           <w:rFonts w:ascii="David" w:cs="David" w:eastAsia="David" w:hAnsi="David"/>
           <w:i w:val="false"/>
           <w:iCs w:val="false"/>
+          <w:noProof/>
           <w:sz w:val="24"/>
           <w:szCs w:val="24"/>
         </w:rPr>
@@ -3288,6 +3523,7 @@
           <w:rFonts w:ascii="David" w:cs="David" w:eastAsia="David" w:hAnsi="David"/>
           <w:i/>
           <w:iCs/>
+          <w:noProof/>
           <w:sz w:val="24"/>
           <w:szCs w:val="24"/>
         </w:rPr>
@@ -3298,11 +3534,25 @@
           <w:rFonts w:ascii="David" w:cs="David" w:eastAsia="David" w:hAnsi="David"/>
           <w:i w:val="false"/>
           <w:iCs w:val="false"/>
-          <w:sz w:val="24"/>
-          <w:szCs w:val="24"/>
-        </w:rPr>
-        <w:t xml:space="preserve">, 1385442. https://doi.org/10.3389/feduc.2024.1385442</w:t>
-      </w:r>
+          <w:noProof/>
+          <w:sz w:val="24"/>
+          <w:szCs w:val="24"/>
+        </w:rPr>
+        <w:t xml:space="preserve">, 1385442. </w:t>
+      </w:r>
+      <w:hyperlink w:history="1" r:id="rIdc2ruitvil-gwz3zdddey2">
+        <w:r>
+          <w:rPr>
+            <w:rFonts w:ascii="David" w:cs="David" w:eastAsia="David" w:hAnsi="David"/>
+            <w:noProof/>
+            <w:color w:val="0563C1"/>
+            <w:sz w:val="24"/>
+            <w:szCs w:val="24"/>
+            <w:u w:val="single"/>
+          </w:rPr>
+          <w:t xml:space="preserve">https://doi.org/10.3389/feduc.2024.1385442</w:t>
+        </w:r>
+      </w:hyperlink>
     </w:p>
     <w:p>
       <w:pPr>
@@ -3315,6 +3565,7 @@
           <w:rFonts w:ascii="David" w:cs="David" w:eastAsia="David" w:hAnsi="David"/>
           <w:i w:val="false"/>
           <w:iCs w:val="false"/>
+          <w:noProof/>
           <w:sz w:val="24"/>
           <w:szCs w:val="24"/>
         </w:rPr>
@@ -3325,6 +3576,7 @@
           <w:rFonts w:ascii="David" w:cs="David" w:eastAsia="David" w:hAnsi="David"/>
           <w:i/>
           <w:iCs/>
+          <w:noProof/>
           <w:sz w:val="24"/>
           <w:szCs w:val="24"/>
         </w:rPr>
@@ -3335,11 +3587,25 @@
           <w:rFonts w:ascii="David" w:cs="David" w:eastAsia="David" w:hAnsi="David"/>
           <w:i w:val="false"/>
           <w:iCs w:val="false"/>
-          <w:sz w:val="24"/>
-          <w:szCs w:val="24"/>
-        </w:rPr>
-        <w:t xml:space="preserve">(1), 62-83. https://doi.org/10.1177/109442810141004</w:t>
-      </w:r>
+          <w:noProof/>
+          <w:sz w:val="24"/>
+          <w:szCs w:val="24"/>
+        </w:rPr>
+        <w:t xml:space="preserve">(1), 62-83. </w:t>
+      </w:r>
+      <w:hyperlink w:history="1" r:id="rIdzewhamc5st2ope2uah7gd">
+        <w:r>
+          <w:rPr>
+            <w:rFonts w:ascii="David" w:cs="David" w:eastAsia="David" w:hAnsi="David"/>
+            <w:noProof/>
+            <w:color w:val="0563C1"/>
+            <w:sz w:val="24"/>
+            <w:szCs w:val="24"/>
+            <w:u w:val="single"/>
+          </w:rPr>
+          <w:t xml:space="preserve">https://doi.org/10.1177/109442810141004</w:t>
+        </w:r>
+      </w:hyperlink>
     </w:p>
     <w:p>
       <w:pPr>
@@ -3352,6 +3618,7 @@
           <w:rFonts w:ascii="David" w:cs="David" w:eastAsia="David" w:hAnsi="David"/>
           <w:i w:val="false"/>
           <w:iCs w:val="false"/>
+          <w:noProof/>
           <w:sz w:val="24"/>
           <w:szCs w:val="24"/>
         </w:rPr>
@@ -3362,6 +3629,7 @@
           <w:rFonts w:ascii="David" w:cs="David" w:eastAsia="David" w:hAnsi="David"/>
           <w:i/>
           <w:iCs/>
+          <w:noProof/>
           <w:sz w:val="24"/>
           <w:szCs w:val="24"/>
         </w:rPr>
@@ -3372,11 +3640,25 @@
           <w:rFonts w:ascii="David" w:cs="David" w:eastAsia="David" w:hAnsi="David"/>
           <w:i w:val="false"/>
           <w:iCs w:val="false"/>
-          <w:sz w:val="24"/>
-          <w:szCs w:val="24"/>
-        </w:rPr>
-        <w:t xml:space="preserve">(6), 1988. https://doi.org/10.3390/jcm14061988</w:t>
-      </w:r>
+          <w:noProof/>
+          <w:sz w:val="24"/>
+          <w:szCs w:val="24"/>
+        </w:rPr>
+        <w:t xml:space="preserve">(6), 1988. </w:t>
+      </w:r>
+      <w:hyperlink w:history="1" r:id="rIdm-qqbcmayo1jg8qcp-_hn">
+        <w:r>
+          <w:rPr>
+            <w:rFonts w:ascii="David" w:cs="David" w:eastAsia="David" w:hAnsi="David"/>
+            <w:noProof/>
+            <w:color w:val="0563C1"/>
+            <w:sz w:val="24"/>
+            <w:szCs w:val="24"/>
+            <w:u w:val="single"/>
+          </w:rPr>
+          <w:t xml:space="preserve">https://doi.org/10.3390/jcm14061988</w:t>
+        </w:r>
+      </w:hyperlink>
     </w:p>
     <w:p>
       <w:pPr>
@@ -3389,6 +3671,7 @@
           <w:rFonts w:ascii="David" w:cs="David" w:eastAsia="David" w:hAnsi="David"/>
           <w:i w:val="false"/>
           <w:iCs w:val="false"/>
+          <w:noProof/>
           <w:sz w:val="24"/>
           <w:szCs w:val="24"/>
         </w:rPr>
@@ -3399,6 +3682,7 @@
           <w:rFonts w:ascii="David" w:cs="David" w:eastAsia="David" w:hAnsi="David"/>
           <w:i/>
           <w:iCs/>
+          <w:noProof/>
           <w:sz w:val="24"/>
           <w:szCs w:val="24"/>
         </w:rPr>
@@ -3409,11 +3693,25 @@
           <w:rFonts w:ascii="David" w:cs="David" w:eastAsia="David" w:hAnsi="David"/>
           <w:i w:val="false"/>
           <w:iCs w:val="false"/>
-          <w:sz w:val="24"/>
-          <w:szCs w:val="24"/>
-        </w:rPr>
-        <w:t xml:space="preserve">(7), 783-805. https://doi.org/10.1016/S0742-051X(01)00036-1</w:t>
-      </w:r>
+          <w:noProof/>
+          <w:sz w:val="24"/>
+          <w:szCs w:val="24"/>
+        </w:rPr>
+        <w:t xml:space="preserve">(7), 783-805. </w:t>
+      </w:r>
+      <w:hyperlink w:history="1" r:id="rId2hm_on_f4_fyq25o7b2ro">
+        <w:r>
+          <w:rPr>
+            <w:rFonts w:ascii="David" w:cs="David" w:eastAsia="David" w:hAnsi="David"/>
+            <w:noProof/>
+            <w:color w:val="0563C1"/>
+            <w:sz w:val="24"/>
+            <w:szCs w:val="24"/>
+            <w:u w:val="single"/>
+          </w:rPr>
+          <w:t xml:space="preserve">https://doi.org/10.1016/S0742-051X(01)00036-1</w:t>
+        </w:r>
+      </w:hyperlink>
     </w:p>
     <w:p>
       <w:r>
@@ -3434,6 +3732,7 @@
           <w:bCs/>
           <w:i w:val="false"/>
           <w:iCs w:val="false"/>
+          <w:noProof/>
           <w:color w:val="000000"/>
           <w:sz w:val="30"/>
           <w:szCs w:val="30"/>
@@ -3456,6 +3755,7 @@
           <w:bCs/>
           <w:i w:val="false"/>
           <w:iCs w:val="false"/>
+          <w:noProof/>
           <w:color w:val="000000"/>
           <w:sz w:val="26"/>
           <w:szCs w:val="26"/>
@@ -3482,6 +3782,7 @@
           <w:bCs w:val="false"/>
           <w:i w:val="false"/>
           <w:iCs w:val="false"/>
+          <w:noProof/>
           <w:color w:val="000000"/>
           <w:sz w:val="24"/>
           <w:szCs w:val="24"/>
@@ -3508,6 +3809,7 @@
           <w:bCs w:val="false"/>
           <w:i w:val="false"/>
           <w:iCs w:val="false"/>
+          <w:noProof/>
           <w:color w:val="000000"/>
           <w:sz w:val="24"/>
           <w:szCs w:val="24"/>
@@ -3534,6 +3836,7 @@
           <w:bCs w:val="false"/>
           <w:i w:val="false"/>
           <w:iCs w:val="false"/>
+          <w:noProof/>
           <w:color w:val="000000"/>
           <w:sz w:val="24"/>
           <w:szCs w:val="24"/>
@@ -3560,6 +3863,7 @@
           <w:bCs w:val="false"/>
           <w:i w:val="false"/>
           <w:iCs w:val="false"/>
+          <w:noProof/>
           <w:color w:val="000000"/>
           <w:sz w:val="24"/>
           <w:szCs w:val="24"/>
@@ -3581,6 +3885,7 @@
           <w:bCs w:val="false"/>
           <w:i w:val="false"/>
           <w:iCs w:val="false"/>
+          <w:noProof/>
           <w:color w:val="000000"/>
           <w:sz w:val="24"/>
           <w:szCs w:val="24"/>
@@ -3603,6 +3908,7 @@
           <w:bCs/>
           <w:i w:val="false"/>
           <w:iCs w:val="false"/>
+          <w:noProof/>
           <w:color w:val="000000"/>
           <w:sz w:val="26"/>
           <w:szCs w:val="26"/>
@@ -3624,6 +3930,7 @@
           <w:bCs/>
           <w:i w:val="false"/>
           <w:iCs w:val="false"/>
+          <w:noProof/>
           <w:color w:val="000000"/>
           <w:sz w:val="24"/>
           <w:szCs w:val="24"/>
@@ -3638,6 +3945,7 @@
           <w:bCs w:val="false"/>
           <w:i w:val="false"/>
           <w:iCs w:val="false"/>
+          <w:noProof/>
           <w:color w:val="000000"/>
           <w:sz w:val="24"/>
           <w:szCs w:val="24"/>
@@ -3659,6 +3967,7 @@
           <w:bCs/>
           <w:i w:val="false"/>
           <w:iCs w:val="false"/>
+          <w:noProof/>
           <w:color w:val="000000"/>
           <w:sz w:val="24"/>
           <w:szCs w:val="24"/>
@@ -3673,6 +3982,7 @@
           <w:bCs w:val="false"/>
           <w:i w:val="false"/>
           <w:iCs w:val="false"/>
+          <w:noProof/>
           <w:color w:val="000000"/>
           <w:sz w:val="24"/>
           <w:szCs w:val="24"/>
@@ -3694,6 +4004,7 @@
           <w:bCs/>
           <w:i w:val="false"/>
           <w:iCs w:val="false"/>
+          <w:noProof/>
           <w:color w:val="000000"/>
           <w:sz w:val="24"/>
           <w:szCs w:val="24"/>
@@ -3708,6 +4019,7 @@
           <w:bCs w:val="false"/>
           <w:i w:val="false"/>
           <w:iCs w:val="false"/>
+          <w:noProof/>
           <w:color w:val="000000"/>
           <w:sz w:val="24"/>
           <w:szCs w:val="24"/>
@@ -3729,6 +4041,7 @@
           <w:bCs/>
           <w:i w:val="false"/>
           <w:iCs w:val="false"/>
+          <w:noProof/>
           <w:color w:val="000000"/>
           <w:sz w:val="24"/>
           <w:szCs w:val="24"/>
@@ -3743,6 +4056,7 @@
           <w:bCs w:val="false"/>
           <w:i w:val="false"/>
           <w:iCs w:val="false"/>
+          <w:noProof/>
           <w:color w:val="000000"/>
           <w:sz w:val="24"/>
           <w:szCs w:val="24"/>
@@ -3764,6 +4078,7 @@
           <w:bCs w:val="false"/>
           <w:i w:val="false"/>
           <w:iCs w:val="false"/>
+          <w:noProof/>
           <w:color w:val="000000"/>
           <w:sz w:val="24"/>
           <w:szCs w:val="24"/>
@@ -3786,6 +4101,7 @@
           <w:bCs/>
           <w:i w:val="false"/>
           <w:iCs w:val="false"/>
+          <w:noProof/>
           <w:color w:val="000000"/>
           <w:sz w:val="26"/>
           <w:szCs w:val="26"/>
@@ -3807,6 +4123,7 @@
           <w:bCs w:val="false"/>
           <w:i w:val="false"/>
           <w:iCs w:val="false"/>
+          <w:noProof/>
           <w:color w:val="000000"/>
           <w:sz w:val="24"/>
           <w:szCs w:val="24"/>
@@ -3865,6 +4182,7 @@
                 <w:bCs/>
                 <w:i w:val="false"/>
                 <w:iCs w:val="false"/>
+                <w:noProof/>
                 <w:color w:val="000000"/>
                 <w:sz w:val="18"/>
                 <w:szCs w:val="18"/>
@@ -3898,6 +4216,7 @@
                 <w:bCs/>
                 <w:i w:val="false"/>
                 <w:iCs w:val="false"/>
+                <w:noProof/>
                 <w:color w:val="000000"/>
                 <w:sz w:val="18"/>
                 <w:szCs w:val="18"/>
@@ -3931,6 +4250,7 @@
                 <w:bCs/>
                 <w:i w:val="false"/>
                 <w:iCs w:val="false"/>
+                <w:noProof/>
                 <w:color w:val="000000"/>
                 <w:sz w:val="18"/>
                 <w:szCs w:val="18"/>
@@ -3964,6 +4284,7 @@
                 <w:bCs/>
                 <w:i w:val="false"/>
                 <w:iCs w:val="false"/>
+                <w:noProof/>
                 <w:color w:val="000000"/>
                 <w:sz w:val="18"/>
                 <w:szCs w:val="18"/>
@@ -3997,6 +4318,7 @@
                 <w:bCs/>
                 <w:i w:val="false"/>
                 <w:iCs w:val="false"/>
+                <w:noProof/>
                 <w:color w:val="000000"/>
                 <w:sz w:val="18"/>
                 <w:szCs w:val="18"/>
@@ -4030,6 +4352,7 @@
                 <w:bCs/>
                 <w:i w:val="false"/>
                 <w:iCs w:val="false"/>
+                <w:noProof/>
                 <w:color w:val="000000"/>
                 <w:sz w:val="18"/>
                 <w:szCs w:val="18"/>
@@ -4065,6 +4388,7 @@
                 <w:bCs w:val="false"/>
                 <w:i w:val="false"/>
                 <w:iCs w:val="false"/>
+                <w:noProof/>
                 <w:color w:val="000000"/>
                 <w:sz w:val="21"/>
                 <w:szCs w:val="21"/>
@@ -4098,6 +4422,7 @@
                 <w:bCs w:val="false"/>
                 <w:i w:val="false"/>
                 <w:iCs w:val="false"/>
+                <w:noProof/>
                 <w:color w:val="000000"/>
                 <w:sz w:val="20"/>
                 <w:szCs w:val="20"/>
@@ -4131,6 +4456,7 @@
                 <w:bCs w:val="false"/>
                 <w:i w:val="false"/>
                 <w:iCs w:val="false"/>
+                <w:noProof/>
                 <w:color w:val="000000"/>
                 <w:sz w:val="20"/>
                 <w:szCs w:val="20"/>
@@ -4164,6 +4490,7 @@
                 <w:bCs w:val="false"/>
                 <w:i w:val="false"/>
                 <w:iCs w:val="false"/>
+                <w:noProof/>
                 <w:color w:val="000000"/>
                 <w:sz w:val="20"/>
                 <w:szCs w:val="20"/>
@@ -4197,6 +4524,7 @@
                 <w:bCs w:val="false"/>
                 <w:i w:val="false"/>
                 <w:iCs w:val="false"/>
+                <w:noProof/>
                 <w:color w:val="000000"/>
                 <w:sz w:val="20"/>
                 <w:szCs w:val="20"/>
@@ -4230,6 +4558,7 @@
                 <w:bCs w:val="false"/>
                 <w:i w:val="false"/>
                 <w:iCs w:val="false"/>
+                <w:noProof/>
                 <w:color w:val="000000"/>
                 <w:sz w:val="20"/>
                 <w:szCs w:val="20"/>
@@ -4265,6 +4594,7 @@
                 <w:bCs w:val="false"/>
                 <w:i w:val="false"/>
                 <w:iCs w:val="false"/>
+                <w:noProof/>
                 <w:color w:val="000000"/>
                 <w:sz w:val="21"/>
                 <w:szCs w:val="21"/>
@@ -4298,6 +4628,7 @@
                 <w:bCs w:val="false"/>
                 <w:i w:val="false"/>
                 <w:iCs w:val="false"/>
+                <w:noProof/>
                 <w:color w:val="000000"/>
                 <w:sz w:val="20"/>
                 <w:szCs w:val="20"/>
@@ -4331,6 +4662,7 @@
                 <w:bCs w:val="false"/>
                 <w:i w:val="false"/>
                 <w:iCs w:val="false"/>
+                <w:noProof/>
                 <w:color w:val="000000"/>
                 <w:sz w:val="20"/>
                 <w:szCs w:val="20"/>
@@ -4364,6 +4696,7 @@
                 <w:bCs w:val="false"/>
                 <w:i w:val="false"/>
                 <w:iCs w:val="false"/>
+                <w:noProof/>
                 <w:color w:val="000000"/>
                 <w:sz w:val="20"/>
                 <w:szCs w:val="20"/>
@@ -4397,6 +4730,7 @@
                 <w:bCs w:val="false"/>
                 <w:i w:val="false"/>
                 <w:iCs w:val="false"/>
+                <w:noProof/>
                 <w:color w:val="000000"/>
                 <w:sz w:val="20"/>
                 <w:szCs w:val="20"/>
@@ -4430,6 +4764,7 @@
                 <w:bCs w:val="false"/>
                 <w:i w:val="false"/>
                 <w:iCs w:val="false"/>
+                <w:noProof/>
                 <w:color w:val="000000"/>
                 <w:sz w:val="20"/>
                 <w:szCs w:val="20"/>
@@ -4465,6 +4800,7 @@
                 <w:bCs w:val="false"/>
                 <w:i w:val="false"/>
                 <w:iCs w:val="false"/>
+                <w:noProof/>
                 <w:color w:val="000000"/>
                 <w:sz w:val="21"/>
                 <w:szCs w:val="21"/>
@@ -4498,6 +4834,7 @@
                 <w:bCs w:val="false"/>
                 <w:i w:val="false"/>
                 <w:iCs w:val="false"/>
+                <w:noProof/>
                 <w:color w:val="000000"/>
                 <w:sz w:val="20"/>
                 <w:szCs w:val="20"/>
@@ -4531,6 +4868,7 @@
                 <w:bCs w:val="false"/>
                 <w:i w:val="false"/>
                 <w:iCs w:val="false"/>
+                <w:noProof/>
                 <w:color w:val="000000"/>
                 <w:sz w:val="20"/>
                 <w:szCs w:val="20"/>
@@ -4564,6 +4902,7 @@
                 <w:bCs w:val="false"/>
                 <w:i w:val="false"/>
                 <w:iCs w:val="false"/>
+                <w:noProof/>
                 <w:color w:val="000000"/>
                 <w:sz w:val="20"/>
                 <w:szCs w:val="20"/>
@@ -4597,6 +4936,7 @@
                 <w:bCs w:val="false"/>
                 <w:i w:val="false"/>
                 <w:iCs w:val="false"/>
+                <w:noProof/>
                 <w:color w:val="000000"/>
                 <w:sz w:val="20"/>
                 <w:szCs w:val="20"/>
@@ -4630,6 +4970,7 @@
                 <w:bCs w:val="false"/>
                 <w:i w:val="false"/>
                 <w:iCs w:val="false"/>
+                <w:noProof/>
                 <w:color w:val="000000"/>
                 <w:sz w:val="20"/>
                 <w:szCs w:val="20"/>
@@ -4665,6 +5006,7 @@
                 <w:bCs w:val="false"/>
                 <w:i w:val="false"/>
                 <w:iCs w:val="false"/>
+                <w:noProof/>
                 <w:color w:val="000000"/>
                 <w:sz w:val="21"/>
                 <w:szCs w:val="21"/>
@@ -4698,6 +5040,7 @@
                 <w:bCs w:val="false"/>
                 <w:i w:val="false"/>
                 <w:iCs w:val="false"/>
+                <w:noProof/>
                 <w:color w:val="000000"/>
                 <w:sz w:val="20"/>
                 <w:szCs w:val="20"/>
@@ -4731,6 +5074,7 @@
                 <w:bCs w:val="false"/>
                 <w:i w:val="false"/>
                 <w:iCs w:val="false"/>
+                <w:noProof/>
                 <w:color w:val="000000"/>
                 <w:sz w:val="20"/>
                 <w:szCs w:val="20"/>
@@ -4764,6 +5108,7 @@
                 <w:bCs w:val="false"/>
                 <w:i w:val="false"/>
                 <w:iCs w:val="false"/>
+                <w:noProof/>
                 <w:color w:val="000000"/>
                 <w:sz w:val="20"/>
                 <w:szCs w:val="20"/>
@@ -4797,6 +5142,7 @@
                 <w:bCs w:val="false"/>
                 <w:i w:val="false"/>
                 <w:iCs w:val="false"/>
+                <w:noProof/>
                 <w:color w:val="000000"/>
                 <w:sz w:val="20"/>
                 <w:szCs w:val="20"/>
@@ -4830,6 +5176,7 @@
                 <w:bCs w:val="false"/>
                 <w:i w:val="false"/>
                 <w:iCs w:val="false"/>
+                <w:noProof/>
                 <w:color w:val="000000"/>
                 <w:sz w:val="20"/>
                 <w:szCs w:val="20"/>
@@ -4865,6 +5212,7 @@
                 <w:bCs w:val="false"/>
                 <w:i w:val="false"/>
                 <w:iCs w:val="false"/>
+                <w:noProof/>
                 <w:color w:val="000000"/>
                 <w:sz w:val="21"/>
                 <w:szCs w:val="21"/>
@@ -4898,6 +5246,7 @@
                 <w:bCs w:val="false"/>
                 <w:i w:val="false"/>
                 <w:iCs w:val="false"/>
+                <w:noProof/>
                 <w:color w:val="000000"/>
                 <w:sz w:val="20"/>
                 <w:szCs w:val="20"/>
@@ -4931,6 +5280,7 @@
                 <w:bCs w:val="false"/>
                 <w:i w:val="false"/>
                 <w:iCs w:val="false"/>
+                <w:noProof/>
                 <w:color w:val="000000"/>
                 <w:sz w:val="20"/>
                 <w:szCs w:val="20"/>
@@ -4964,6 +5314,7 @@
                 <w:bCs w:val="false"/>
                 <w:i w:val="false"/>
                 <w:iCs w:val="false"/>
+                <w:noProof/>
                 <w:color w:val="000000"/>
                 <w:sz w:val="20"/>
                 <w:szCs w:val="20"/>
@@ -4997,6 +5348,7 @@
                 <w:bCs w:val="false"/>
                 <w:i w:val="false"/>
                 <w:iCs w:val="false"/>
+                <w:noProof/>
                 <w:color w:val="000000"/>
                 <w:sz w:val="20"/>
                 <w:szCs w:val="20"/>
@@ -5030,6 +5382,7 @@
                 <w:bCs w:val="false"/>
                 <w:i w:val="false"/>
                 <w:iCs w:val="false"/>
+                <w:noProof/>
                 <w:color w:val="000000"/>
                 <w:sz w:val="20"/>
                 <w:szCs w:val="20"/>
@@ -5065,6 +5418,7 @@
                 <w:bCs w:val="false"/>
                 <w:i w:val="false"/>
                 <w:iCs w:val="false"/>
+                <w:noProof/>
                 <w:color w:val="000000"/>
                 <w:sz w:val="21"/>
                 <w:szCs w:val="21"/>
@@ -5098,6 +5452,7 @@
                 <w:bCs w:val="false"/>
                 <w:i w:val="false"/>
                 <w:iCs w:val="false"/>
+                <w:noProof/>
                 <w:color w:val="000000"/>
                 <w:sz w:val="20"/>
                 <w:szCs w:val="20"/>
@@ -5131,6 +5486,7 @@
                 <w:bCs w:val="false"/>
                 <w:i w:val="false"/>
                 <w:iCs w:val="false"/>
+                <w:noProof/>
                 <w:color w:val="000000"/>
                 <w:sz w:val="20"/>
                 <w:szCs w:val="20"/>
@@ -5164,6 +5520,7 @@
                 <w:bCs w:val="false"/>
                 <w:i w:val="false"/>
                 <w:iCs w:val="false"/>
+                <w:noProof/>
                 <w:color w:val="000000"/>
                 <w:sz w:val="20"/>
                 <w:szCs w:val="20"/>
@@ -5197,6 +5554,7 @@
                 <w:bCs w:val="false"/>
                 <w:i w:val="false"/>
                 <w:iCs w:val="false"/>
+                <w:noProof/>
                 <w:color w:val="000000"/>
                 <w:sz w:val="20"/>
                 <w:szCs w:val="20"/>
@@ -5230,6 +5588,7 @@
                 <w:bCs w:val="false"/>
                 <w:i w:val="false"/>
                 <w:iCs w:val="false"/>
+                <w:noProof/>
                 <w:color w:val="000000"/>
                 <w:sz w:val="20"/>
                 <w:szCs w:val="20"/>
@@ -5265,6 +5624,7 @@
                 <w:bCs w:val="false"/>
                 <w:i w:val="false"/>
                 <w:iCs w:val="false"/>
+                <w:noProof/>
                 <w:color w:val="000000"/>
                 <w:sz w:val="21"/>
                 <w:szCs w:val="21"/>
@@ -5298,6 +5658,7 @@
                 <w:bCs w:val="false"/>
                 <w:i w:val="false"/>
                 <w:iCs w:val="false"/>
+                <w:noProof/>
                 <w:color w:val="000000"/>
                 <w:sz w:val="20"/>
                 <w:szCs w:val="20"/>
@@ -5331,6 +5692,7 @@
                 <w:bCs w:val="false"/>
                 <w:i w:val="false"/>
                 <w:iCs w:val="false"/>
+                <w:noProof/>
                 <w:color w:val="000000"/>
                 <w:sz w:val="20"/>
                 <w:szCs w:val="20"/>
@@ -5364,6 +5726,7 @@
                 <w:bCs w:val="false"/>
                 <w:i w:val="false"/>
                 <w:iCs w:val="false"/>
+                <w:noProof/>
                 <w:color w:val="000000"/>
                 <w:sz w:val="20"/>
                 <w:szCs w:val="20"/>
@@ -5397,6 +5760,7 @@
                 <w:bCs w:val="false"/>
                 <w:i w:val="false"/>
                 <w:iCs w:val="false"/>
+                <w:noProof/>
                 <w:color w:val="000000"/>
                 <w:sz w:val="20"/>
                 <w:szCs w:val="20"/>
@@ -5430,6 +5794,7 @@
                 <w:bCs w:val="false"/>
                 <w:i w:val="false"/>
                 <w:iCs w:val="false"/>
+                <w:noProof/>
                 <w:color w:val="000000"/>
                 <w:sz w:val="20"/>
                 <w:szCs w:val="20"/>
@@ -5465,6 +5830,7 @@
                 <w:bCs w:val="false"/>
                 <w:i w:val="false"/>
                 <w:iCs w:val="false"/>
+                <w:noProof/>
                 <w:color w:val="000000"/>
                 <w:sz w:val="21"/>
                 <w:szCs w:val="21"/>
@@ -5498,6 +5864,7 @@
                 <w:bCs w:val="false"/>
                 <w:i w:val="false"/>
                 <w:iCs w:val="false"/>
+                <w:noProof/>
                 <w:color w:val="000000"/>
                 <w:sz w:val="20"/>
                 <w:szCs w:val="20"/>
@@ -5531,6 +5898,7 @@
                 <w:bCs w:val="false"/>
                 <w:i w:val="false"/>
                 <w:iCs w:val="false"/>
+                <w:noProof/>
                 <w:color w:val="000000"/>
                 <w:sz w:val="20"/>
                 <w:szCs w:val="20"/>
@@ -5564,6 +5932,7 @@
                 <w:bCs w:val="false"/>
                 <w:i w:val="false"/>
                 <w:iCs w:val="false"/>
+                <w:noProof/>
                 <w:color w:val="000000"/>
                 <w:sz w:val="20"/>
                 <w:szCs w:val="20"/>
@@ -5597,6 +5966,7 @@
                 <w:bCs w:val="false"/>
                 <w:i w:val="false"/>
                 <w:iCs w:val="false"/>
+                <w:noProof/>
                 <w:color w:val="000000"/>
                 <w:sz w:val="20"/>
                 <w:szCs w:val="20"/>
@@ -5630,6 +6000,7 @@
                 <w:bCs w:val="false"/>
                 <w:i w:val="false"/>
                 <w:iCs w:val="false"/>
+                <w:noProof/>
                 <w:color w:val="000000"/>
                 <w:sz w:val="20"/>
                 <w:szCs w:val="20"/>
@@ -5654,6 +6025,7 @@
           <w:bCs/>
           <w:i w:val="false"/>
           <w:iCs w:val="false"/>
+          <w:noProof/>
           <w:color w:val="000000"/>
           <w:sz w:val="24"/>
           <w:szCs w:val="24"/>
@@ -5668,6 +6040,7 @@
           <w:bCs w:val="false"/>
           <w:i w:val="false"/>
           <w:iCs w:val="false"/>
+          <w:noProof/>
           <w:color w:val="000000"/>
           <w:sz w:val="24"/>
           <w:szCs w:val="24"/>
@@ -5689,6 +6062,7 @@
           <w:bCs/>
           <w:i w:val="false"/>
           <w:iCs w:val="false"/>
+          <w:noProof/>
           <w:color w:val="000000"/>
           <w:sz w:val="24"/>
           <w:szCs w:val="24"/>
@@ -5701,6 +6075,7 @@
           <w:rFonts w:ascii="David" w:cs="David" w:eastAsia="David" w:hAnsi="David"/>
           <w:i w:val="false"/>
           <w:iCs w:val="false"/>
+          <w:noProof/>
           <w:sz w:val="24"/>
           <w:szCs w:val="24"/>
         </w:rPr>
@@ -5711,6 +6086,7 @@
           <w:rFonts w:ascii="David" w:cs="David" w:eastAsia="David" w:hAnsi="David"/>
           <w:i/>
           <w:iCs/>
+          <w:noProof/>
           <w:sz w:val="24"/>
           <w:szCs w:val="24"/>
         </w:rPr>
@@ -5721,6 +6097,7 @@
           <w:rFonts w:ascii="David" w:cs="David" w:eastAsia="David" w:hAnsi="David"/>
           <w:i w:val="false"/>
           <w:iCs w:val="false"/>
+          <w:noProof/>
           <w:sz w:val="24"/>
           <w:szCs w:val="24"/>
         </w:rPr>
@@ -5746,6 +6123,7 @@
           <w:bCs/>
           <w:i w:val="false"/>
           <w:iCs w:val="false"/>
+          <w:noProof/>
           <w:color w:val="000000"/>
           <w:sz w:val="26"/>
           <w:szCs w:val="26"/>
@@ -5767,6 +6145,7 @@
           <w:bCs w:val="false"/>
           <w:i w:val="false"/>
           <w:iCs w:val="false"/>
+          <w:noProof/>
           <w:color w:val="000000"/>
           <w:sz w:val="24"/>
           <w:szCs w:val="24"/>
@@ -5788,6 +6167,7 @@
           <w:bCs w:val="false"/>
           <w:i/>
           <w:iCs/>
+          <w:noProof/>
           <w:color w:val="000000"/>
           <w:sz w:val="24"/>
           <w:szCs w:val="24"/>
@@ -5809,6 +6189,7 @@
           <w:bCs/>
           <w:i w:val="false"/>
           <w:iCs w:val="false"/>
+          <w:noProof/>
           <w:color w:val="000000"/>
           <w:sz w:val="24"/>
           <w:szCs w:val="24"/>
@@ -5835,6 +6216,7 @@
           <w:bCs w:val="false"/>
           <w:i w:val="false"/>
           <w:iCs w:val="false"/>
+          <w:noProof/>
           <w:color w:val="000000"/>
           <w:sz w:val="24"/>
           <w:szCs w:val="24"/>
@@ -5861,6 +6243,7 @@
           <w:bCs w:val="false"/>
           <w:i w:val="false"/>
           <w:iCs w:val="false"/>
+          <w:noProof/>
           <w:color w:val="000000"/>
           <w:sz w:val="24"/>
           <w:szCs w:val="24"/>
@@ -5887,6 +6270,7 @@
           <w:bCs w:val="false"/>
           <w:i w:val="false"/>
           <w:iCs w:val="false"/>
+          <w:noProof/>
           <w:color w:val="000000"/>
           <w:sz w:val="24"/>
           <w:szCs w:val="24"/>
@@ -5913,6 +6297,7 @@
           <w:bCs w:val="false"/>
           <w:i w:val="false"/>
           <w:iCs w:val="false"/>
+          <w:noProof/>
           <w:color w:val="000000"/>
           <w:sz w:val="24"/>
           <w:szCs w:val="24"/>
@@ -5934,6 +6319,7 @@
           <w:bCs/>
           <w:i w:val="false"/>
           <w:iCs w:val="false"/>
+          <w:noProof/>
           <w:color w:val="000000"/>
           <w:sz w:val="24"/>
           <w:szCs w:val="24"/>
@@ -5960,6 +6346,7 @@
           <w:bCs w:val="false"/>
           <w:i w:val="false"/>
           <w:iCs w:val="false"/>
+          <w:noProof/>
           <w:color w:val="000000"/>
           <w:sz w:val="24"/>
           <w:szCs w:val="24"/>
@@ -5986,6 +6373,7 @@
           <w:bCs w:val="false"/>
           <w:i w:val="false"/>
           <w:iCs w:val="false"/>
+          <w:noProof/>
           <w:color w:val="000000"/>
           <w:sz w:val="24"/>
           <w:szCs w:val="24"/>
@@ -6012,6 +6400,7 @@
           <w:bCs w:val="false"/>
           <w:i w:val="false"/>
           <w:iCs w:val="false"/>
+          <w:noProof/>
           <w:color w:val="000000"/>
           <w:sz w:val="24"/>
           <w:szCs w:val="24"/>
@@ -6038,6 +6427,7 @@
           <w:bCs w:val="false"/>
           <w:i w:val="false"/>
           <w:iCs w:val="false"/>
+          <w:noProof/>
           <w:color w:val="000000"/>
           <w:sz w:val="24"/>
           <w:szCs w:val="24"/>
@@ -6059,6 +6449,7 @@
           <w:bCs/>
           <w:i w:val="false"/>
           <w:iCs w:val="false"/>
+          <w:noProof/>
           <w:color w:val="000000"/>
           <w:sz w:val="24"/>
           <w:szCs w:val="24"/>
@@ -6085,6 +6476,7 @@
           <w:bCs w:val="false"/>
           <w:i w:val="false"/>
           <w:iCs w:val="false"/>
+          <w:noProof/>
           <w:color w:val="000000"/>
           <w:sz w:val="24"/>
           <w:szCs w:val="24"/>
@@ -6111,6 +6503,7 @@
           <w:bCs w:val="false"/>
           <w:i w:val="false"/>
           <w:iCs w:val="false"/>
+          <w:noProof/>
           <w:color w:val="000000"/>
           <w:sz w:val="24"/>
           <w:szCs w:val="24"/>
@@ -6137,6 +6530,7 @@
           <w:bCs w:val="false"/>
           <w:i w:val="false"/>
           <w:iCs w:val="false"/>
+          <w:noProof/>
           <w:color w:val="000000"/>
           <w:sz w:val="24"/>
           <w:szCs w:val="24"/>
@@ -6163,6 +6557,7 @@
           <w:bCs w:val="false"/>
           <w:i w:val="false"/>
           <w:iCs w:val="false"/>
+          <w:noProof/>
           <w:color w:val="000000"/>
           <w:sz w:val="24"/>
           <w:szCs w:val="24"/>
@@ -6184,6 +6579,7 @@
           <w:bCs/>
           <w:i w:val="false"/>
           <w:iCs w:val="false"/>
+          <w:noProof/>
           <w:color w:val="000000"/>
           <w:sz w:val="24"/>
           <w:szCs w:val="24"/>
@@ -6198,6 +6594,7 @@
           <w:bCs w:val="false"/>
           <w:i w:val="false"/>
           <w:iCs w:val="false"/>
+          <w:noProof/>
           <w:color w:val="000000"/>
           <w:sz w:val="24"/>
           <w:szCs w:val="24"/>
@@ -6219,6 +6616,7 @@
           <w:bCs/>
           <w:i w:val="false"/>
           <w:iCs w:val="false"/>
+          <w:noProof/>
           <w:color w:val="000000"/>
           <w:sz w:val="24"/>
           <w:szCs w:val="24"/>
@@ -6231,6 +6629,7 @@
           <w:rFonts w:ascii="David" w:cs="David" w:eastAsia="David" w:hAnsi="David"/>
           <w:i w:val="false"/>
           <w:iCs w:val="false"/>
+          <w:noProof/>
           <w:sz w:val="24"/>
           <w:szCs w:val="24"/>
         </w:rPr>
@@ -6241,6 +6640,7 @@
           <w:rFonts w:ascii="David" w:cs="David" w:eastAsia="David" w:hAnsi="David"/>
           <w:i/>
           <w:iCs/>
+          <w:noProof/>
           <w:sz w:val="24"/>
           <w:szCs w:val="24"/>
         </w:rPr>
@@ -6251,6 +6651,7 @@
           <w:rFonts w:ascii="David" w:cs="David" w:eastAsia="David" w:hAnsi="David"/>
           <w:i w:val="false"/>
           <w:iCs w:val="false"/>
+          <w:noProof/>
           <w:sz w:val="24"/>
           <w:szCs w:val="24"/>
         </w:rPr>

</xml_diff>